<commit_message>
Addition of Chapter 3:Methodology (3.1 Data Acquisition and Description ,3.2 Data Preprocessing and Exploratory Data Analysis (EDA)  which involves [ Timestamp Conversion,Missing Value Checking and Treatment,Duplicate Entry Control,Data Merging and Feature Transformation,Distribution Analysis of Ratings,Dataset Size and Dimensionality,Identification of Popularity Trends and  Distribution of Ratings Frequency and "Long Tail")
</commit_message>
<xml_diff>
--- a/project write up/(FPR)A STUDY ON CUSTOMER BEHAVIOUR ANALYSIS FOR RETAIL OPTIMIZATION USING K.docx
+++ b/project write up/(FPR)A STUDY ON CUSTOMER BEHAVIOUR ANALYSIS FOR RETAIL OPTIMIZATION USING K.docx
@@ -3962,9 +3962,1607 @@
         </w:rPr>
       </w:pPr>
     </w:p>
+    <w:p>
+      <w:pPr>
+        <w:pStyle w:val="Heading2"/>
+        <w:keepNext w:val="0"/>
+        <w:keepLines w:val="0"/>
+        <w:spacing w:line="360" w:lineRule="auto"/>
+        <w:jc w:val="both"/>
+        <w:rPr>
+          <w:rFonts w:ascii="Times New Roman" w:eastAsia="Times New Roman" w:hAnsi="Times New Roman" w:cs="Times New Roman"/>
+          <w:b/>
+          <w:sz w:val="24"/>
+          <w:szCs w:val="24"/>
+        </w:rPr>
+      </w:pPr>
+    </w:p>
+    <w:p>
+      <w:pPr>
+        <w:spacing w:line="360" w:lineRule="auto"/>
+        <w:jc w:val="both"/>
+        <w:rPr>
+          <w:rFonts w:ascii="Times New Roman" w:hAnsi="Times New Roman" w:cs="Times New Roman"/>
+          <w:b/>
+          <w:bCs/>
+          <w:sz w:val="24"/>
+          <w:szCs w:val="24"/>
+          <w:lang w:val="en-US"/>
+        </w:rPr>
+      </w:pPr>
+      <w:r>
+        <w:rPr>
+          <w:rFonts w:ascii="Times New Roman" w:hAnsi="Times New Roman" w:cs="Times New Roman"/>
+          <w:b/>
+          <w:bCs/>
+          <w:sz w:val="24"/>
+          <w:szCs w:val="24"/>
+          <w:lang w:val="en-US"/>
+        </w:rPr>
+        <w:t>Chapter 3: Methodology</w:t>
+      </w:r>
+    </w:p>
+    <w:p>
+      <w:pPr>
+        <w:spacing w:line="360" w:lineRule="auto"/>
+        <w:jc w:val="both"/>
+        <w:rPr>
+          <w:rFonts w:ascii="Times New Roman" w:hAnsi="Times New Roman" w:cs="Times New Roman"/>
+          <w:sz w:val="24"/>
+          <w:szCs w:val="24"/>
+          <w:lang w:val="en-US"/>
+        </w:rPr>
+      </w:pPr>
+      <w:r>
+        <w:rPr>
+          <w:rFonts w:ascii="Times New Roman" w:hAnsi="Times New Roman" w:cs="Times New Roman"/>
+          <w:sz w:val="24"/>
+          <w:szCs w:val="24"/>
+          <w:lang w:val="en-US"/>
+        </w:rPr>
+        <w:t xml:space="preserve">This chapter describes the robust and systematic methodological framework thoroughly built to address the central question of this study: "Can integrating clustering and association rule mining yield more useful knowledge for recommendation systems than applying them separately?" This sophisticated methodological process begins with data collection and strict preprocessing foundation stages, follows with exploratory data analysis, and culminates in the sophisticated application of two powerful analytical techniques—K-Mode clustering and association rule </w:t>
+      </w:r>
+      <w:r>
+        <w:rPr>
+          <w:rFonts w:ascii="Times New Roman" w:hAnsi="Times New Roman" w:cs="Times New Roman"/>
+          <w:sz w:val="24"/>
+          <w:szCs w:val="24"/>
+          <w:lang w:val="en-US"/>
+        </w:rPr>
+        <w:lastRenderedPageBreak/>
+        <w:t>mining—finally integrated into a combined approach to uncover profound insights for retail optimization and designing deeply personalized recommendation systems.</w:t>
+      </w:r>
+    </w:p>
+    <w:p>
+      <w:pPr>
+        <w:spacing w:line="360" w:lineRule="auto"/>
+        <w:jc w:val="both"/>
+        <w:rPr>
+          <w:rFonts w:ascii="Times New Roman" w:hAnsi="Times New Roman" w:cs="Times New Roman"/>
+          <w:b/>
+          <w:bCs/>
+          <w:sz w:val="24"/>
+          <w:szCs w:val="24"/>
+          <w:lang w:val="en-US"/>
+        </w:rPr>
+      </w:pPr>
+      <w:r>
+        <w:rPr>
+          <w:rFonts w:ascii="Times New Roman" w:hAnsi="Times New Roman" w:cs="Times New Roman"/>
+          <w:b/>
+          <w:bCs/>
+          <w:sz w:val="24"/>
+          <w:szCs w:val="24"/>
+          <w:lang w:val="en-US"/>
+        </w:rPr>
+        <w:t>3.1 Data Acquisition and Description</w:t>
+      </w:r>
+    </w:p>
+    <w:p>
+      <w:pPr>
+        <w:spacing w:line="360" w:lineRule="auto"/>
+        <w:jc w:val="both"/>
+        <w:rPr>
+          <w:rFonts w:ascii="Times New Roman" w:hAnsi="Times New Roman" w:cs="Times New Roman"/>
+          <w:sz w:val="24"/>
+          <w:szCs w:val="24"/>
+        </w:rPr>
+      </w:pPr>
+      <w:r>
+        <w:rPr>
+          <w:rFonts w:ascii="Times New Roman" w:hAnsi="Times New Roman" w:cs="Times New Roman"/>
+          <w:sz w:val="24"/>
+          <w:szCs w:val="24"/>
+        </w:rPr>
+        <w:t xml:space="preserve">The foundation on which the present research was firmly established is the </w:t>
+      </w:r>
+      <w:proofErr w:type="spellStart"/>
+      <w:r>
+        <w:rPr>
+          <w:rFonts w:ascii="Times New Roman" w:hAnsi="Times New Roman" w:cs="Times New Roman"/>
+          <w:sz w:val="24"/>
+          <w:szCs w:val="24"/>
+        </w:rPr>
+        <w:t>MovieLens</w:t>
+      </w:r>
+      <w:proofErr w:type="spellEnd"/>
+      <w:r>
+        <w:rPr>
+          <w:rFonts w:ascii="Times New Roman" w:hAnsi="Times New Roman" w:cs="Times New Roman"/>
+          <w:sz w:val="24"/>
+          <w:szCs w:val="24"/>
+        </w:rPr>
+        <w:t xml:space="preserve"> 25M dataset, which is a seminal and very well-known benchmark in recommender systems and user behavior research (</w:t>
+      </w:r>
+      <w:proofErr w:type="spellStart"/>
+      <w:r>
+        <w:rPr>
+          <w:rFonts w:ascii="Times New Roman" w:hAnsi="Times New Roman" w:cs="Times New Roman"/>
+          <w:sz w:val="24"/>
+          <w:szCs w:val="24"/>
+        </w:rPr>
+        <w:t>Jannach</w:t>
+      </w:r>
+      <w:proofErr w:type="spellEnd"/>
+      <w:r>
+        <w:rPr>
+          <w:rFonts w:ascii="Times New Roman" w:hAnsi="Times New Roman" w:cs="Times New Roman"/>
+          <w:sz w:val="24"/>
+          <w:szCs w:val="24"/>
+        </w:rPr>
+        <w:t xml:space="preserve"> et al., 2016; Lu et al., 2015). The deliberate selection of this dataset was due to its scale record, innate diversity, and profound granularity, which renders it very appropriate for complex analysis of consumers' tastes in the dynamic digital content context. Maintained and nurtured by </w:t>
+      </w:r>
+      <w:proofErr w:type="spellStart"/>
+      <w:r>
+        <w:rPr>
+          <w:rFonts w:ascii="Times New Roman" w:hAnsi="Times New Roman" w:cs="Times New Roman"/>
+          <w:sz w:val="24"/>
+          <w:szCs w:val="24"/>
+        </w:rPr>
+        <w:t>GroupLens</w:t>
+      </w:r>
+      <w:proofErr w:type="spellEnd"/>
+      <w:r>
+        <w:rPr>
+          <w:rFonts w:ascii="Times New Roman" w:hAnsi="Times New Roman" w:cs="Times New Roman"/>
+          <w:sz w:val="24"/>
+          <w:szCs w:val="24"/>
+        </w:rPr>
+        <w:t xml:space="preserve"> in the University of Minnesota, this public data set is comprised of over 25 million explicit ratings, used across a massive repository of movies, paired with critical metadata that enriches the analytical potential. Its old past and widespread academic use also </w:t>
+      </w:r>
+      <w:proofErr w:type="gramStart"/>
+      <w:r>
+        <w:rPr>
+          <w:rFonts w:ascii="Times New Roman" w:hAnsi="Times New Roman" w:cs="Times New Roman"/>
+          <w:sz w:val="24"/>
+          <w:szCs w:val="24"/>
+        </w:rPr>
+        <w:t>facilitates</w:t>
+      </w:r>
+      <w:proofErr w:type="gramEnd"/>
+      <w:r>
+        <w:rPr>
+          <w:rFonts w:ascii="Times New Roman" w:hAnsi="Times New Roman" w:cs="Times New Roman"/>
+          <w:sz w:val="24"/>
+          <w:szCs w:val="24"/>
+        </w:rPr>
+        <w:t xml:space="preserve"> easier reproduction and comparison across the broader scientific community.</w:t>
+      </w:r>
+      <w:r>
+        <w:rPr>
+          <w:rFonts w:ascii="Times New Roman" w:hAnsi="Times New Roman" w:cs="Times New Roman"/>
+          <w:sz w:val="24"/>
+          <w:szCs w:val="24"/>
+        </w:rPr>
+        <w:br/>
+        <w:t xml:space="preserve">The following critical components of the </w:t>
+      </w:r>
+      <w:proofErr w:type="spellStart"/>
+      <w:r>
+        <w:rPr>
+          <w:rFonts w:ascii="Times New Roman" w:hAnsi="Times New Roman" w:cs="Times New Roman"/>
+          <w:sz w:val="24"/>
+          <w:szCs w:val="24"/>
+        </w:rPr>
+        <w:t>MovieLens</w:t>
+      </w:r>
+      <w:proofErr w:type="spellEnd"/>
+      <w:r>
+        <w:rPr>
+          <w:rFonts w:ascii="Times New Roman" w:hAnsi="Times New Roman" w:cs="Times New Roman"/>
+          <w:sz w:val="24"/>
+          <w:szCs w:val="24"/>
+        </w:rPr>
+        <w:t xml:space="preserve"> 25M dataset were the primary drivers for the completion of this project:</w:t>
+      </w:r>
+    </w:p>
+    <w:p>
+      <w:pPr>
+        <w:spacing w:line="360" w:lineRule="auto"/>
+        <w:jc w:val="both"/>
+        <w:rPr>
+          <w:rFonts w:ascii="Times New Roman" w:hAnsi="Times New Roman" w:cs="Times New Roman"/>
+          <w:sz w:val="24"/>
+          <w:szCs w:val="24"/>
+          <w:lang w:val="en-US"/>
+        </w:rPr>
+      </w:pPr>
+      <w:r>
+        <w:rPr>
+          <w:rFonts w:ascii="Times New Roman" w:hAnsi="Times New Roman" w:cs="Times New Roman"/>
+          <w:b/>
+          <w:bCs/>
+          <w:sz w:val="24"/>
+          <w:szCs w:val="24"/>
+          <w:lang w:val="en-US"/>
+        </w:rPr>
+        <w:t>ratings.csv</w:t>
+      </w:r>
+      <w:r>
+        <w:rPr>
+          <w:rFonts w:ascii="Times New Roman" w:hAnsi="Times New Roman" w:cs="Times New Roman"/>
+          <w:sz w:val="24"/>
+          <w:szCs w:val="24"/>
+          <w:lang w:val="en-US"/>
+        </w:rPr>
+        <w:t xml:space="preserve">: This fundamental file is the source text from which the user interaction information is derived. Each row precisely captures the overt sentiment of one user towards one film, a unique </w:t>
+      </w:r>
+      <w:proofErr w:type="spellStart"/>
+      <w:r>
+        <w:rPr>
+          <w:rFonts w:ascii="Times New Roman" w:hAnsi="Times New Roman" w:cs="Times New Roman"/>
+          <w:sz w:val="24"/>
+          <w:szCs w:val="24"/>
+          <w:lang w:val="en-US"/>
+        </w:rPr>
+        <w:t>userId</w:t>
+      </w:r>
+      <w:proofErr w:type="spellEnd"/>
+      <w:r>
+        <w:rPr>
+          <w:rFonts w:ascii="Times New Roman" w:hAnsi="Times New Roman" w:cs="Times New Roman"/>
+          <w:sz w:val="24"/>
+          <w:szCs w:val="24"/>
+          <w:lang w:val="en-US"/>
+        </w:rPr>
+        <w:t xml:space="preserve">, a </w:t>
+      </w:r>
+      <w:proofErr w:type="spellStart"/>
+      <w:r>
+        <w:rPr>
+          <w:rFonts w:ascii="Times New Roman" w:hAnsi="Times New Roman" w:cs="Times New Roman"/>
+          <w:sz w:val="24"/>
+          <w:szCs w:val="24"/>
+          <w:lang w:val="en-US"/>
+        </w:rPr>
+        <w:t>movieId</w:t>
+      </w:r>
+      <w:proofErr w:type="spellEnd"/>
+      <w:r>
+        <w:rPr>
+          <w:rFonts w:ascii="Times New Roman" w:hAnsi="Times New Roman" w:cs="Times New Roman"/>
+          <w:sz w:val="24"/>
+          <w:szCs w:val="24"/>
+          <w:lang w:val="en-US"/>
+        </w:rPr>
+        <w:t>, a numerical rating (0.5 to 5.0 stars), and a timestamp of the actual time left for the rating. This vast collection of overt likes and dislikes provides the raw behavioral signals used to model personal tastes and mass consumption patterns, both of which are essential to guide recommendation models.</w:t>
+      </w:r>
+    </w:p>
+    <w:p>
+      <w:pPr>
+        <w:spacing w:line="360" w:lineRule="auto"/>
+        <w:jc w:val="both"/>
+        <w:rPr>
+          <w:rFonts w:ascii="Times New Roman" w:hAnsi="Times New Roman" w:cs="Times New Roman"/>
+          <w:sz w:val="24"/>
+          <w:szCs w:val="24"/>
+          <w:lang w:val="en-US"/>
+        </w:rPr>
+      </w:pPr>
+      <w:r>
+        <w:rPr>
+          <w:rFonts w:ascii="Times New Roman" w:hAnsi="Times New Roman" w:cs="Times New Roman"/>
+          <w:b/>
+          <w:bCs/>
+          <w:sz w:val="24"/>
+          <w:szCs w:val="24"/>
+          <w:lang w:val="en-US"/>
+        </w:rPr>
+        <w:t>movies.csv</w:t>
+      </w:r>
+      <w:r>
+        <w:rPr>
+          <w:rFonts w:ascii="Times New Roman" w:hAnsi="Times New Roman" w:cs="Times New Roman"/>
+          <w:sz w:val="24"/>
+          <w:szCs w:val="24"/>
+          <w:lang w:val="en-US"/>
+        </w:rPr>
+        <w:t xml:space="preserve">: This ancillary dataset includes principal descriptive attributes for all the movies. Key columns are the </w:t>
+      </w:r>
+      <w:proofErr w:type="spellStart"/>
+      <w:r>
+        <w:rPr>
+          <w:rFonts w:ascii="Times New Roman" w:hAnsi="Times New Roman" w:cs="Times New Roman"/>
+          <w:sz w:val="24"/>
+          <w:szCs w:val="24"/>
+          <w:lang w:val="en-US"/>
+        </w:rPr>
+        <w:t>movieId</w:t>
+      </w:r>
+      <w:proofErr w:type="spellEnd"/>
+      <w:r>
+        <w:rPr>
+          <w:rFonts w:ascii="Times New Roman" w:hAnsi="Times New Roman" w:cs="Times New Roman"/>
+          <w:sz w:val="24"/>
+          <w:szCs w:val="24"/>
+          <w:lang w:val="en-US"/>
+        </w:rPr>
+        <w:t xml:space="preserve"> (serving as the gateway to the ratings data), the title (typically followed by its release year to disambiguate), and notably, the genres. The genre feature is a multi-label categorical attribute, i.e., a single movie belongs to more than one category (e.g., "</w:t>
+      </w:r>
+      <w:proofErr w:type="spellStart"/>
+      <w:r>
+        <w:rPr>
+          <w:rFonts w:ascii="Times New Roman" w:hAnsi="Times New Roman" w:cs="Times New Roman"/>
+          <w:sz w:val="24"/>
+          <w:szCs w:val="24"/>
+          <w:lang w:val="en-US"/>
+        </w:rPr>
+        <w:t>Action|Adventure|Sci-Fi</w:t>
+      </w:r>
+      <w:proofErr w:type="spellEnd"/>
+      <w:r>
+        <w:rPr>
+          <w:rFonts w:ascii="Times New Roman" w:hAnsi="Times New Roman" w:cs="Times New Roman"/>
+          <w:sz w:val="24"/>
+          <w:szCs w:val="24"/>
+          <w:lang w:val="en-US"/>
+        </w:rPr>
+        <w:t>"). Such native multi-label character renders it a very rich dataset for studying movie attributes and is the primary input to the K-Mode clustering and the subsequent association rule mining based on shared genre membership.</w:t>
+      </w:r>
+    </w:p>
+    <w:p>
+      <w:pPr>
+        <w:spacing w:line="360" w:lineRule="auto"/>
+        <w:jc w:val="both"/>
+        <w:rPr>
+          <w:rFonts w:ascii="Times New Roman" w:hAnsi="Times New Roman" w:cs="Times New Roman"/>
+          <w:sz w:val="24"/>
+          <w:szCs w:val="24"/>
+          <w:lang w:val="en-US"/>
+        </w:rPr>
+      </w:pPr>
+      <w:r>
+        <w:rPr>
+          <w:rFonts w:ascii="Times New Roman" w:hAnsi="Times New Roman" w:cs="Times New Roman"/>
+          <w:b/>
+          <w:bCs/>
+          <w:sz w:val="24"/>
+          <w:szCs w:val="24"/>
+          <w:lang w:val="en-US"/>
+        </w:rPr>
+        <w:t>tags.csv</w:t>
+      </w:r>
+      <w:r>
+        <w:rPr>
+          <w:rFonts w:ascii="Times New Roman" w:hAnsi="Times New Roman" w:cs="Times New Roman"/>
+          <w:sz w:val="24"/>
+          <w:szCs w:val="24"/>
+          <w:lang w:val="en-US"/>
+        </w:rPr>
+        <w:t xml:space="preserve">: This comprises user-generated textual tags for movies, along with the corresponding </w:t>
+      </w:r>
+      <w:proofErr w:type="spellStart"/>
+      <w:r>
+        <w:rPr>
+          <w:rFonts w:ascii="Times New Roman" w:hAnsi="Times New Roman" w:cs="Times New Roman"/>
+          <w:sz w:val="24"/>
+          <w:szCs w:val="24"/>
+          <w:lang w:val="en-US"/>
+        </w:rPr>
+        <w:t>userId</w:t>
+      </w:r>
+      <w:proofErr w:type="spellEnd"/>
+      <w:r>
+        <w:rPr>
+          <w:rFonts w:ascii="Times New Roman" w:hAnsi="Times New Roman" w:cs="Times New Roman"/>
+          <w:sz w:val="24"/>
+          <w:szCs w:val="24"/>
+          <w:lang w:val="en-US"/>
+        </w:rPr>
+        <w:t xml:space="preserve">, </w:t>
+      </w:r>
+      <w:proofErr w:type="spellStart"/>
+      <w:r>
+        <w:rPr>
+          <w:rFonts w:ascii="Times New Roman" w:hAnsi="Times New Roman" w:cs="Times New Roman"/>
+          <w:sz w:val="24"/>
+          <w:szCs w:val="24"/>
+          <w:lang w:val="en-US"/>
+        </w:rPr>
+        <w:t>movieId</w:t>
+      </w:r>
+      <w:proofErr w:type="spellEnd"/>
+      <w:r>
+        <w:rPr>
+          <w:rFonts w:ascii="Times New Roman" w:hAnsi="Times New Roman" w:cs="Times New Roman"/>
+          <w:sz w:val="24"/>
+          <w:szCs w:val="24"/>
+          <w:lang w:val="en-US"/>
+        </w:rPr>
+        <w:t xml:space="preserve">, and timestamp. Although not directly incorporated into the K-Mode or </w:t>
+      </w:r>
+      <w:proofErr w:type="spellStart"/>
+      <w:r>
+        <w:rPr>
+          <w:rFonts w:ascii="Times New Roman" w:hAnsi="Times New Roman" w:cs="Times New Roman"/>
+          <w:sz w:val="24"/>
+          <w:szCs w:val="24"/>
+          <w:lang w:val="en-US"/>
+        </w:rPr>
+        <w:t>Apriori</w:t>
+      </w:r>
+      <w:proofErr w:type="spellEnd"/>
+      <w:r>
+        <w:rPr>
+          <w:rFonts w:ascii="Times New Roman" w:hAnsi="Times New Roman" w:cs="Times New Roman"/>
+          <w:sz w:val="24"/>
+          <w:szCs w:val="24"/>
+          <w:lang w:val="en-US"/>
+        </w:rPr>
+        <w:t xml:space="preserve"> algorithms in this specific study (due to the limited focus on genres for clustering and rule extraction), the presence of the same in the dataset underlines the potential for future applications </w:t>
+      </w:r>
+      <w:r>
+        <w:rPr>
+          <w:rFonts w:ascii="Times New Roman" w:hAnsi="Times New Roman" w:cs="Times New Roman"/>
+          <w:sz w:val="24"/>
+          <w:szCs w:val="24"/>
+          <w:lang w:val="en-US"/>
+        </w:rPr>
+        <w:lastRenderedPageBreak/>
+        <w:t>involving natural language processing (NLP) to learn further semantic meaning about users' interests or film characteristics.</w:t>
+      </w:r>
+    </w:p>
+    <w:p>
+      <w:pPr>
+        <w:spacing w:line="360" w:lineRule="auto"/>
+        <w:jc w:val="both"/>
+        <w:rPr>
+          <w:rFonts w:ascii="Times New Roman" w:hAnsi="Times New Roman" w:cs="Times New Roman"/>
+          <w:sz w:val="24"/>
+          <w:szCs w:val="24"/>
+          <w:lang w:val="en-US"/>
+        </w:rPr>
+      </w:pPr>
+    </w:p>
+    <w:p>
+      <w:pPr>
+        <w:spacing w:line="360" w:lineRule="auto"/>
+        <w:jc w:val="both"/>
+        <w:rPr>
+          <w:rFonts w:ascii="Times New Roman" w:hAnsi="Times New Roman" w:cs="Times New Roman"/>
+          <w:sz w:val="24"/>
+          <w:szCs w:val="24"/>
+          <w:lang w:val="en-US"/>
+        </w:rPr>
+      </w:pPr>
+      <w:r>
+        <w:rPr>
+          <w:rFonts w:ascii="Times New Roman" w:hAnsi="Times New Roman" w:cs="Times New Roman"/>
+          <w:b/>
+          <w:bCs/>
+          <w:sz w:val="24"/>
+          <w:szCs w:val="24"/>
+          <w:lang w:val="en-US"/>
+        </w:rPr>
+        <w:t>links.csv</w:t>
+      </w:r>
+      <w:r>
+        <w:rPr>
+          <w:rFonts w:ascii="Times New Roman" w:hAnsi="Times New Roman" w:cs="Times New Roman"/>
+          <w:sz w:val="24"/>
+          <w:szCs w:val="24"/>
+          <w:lang w:val="en-US"/>
+        </w:rPr>
+        <w:t xml:space="preserve">: This information is a bridge, establishing connections between </w:t>
+      </w:r>
+      <w:proofErr w:type="spellStart"/>
+      <w:r>
+        <w:rPr>
+          <w:rFonts w:ascii="Times New Roman" w:hAnsi="Times New Roman" w:cs="Times New Roman"/>
+          <w:sz w:val="24"/>
+          <w:szCs w:val="24"/>
+          <w:lang w:val="en-US"/>
+        </w:rPr>
+        <w:t>MovieLens</w:t>
+      </w:r>
+      <w:proofErr w:type="spellEnd"/>
+      <w:r>
+        <w:rPr>
+          <w:rFonts w:ascii="Times New Roman" w:hAnsi="Times New Roman" w:cs="Times New Roman"/>
+          <w:sz w:val="24"/>
+          <w:szCs w:val="24"/>
+          <w:lang w:val="en-US"/>
+        </w:rPr>
+        <w:t xml:space="preserve"> movie IDs and external database IDs, i.e., </w:t>
+      </w:r>
+      <w:proofErr w:type="spellStart"/>
+      <w:r>
+        <w:rPr>
+          <w:rFonts w:ascii="Times New Roman" w:hAnsi="Times New Roman" w:cs="Times New Roman"/>
+          <w:sz w:val="24"/>
+          <w:szCs w:val="24"/>
+          <w:lang w:val="en-US"/>
+        </w:rPr>
+        <w:t>imdbId</w:t>
+      </w:r>
+      <w:proofErr w:type="spellEnd"/>
+      <w:r>
+        <w:rPr>
+          <w:rFonts w:ascii="Times New Roman" w:hAnsi="Times New Roman" w:cs="Times New Roman"/>
+          <w:sz w:val="24"/>
+          <w:szCs w:val="24"/>
+          <w:lang w:val="en-US"/>
+        </w:rPr>
+        <w:t xml:space="preserve"> (Internet Movie Database) and </w:t>
+      </w:r>
+      <w:proofErr w:type="spellStart"/>
+      <w:r>
+        <w:rPr>
+          <w:rFonts w:ascii="Times New Roman" w:hAnsi="Times New Roman" w:cs="Times New Roman"/>
+          <w:sz w:val="24"/>
+          <w:szCs w:val="24"/>
+          <w:lang w:val="en-US"/>
+        </w:rPr>
+        <w:t>tmdbId</w:t>
+      </w:r>
+      <w:proofErr w:type="spellEnd"/>
+      <w:r>
+        <w:rPr>
+          <w:rFonts w:ascii="Times New Roman" w:hAnsi="Times New Roman" w:cs="Times New Roman"/>
+          <w:sz w:val="24"/>
+          <w:szCs w:val="24"/>
+          <w:lang w:val="en-US"/>
+        </w:rPr>
+        <w:t xml:space="preserve"> (The Movie Database). Not used directly for the main analytical processes of this project, the fact that it exists in the data acquisition pipeline is an indicator of the provision of thought for potential means by which the dataset could be augmented with external film information or cross-checked against larger filmography datasets.</w:t>
+      </w:r>
+    </w:p>
+    <w:p>
+      <w:pPr>
+        <w:spacing w:line="360" w:lineRule="auto"/>
+        <w:jc w:val="both"/>
+        <w:rPr>
+          <w:rFonts w:ascii="Times New Roman" w:hAnsi="Times New Roman" w:cs="Times New Roman"/>
+          <w:sz w:val="24"/>
+          <w:szCs w:val="24"/>
+          <w:lang w:val="en-US"/>
+        </w:rPr>
+      </w:pPr>
+    </w:p>
+    <w:p>
+      <w:pPr>
+        <w:spacing w:line="360" w:lineRule="auto"/>
+        <w:jc w:val="both"/>
+        <w:rPr>
+          <w:rFonts w:ascii="Times New Roman" w:hAnsi="Times New Roman" w:cs="Times New Roman"/>
+          <w:sz w:val="24"/>
+          <w:szCs w:val="24"/>
+          <w:lang w:val="en-US"/>
+        </w:rPr>
+      </w:pPr>
+      <w:r>
+        <w:rPr>
+          <w:rFonts w:ascii="Times New Roman" w:hAnsi="Times New Roman" w:cs="Times New Roman"/>
+          <w:sz w:val="24"/>
+          <w:szCs w:val="24"/>
+          <w:lang w:val="en-US"/>
+        </w:rPr>
+        <w:t xml:space="preserve">The significance of the </w:t>
+      </w:r>
+      <w:proofErr w:type="spellStart"/>
+      <w:r>
+        <w:rPr>
+          <w:rFonts w:ascii="Times New Roman" w:hAnsi="Times New Roman" w:cs="Times New Roman"/>
+          <w:sz w:val="24"/>
+          <w:szCs w:val="24"/>
+          <w:lang w:val="en-US"/>
+        </w:rPr>
+        <w:t>MovieLens</w:t>
+      </w:r>
+      <w:proofErr w:type="spellEnd"/>
+      <w:r>
+        <w:rPr>
+          <w:rFonts w:ascii="Times New Roman" w:hAnsi="Times New Roman" w:cs="Times New Roman"/>
+          <w:sz w:val="24"/>
+          <w:szCs w:val="24"/>
+          <w:lang w:val="en-US"/>
+        </w:rPr>
+        <w:t xml:space="preserve"> dataset transcends just its size; it mirrors the evolved dynamics that characterize </w:t>
+      </w:r>
+      <w:proofErr w:type="gramStart"/>
+      <w:r>
+        <w:rPr>
+          <w:rFonts w:ascii="Times New Roman" w:hAnsi="Times New Roman" w:cs="Times New Roman"/>
+          <w:sz w:val="24"/>
+          <w:szCs w:val="24"/>
+          <w:lang w:val="en-US"/>
+        </w:rPr>
+        <w:t>the contemporary</w:t>
+      </w:r>
+      <w:proofErr w:type="gramEnd"/>
+      <w:r>
+        <w:rPr>
+          <w:rFonts w:ascii="Times New Roman" w:hAnsi="Times New Roman" w:cs="Times New Roman"/>
+          <w:sz w:val="24"/>
+          <w:szCs w:val="24"/>
+          <w:lang w:val="en-US"/>
+        </w:rPr>
+        <w:t xml:space="preserve"> digital consumer and entertainment landscapes. In these landscapes, platforms become increasingly reliant on the strategic procurement and sophisticated examination of vast data streams in a bid to successfully traverse the rich landscape of diverse user interests as well as constantly evolving content consumption models. This judicious selection of a robust and representative dataset was the working assumption upon which the project aimed to create a data-driven framework for actualizing and optimizing retail experiences via predictive analytics.</w:t>
+      </w:r>
+    </w:p>
+    <w:p>
+      <w:pPr>
+        <w:spacing w:line="360" w:lineRule="auto"/>
+        <w:jc w:val="both"/>
+        <w:rPr>
+          <w:rFonts w:ascii="Times New Roman" w:hAnsi="Times New Roman" w:cs="Times New Roman"/>
+          <w:sz w:val="24"/>
+          <w:szCs w:val="24"/>
+          <w:lang w:val="en-US"/>
+        </w:rPr>
+      </w:pPr>
+    </w:p>
+    <w:p>
+      <w:pPr>
+        <w:spacing w:line="360" w:lineRule="auto"/>
+        <w:jc w:val="both"/>
+        <w:rPr>
+          <w:rFonts w:ascii="Times New Roman" w:hAnsi="Times New Roman" w:cs="Times New Roman"/>
+          <w:b/>
+          <w:bCs/>
+          <w:sz w:val="24"/>
+          <w:szCs w:val="24"/>
+          <w:lang w:val="en-US"/>
+        </w:rPr>
+      </w:pPr>
+      <w:r>
+        <w:rPr>
+          <w:rFonts w:ascii="Times New Roman" w:hAnsi="Times New Roman" w:cs="Times New Roman"/>
+          <w:b/>
+          <w:bCs/>
+          <w:sz w:val="24"/>
+          <w:szCs w:val="24"/>
+          <w:lang w:val="en-US"/>
+        </w:rPr>
+        <w:t>3.2 Data Preprocessing and Exploratory Data Analysis (EDA)</w:t>
+      </w:r>
+    </w:p>
+    <w:p>
+      <w:pPr>
+        <w:spacing w:line="360" w:lineRule="auto"/>
+        <w:jc w:val="both"/>
+        <w:rPr>
+          <w:rFonts w:ascii="Times New Roman" w:hAnsi="Times New Roman" w:cs="Times New Roman"/>
+          <w:sz w:val="24"/>
+          <w:szCs w:val="24"/>
+          <w:lang w:val="en-US"/>
+        </w:rPr>
+      </w:pPr>
+      <w:r>
+        <w:rPr>
+          <w:rFonts w:ascii="Times New Roman" w:hAnsi="Times New Roman" w:cs="Times New Roman"/>
+          <w:sz w:val="24"/>
+          <w:szCs w:val="24"/>
+          <w:lang w:val="en-US"/>
+        </w:rPr>
+        <w:t xml:space="preserve">The effectiveness and validity of any data-driven analytical effort are inherently dependent on the quality and proper preparation of the original data. Therefore, a strict and ordered data preprocessing workflow was an absolute necessity, carefully constructed to remove dirt and inconsistencies from the original </w:t>
+      </w:r>
+      <w:proofErr w:type="spellStart"/>
+      <w:r>
+        <w:rPr>
+          <w:rFonts w:ascii="Times New Roman" w:hAnsi="Times New Roman" w:cs="Times New Roman"/>
+          <w:sz w:val="24"/>
+          <w:szCs w:val="24"/>
+          <w:lang w:val="en-US"/>
+        </w:rPr>
+        <w:t>MovieLens</w:t>
+      </w:r>
+      <w:proofErr w:type="spellEnd"/>
+      <w:r>
+        <w:rPr>
+          <w:rFonts w:ascii="Times New Roman" w:hAnsi="Times New Roman" w:cs="Times New Roman"/>
+          <w:sz w:val="24"/>
+          <w:szCs w:val="24"/>
+          <w:lang w:val="en-US"/>
+        </w:rPr>
+        <w:t xml:space="preserve"> data, thereby transforming and standardizing it to its utmost suitability for the subsequent stages of analytical modeling. This data integrity is important, as faulty input data inevitably leads to inconclusive or deceptive results, irrespective of the level of quality in the used analytical models.</w:t>
+      </w:r>
+    </w:p>
+    <w:p>
+      <w:pPr>
+        <w:spacing w:line="360" w:lineRule="auto"/>
+        <w:jc w:val="both"/>
+        <w:rPr>
+          <w:rFonts w:ascii="Times New Roman" w:hAnsi="Times New Roman" w:cs="Times New Roman"/>
+          <w:sz w:val="24"/>
+          <w:szCs w:val="24"/>
+          <w:lang w:val="en-US"/>
+        </w:rPr>
+      </w:pPr>
+      <w:r>
+        <w:rPr>
+          <w:rFonts w:ascii="Times New Roman" w:hAnsi="Times New Roman" w:cs="Times New Roman"/>
+          <w:sz w:val="24"/>
+          <w:szCs w:val="24"/>
+          <w:lang w:val="en-US"/>
+        </w:rPr>
+        <w:t>The correctly executed preprocessing steps were:</w:t>
+      </w:r>
+    </w:p>
+    <w:p>
+      <w:pPr>
+        <w:spacing w:line="360" w:lineRule="auto"/>
+        <w:jc w:val="both"/>
+        <w:rPr>
+          <w:rFonts w:ascii="Times New Roman" w:hAnsi="Times New Roman" w:cs="Times New Roman"/>
+          <w:sz w:val="24"/>
+          <w:szCs w:val="24"/>
+          <w:lang w:val="en-US"/>
+        </w:rPr>
+      </w:pPr>
+    </w:p>
+    <w:p>
+      <w:pPr>
+        <w:spacing w:line="360" w:lineRule="auto"/>
+        <w:jc w:val="both"/>
+        <w:rPr>
+          <w:rFonts w:ascii="Times New Roman" w:hAnsi="Times New Roman" w:cs="Times New Roman"/>
+          <w:sz w:val="24"/>
+          <w:szCs w:val="24"/>
+          <w:lang w:val="en-US"/>
+        </w:rPr>
+      </w:pPr>
+      <w:r>
+        <w:rPr>
+          <w:rFonts w:ascii="Times New Roman" w:hAnsi="Times New Roman" w:cs="Times New Roman"/>
+          <w:sz w:val="24"/>
+          <w:szCs w:val="24"/>
+          <w:lang w:val="en-US"/>
+        </w:rPr>
+        <w:t xml:space="preserve">• </w:t>
+      </w:r>
+      <w:r>
+        <w:rPr>
+          <w:rFonts w:ascii="Times New Roman" w:hAnsi="Times New Roman" w:cs="Times New Roman"/>
+          <w:b/>
+          <w:bCs/>
+          <w:sz w:val="24"/>
+          <w:szCs w:val="24"/>
+          <w:lang w:val="en-US"/>
+        </w:rPr>
+        <w:t>Timestamp Conversion:</w:t>
+      </w:r>
+      <w:r>
+        <w:rPr>
+          <w:rFonts w:ascii="Times New Roman" w:hAnsi="Times New Roman" w:cs="Times New Roman"/>
+          <w:sz w:val="24"/>
+          <w:szCs w:val="24"/>
+          <w:lang w:val="en-US"/>
+        </w:rPr>
+        <w:t xml:space="preserve"> The timestamp columns, found in both ratings.csv and tags.csv data sets, were originally stored in Unix epoch format, which is a numerical format not human-readable </w:t>
+      </w:r>
+      <w:r>
+        <w:rPr>
+          <w:rFonts w:ascii="Times New Roman" w:hAnsi="Times New Roman" w:cs="Times New Roman"/>
+          <w:sz w:val="24"/>
+          <w:szCs w:val="24"/>
+          <w:lang w:val="en-US"/>
+        </w:rPr>
+        <w:lastRenderedPageBreak/>
+        <w:t xml:space="preserve">by default. To enable improvement in interpretability and accommodation for any potential temporal analysis (for example, identifying trends in particular time periods, albeit not the primary analytic objective of this project), these numerical timestamps were automatically converted into a normalized, human-interpretable datetime object representation. This transformation helps not only </w:t>
+      </w:r>
+      <w:proofErr w:type="gramStart"/>
+      <w:r>
+        <w:rPr>
+          <w:rFonts w:ascii="Times New Roman" w:hAnsi="Times New Roman" w:cs="Times New Roman"/>
+          <w:sz w:val="24"/>
+          <w:szCs w:val="24"/>
+          <w:lang w:val="en-US"/>
+        </w:rPr>
+        <w:t>exploratory</w:t>
+      </w:r>
+      <w:proofErr w:type="gramEnd"/>
+      <w:r>
+        <w:rPr>
+          <w:rFonts w:ascii="Times New Roman" w:hAnsi="Times New Roman" w:cs="Times New Roman"/>
+          <w:sz w:val="24"/>
+          <w:szCs w:val="24"/>
+          <w:lang w:val="en-US"/>
+        </w:rPr>
+        <w:t xml:space="preserve"> visualizations but also simplifies any eventual time-series feature engineering or data filtering based on specific dates or ranges.</w:t>
+      </w:r>
+    </w:p>
+    <w:p>
+      <w:pPr>
+        <w:spacing w:line="360" w:lineRule="auto"/>
+        <w:jc w:val="both"/>
+        <w:rPr>
+          <w:rFonts w:ascii="Times New Roman" w:hAnsi="Times New Roman" w:cs="Times New Roman"/>
+          <w:sz w:val="24"/>
+          <w:szCs w:val="24"/>
+          <w:lang w:val="en-US"/>
+        </w:rPr>
+      </w:pPr>
+    </w:p>
+    <w:p>
+      <w:pPr>
+        <w:spacing w:line="360" w:lineRule="auto"/>
+        <w:jc w:val="both"/>
+        <w:rPr>
+          <w:rFonts w:ascii="Times New Roman" w:hAnsi="Times New Roman" w:cs="Times New Roman"/>
+          <w:sz w:val="24"/>
+          <w:szCs w:val="24"/>
+          <w:lang w:val="en-US"/>
+        </w:rPr>
+      </w:pPr>
+      <w:r>
+        <w:rPr>
+          <w:rFonts w:ascii="Times New Roman" w:hAnsi="Times New Roman" w:cs="Times New Roman"/>
+          <w:sz w:val="24"/>
+          <w:szCs w:val="24"/>
+          <w:lang w:val="en-US"/>
+        </w:rPr>
+        <w:t xml:space="preserve">• </w:t>
+      </w:r>
+      <w:r>
+        <w:rPr>
+          <w:rFonts w:ascii="Times New Roman" w:hAnsi="Times New Roman" w:cs="Times New Roman"/>
+          <w:b/>
+          <w:bCs/>
+          <w:sz w:val="24"/>
+          <w:szCs w:val="24"/>
+          <w:lang w:val="en-US"/>
+        </w:rPr>
+        <w:t>Missing Value Checking and Treatment:</w:t>
+      </w:r>
+      <w:r>
+        <w:rPr>
+          <w:rFonts w:ascii="Times New Roman" w:hAnsi="Times New Roman" w:cs="Times New Roman"/>
+          <w:sz w:val="24"/>
+          <w:szCs w:val="24"/>
+          <w:lang w:val="en-US"/>
+        </w:rPr>
+        <w:t xml:space="preserve"> A rigorous and complete check for missing values was performed stringently for all loaded </w:t>
+      </w:r>
+      <w:proofErr w:type="spellStart"/>
+      <w:r>
+        <w:rPr>
+          <w:rFonts w:ascii="Times New Roman" w:hAnsi="Times New Roman" w:cs="Times New Roman"/>
+          <w:sz w:val="24"/>
+          <w:szCs w:val="24"/>
+          <w:lang w:val="en-US"/>
+        </w:rPr>
+        <w:t>dataframes</w:t>
+      </w:r>
+      <w:proofErr w:type="spellEnd"/>
+      <w:r>
+        <w:rPr>
+          <w:rFonts w:ascii="Times New Roman" w:hAnsi="Times New Roman" w:cs="Times New Roman"/>
+          <w:sz w:val="24"/>
+          <w:szCs w:val="24"/>
+          <w:lang w:val="en-US"/>
+        </w:rPr>
+        <w:t xml:space="preserve"> (ratings, movies, tags, links). The diagnostic process revealed a predominantly clean dataset, with the sole exception of a small number of 8 missing records in the </w:t>
+      </w:r>
+      <w:proofErr w:type="spellStart"/>
+      <w:r>
+        <w:rPr>
+          <w:rFonts w:ascii="Times New Roman" w:hAnsi="Times New Roman" w:cs="Times New Roman"/>
+          <w:sz w:val="24"/>
+          <w:szCs w:val="24"/>
+          <w:lang w:val="en-US"/>
+        </w:rPr>
+        <w:t>tmdbId</w:t>
+      </w:r>
+      <w:proofErr w:type="spellEnd"/>
+      <w:r>
+        <w:rPr>
+          <w:rFonts w:ascii="Times New Roman" w:hAnsi="Times New Roman" w:cs="Times New Roman"/>
+          <w:sz w:val="24"/>
+          <w:szCs w:val="24"/>
+          <w:lang w:val="en-US"/>
+        </w:rPr>
+        <w:t xml:space="preserve"> column of the links.csv </w:t>
+      </w:r>
+      <w:proofErr w:type="spellStart"/>
+      <w:r>
+        <w:rPr>
+          <w:rFonts w:ascii="Times New Roman" w:hAnsi="Times New Roman" w:cs="Times New Roman"/>
+          <w:sz w:val="24"/>
+          <w:szCs w:val="24"/>
+          <w:lang w:val="en-US"/>
+        </w:rPr>
+        <w:t>dataframe</w:t>
+      </w:r>
+      <w:proofErr w:type="spellEnd"/>
+      <w:r>
+        <w:rPr>
+          <w:rFonts w:ascii="Times New Roman" w:hAnsi="Times New Roman" w:cs="Times New Roman"/>
+          <w:sz w:val="24"/>
+          <w:szCs w:val="24"/>
+          <w:lang w:val="en-US"/>
+        </w:rPr>
+        <w:t>. Notably, all the additional main columns—</w:t>
+      </w:r>
+      <w:proofErr w:type="spellStart"/>
+      <w:r>
+        <w:rPr>
+          <w:rFonts w:ascii="Times New Roman" w:hAnsi="Times New Roman" w:cs="Times New Roman"/>
+          <w:sz w:val="24"/>
+          <w:szCs w:val="24"/>
+          <w:lang w:val="en-US"/>
+        </w:rPr>
+        <w:t>userId</w:t>
+      </w:r>
+      <w:proofErr w:type="spellEnd"/>
+      <w:r>
+        <w:rPr>
+          <w:rFonts w:ascii="Times New Roman" w:hAnsi="Times New Roman" w:cs="Times New Roman"/>
+          <w:sz w:val="24"/>
+          <w:szCs w:val="24"/>
+          <w:lang w:val="en-US"/>
+        </w:rPr>
+        <w:t xml:space="preserve">, </w:t>
+      </w:r>
+      <w:proofErr w:type="spellStart"/>
+      <w:r>
+        <w:rPr>
+          <w:rFonts w:ascii="Times New Roman" w:hAnsi="Times New Roman" w:cs="Times New Roman"/>
+          <w:sz w:val="24"/>
+          <w:szCs w:val="24"/>
+          <w:lang w:val="en-US"/>
+        </w:rPr>
+        <w:t>movieId</w:t>
+      </w:r>
+      <w:proofErr w:type="spellEnd"/>
+      <w:r>
+        <w:rPr>
+          <w:rFonts w:ascii="Times New Roman" w:hAnsi="Times New Roman" w:cs="Times New Roman"/>
+          <w:sz w:val="24"/>
+          <w:szCs w:val="24"/>
+          <w:lang w:val="en-US"/>
+        </w:rPr>
+        <w:t xml:space="preserve">, rating, title, and genres—that were strictly required for the execution of the basic K-Mode and </w:t>
+      </w:r>
+      <w:proofErr w:type="spellStart"/>
+      <w:r>
+        <w:rPr>
+          <w:rFonts w:ascii="Times New Roman" w:hAnsi="Times New Roman" w:cs="Times New Roman"/>
+          <w:sz w:val="24"/>
+          <w:szCs w:val="24"/>
+          <w:lang w:val="en-US"/>
+        </w:rPr>
+        <w:t>Apriori</w:t>
+      </w:r>
+      <w:proofErr w:type="spellEnd"/>
+      <w:r>
+        <w:rPr>
+          <w:rFonts w:ascii="Times New Roman" w:hAnsi="Times New Roman" w:cs="Times New Roman"/>
+          <w:sz w:val="24"/>
+          <w:szCs w:val="24"/>
+          <w:lang w:val="en-US"/>
+        </w:rPr>
+        <w:t xml:space="preserve"> algorithms, were confirmed to be entirely complete and clear of any missing values. As the </w:t>
+      </w:r>
+      <w:proofErr w:type="spellStart"/>
+      <w:r>
+        <w:rPr>
+          <w:rFonts w:ascii="Times New Roman" w:hAnsi="Times New Roman" w:cs="Times New Roman"/>
+          <w:sz w:val="24"/>
+          <w:szCs w:val="24"/>
+          <w:lang w:val="en-US"/>
+        </w:rPr>
+        <w:t>tmdbId</w:t>
+      </w:r>
+      <w:proofErr w:type="spellEnd"/>
+      <w:r>
+        <w:rPr>
+          <w:rFonts w:ascii="Times New Roman" w:hAnsi="Times New Roman" w:cs="Times New Roman"/>
+          <w:sz w:val="24"/>
+          <w:szCs w:val="24"/>
+          <w:lang w:val="en-US"/>
+        </w:rPr>
+        <w:t xml:space="preserve"> column was not directly included in the basic analytical models for clustering or rule mining, these single missing values were rightfully deemed non-vital and therefore were not imputed. This option preserved the native character of the native dataset and circumvented the introduction of potential biases most likely to originate from non-discriminative imputation techniques.</w:t>
+      </w:r>
+    </w:p>
+    <w:p>
+      <w:pPr>
+        <w:spacing w:line="360" w:lineRule="auto"/>
+        <w:jc w:val="both"/>
+        <w:rPr>
+          <w:rFonts w:ascii="Times New Roman" w:hAnsi="Times New Roman" w:cs="Times New Roman"/>
+          <w:sz w:val="24"/>
+          <w:szCs w:val="24"/>
+          <w:lang w:val="en-US"/>
+        </w:rPr>
+      </w:pPr>
+    </w:p>
+    <w:p>
+      <w:pPr>
+        <w:spacing w:line="360" w:lineRule="auto"/>
+        <w:jc w:val="both"/>
+        <w:rPr>
+          <w:rFonts w:ascii="Times New Roman" w:hAnsi="Times New Roman" w:cs="Times New Roman"/>
+          <w:sz w:val="24"/>
+          <w:szCs w:val="24"/>
+          <w:lang w:val="en-US"/>
+        </w:rPr>
+      </w:pPr>
+      <w:r>
+        <w:rPr>
+          <w:rFonts w:ascii="Times New Roman" w:hAnsi="Times New Roman" w:cs="Times New Roman"/>
+          <w:sz w:val="24"/>
+          <w:szCs w:val="24"/>
+          <w:lang w:val="en-US"/>
+        </w:rPr>
+        <w:t xml:space="preserve">• </w:t>
+      </w:r>
+      <w:r>
+        <w:rPr>
+          <w:rFonts w:ascii="Times New Roman" w:hAnsi="Times New Roman" w:cs="Times New Roman"/>
+          <w:b/>
+          <w:bCs/>
+          <w:sz w:val="24"/>
+          <w:szCs w:val="24"/>
+          <w:lang w:val="en-US"/>
+        </w:rPr>
+        <w:t xml:space="preserve">Duplicate Entry Control: </w:t>
+      </w:r>
+      <w:r>
+        <w:rPr>
+          <w:rFonts w:ascii="Times New Roman" w:hAnsi="Times New Roman" w:cs="Times New Roman"/>
+          <w:sz w:val="24"/>
+          <w:szCs w:val="24"/>
+          <w:lang w:val="en-US"/>
+        </w:rPr>
+        <w:t xml:space="preserve">To maintain integrity and prevent manipulation of knowledge or statistical anomaly, a strict verification and elimination process of duplicates was systematically followed. This particularly applied to the tags.csv data whose duplicates would otherwise skew frequency counts. All duplicate entries were eliminated with extreme care such that every data point became </w:t>
+      </w:r>
+      <w:proofErr w:type="gramStart"/>
+      <w:r>
+        <w:rPr>
+          <w:rFonts w:ascii="Times New Roman" w:hAnsi="Times New Roman" w:cs="Times New Roman"/>
+          <w:sz w:val="24"/>
+          <w:szCs w:val="24"/>
+          <w:lang w:val="en-US"/>
+        </w:rPr>
+        <w:t>an</w:t>
+      </w:r>
+      <w:proofErr w:type="gramEnd"/>
+      <w:r>
+        <w:rPr>
+          <w:rFonts w:ascii="Times New Roman" w:hAnsi="Times New Roman" w:cs="Times New Roman"/>
+          <w:sz w:val="24"/>
+          <w:szCs w:val="24"/>
+          <w:lang w:val="en-US"/>
+        </w:rPr>
+        <w:t xml:space="preserve"> one-of-a-kind and unique observation and thereby preserved integrity of future analyses.</w:t>
+      </w:r>
+    </w:p>
+    <w:p>
+      <w:pPr>
+        <w:spacing w:line="360" w:lineRule="auto"/>
+        <w:jc w:val="both"/>
+        <w:rPr>
+          <w:rFonts w:ascii="Times New Roman" w:hAnsi="Times New Roman" w:cs="Times New Roman"/>
+          <w:sz w:val="24"/>
+          <w:szCs w:val="24"/>
+          <w:lang w:val="en-US"/>
+        </w:rPr>
+      </w:pPr>
+    </w:p>
+    <w:p>
+      <w:pPr>
+        <w:spacing w:line="360" w:lineRule="auto"/>
+        <w:jc w:val="both"/>
+        <w:rPr>
+          <w:rFonts w:ascii="Times New Roman" w:hAnsi="Times New Roman" w:cs="Times New Roman"/>
+          <w:sz w:val="24"/>
+          <w:szCs w:val="24"/>
+          <w:lang w:val="en-US"/>
+        </w:rPr>
+      </w:pPr>
+      <w:r>
+        <w:rPr>
+          <w:rFonts w:ascii="Times New Roman" w:hAnsi="Times New Roman" w:cs="Times New Roman"/>
+          <w:sz w:val="24"/>
+          <w:szCs w:val="24"/>
+          <w:lang w:val="en-US"/>
+        </w:rPr>
+        <w:t xml:space="preserve">• </w:t>
+      </w:r>
+      <w:r>
+        <w:rPr>
+          <w:rFonts w:ascii="Times New Roman" w:hAnsi="Times New Roman" w:cs="Times New Roman"/>
+          <w:b/>
+          <w:bCs/>
+          <w:sz w:val="24"/>
+          <w:szCs w:val="24"/>
+          <w:lang w:val="en-US"/>
+        </w:rPr>
+        <w:t>Data Merging and Feature Transformation:</w:t>
+      </w:r>
+      <w:r>
+        <w:rPr>
+          <w:rFonts w:ascii="Times New Roman" w:hAnsi="Times New Roman" w:cs="Times New Roman"/>
+          <w:sz w:val="24"/>
+          <w:szCs w:val="24"/>
+          <w:lang w:val="en-US"/>
+        </w:rPr>
+        <w:t xml:space="preserve"> A pivotal step was the intelligent merging of the ratings and </w:t>
+      </w:r>
+      <w:proofErr w:type="gramStart"/>
+      <w:r>
+        <w:rPr>
+          <w:rFonts w:ascii="Times New Roman" w:hAnsi="Times New Roman" w:cs="Times New Roman"/>
+          <w:sz w:val="24"/>
+          <w:szCs w:val="24"/>
+          <w:lang w:val="en-US"/>
+        </w:rPr>
+        <w:t>movies</w:t>
+      </w:r>
+      <w:proofErr w:type="gramEnd"/>
+      <w:r>
+        <w:rPr>
+          <w:rFonts w:ascii="Times New Roman" w:hAnsi="Times New Roman" w:cs="Times New Roman"/>
+          <w:sz w:val="24"/>
+          <w:szCs w:val="24"/>
+          <w:lang w:val="en-US"/>
+        </w:rPr>
+        <w:t xml:space="preserve"> </w:t>
+      </w:r>
+      <w:proofErr w:type="spellStart"/>
+      <w:r>
+        <w:rPr>
+          <w:rFonts w:ascii="Times New Roman" w:hAnsi="Times New Roman" w:cs="Times New Roman"/>
+          <w:sz w:val="24"/>
+          <w:szCs w:val="24"/>
+          <w:lang w:val="en-US"/>
+        </w:rPr>
+        <w:t>dataframes</w:t>
+      </w:r>
+      <w:proofErr w:type="spellEnd"/>
+      <w:r>
+        <w:rPr>
+          <w:rFonts w:ascii="Times New Roman" w:hAnsi="Times New Roman" w:cs="Times New Roman"/>
+          <w:sz w:val="24"/>
+          <w:szCs w:val="24"/>
+          <w:lang w:val="en-US"/>
+        </w:rPr>
+        <w:t xml:space="preserve">. This was achieved through the common </w:t>
+      </w:r>
+      <w:proofErr w:type="spellStart"/>
+      <w:r>
+        <w:rPr>
+          <w:rFonts w:ascii="Times New Roman" w:hAnsi="Times New Roman" w:cs="Times New Roman"/>
+          <w:sz w:val="24"/>
+          <w:szCs w:val="24"/>
+          <w:lang w:val="en-US"/>
+        </w:rPr>
+        <w:t>movieId</w:t>
+      </w:r>
+      <w:proofErr w:type="spellEnd"/>
+      <w:r>
+        <w:rPr>
+          <w:rFonts w:ascii="Times New Roman" w:hAnsi="Times New Roman" w:cs="Times New Roman"/>
+          <w:sz w:val="24"/>
+          <w:szCs w:val="24"/>
+          <w:lang w:val="en-US"/>
+        </w:rPr>
+        <w:t xml:space="preserve"> identifier to form a combined </w:t>
+      </w:r>
+      <w:proofErr w:type="spellStart"/>
+      <w:r>
+        <w:rPr>
+          <w:rFonts w:ascii="Times New Roman" w:hAnsi="Times New Roman" w:cs="Times New Roman"/>
+          <w:sz w:val="24"/>
+          <w:szCs w:val="24"/>
+          <w:lang w:val="en-US"/>
+        </w:rPr>
+        <w:t>ratings_movies</w:t>
+      </w:r>
+      <w:proofErr w:type="spellEnd"/>
+      <w:r>
+        <w:rPr>
+          <w:rFonts w:ascii="Times New Roman" w:hAnsi="Times New Roman" w:cs="Times New Roman"/>
+          <w:sz w:val="24"/>
+          <w:szCs w:val="24"/>
+          <w:lang w:val="en-US"/>
+        </w:rPr>
+        <w:t xml:space="preserve"> </w:t>
+      </w:r>
+      <w:proofErr w:type="spellStart"/>
+      <w:r>
+        <w:rPr>
+          <w:rFonts w:ascii="Times New Roman" w:hAnsi="Times New Roman" w:cs="Times New Roman"/>
+          <w:sz w:val="24"/>
+          <w:szCs w:val="24"/>
+          <w:lang w:val="en-US"/>
+        </w:rPr>
+        <w:t>dataframe</w:t>
+      </w:r>
+      <w:proofErr w:type="spellEnd"/>
+      <w:r>
+        <w:rPr>
+          <w:rFonts w:ascii="Times New Roman" w:hAnsi="Times New Roman" w:cs="Times New Roman"/>
+          <w:sz w:val="24"/>
+          <w:szCs w:val="24"/>
+          <w:lang w:val="en-US"/>
+        </w:rPr>
+        <w:t xml:space="preserve">. This enriched dataset formed the input basis for the following analytical stages, offering a general overview combining implicit user opinion (ratings) with informative movie attributes (titles and genres). Also, the genres column, presented in the </w:t>
+      </w:r>
+      <w:r>
+        <w:rPr>
+          <w:rFonts w:ascii="Times New Roman" w:hAnsi="Times New Roman" w:cs="Times New Roman"/>
+          <w:sz w:val="24"/>
+          <w:szCs w:val="24"/>
+          <w:lang w:val="en-US"/>
+        </w:rPr>
+        <w:lastRenderedPageBreak/>
+        <w:t>initial state as a pipe-separated string (for example, "</w:t>
+      </w:r>
+      <w:proofErr w:type="spellStart"/>
+      <w:r>
+        <w:rPr>
+          <w:rFonts w:ascii="Times New Roman" w:hAnsi="Times New Roman" w:cs="Times New Roman"/>
+          <w:sz w:val="24"/>
+          <w:szCs w:val="24"/>
+          <w:lang w:val="en-US"/>
+        </w:rPr>
+        <w:t>Action|Adventure|Sci-Fi</w:t>
+      </w:r>
+      <w:proofErr w:type="spellEnd"/>
+      <w:r>
+        <w:rPr>
+          <w:rFonts w:ascii="Times New Roman" w:hAnsi="Times New Roman" w:cs="Times New Roman"/>
+          <w:sz w:val="24"/>
+          <w:szCs w:val="24"/>
+          <w:lang w:val="en-US"/>
+        </w:rPr>
+        <w:t>"), was put through an important and obligatory transformation: one-hot encoding. This operation converted each unique genre to a binary feature, and a sparse matrix was the result, in which a '1' was set for the existence of a specific genre in a specific movie, and a '0' set for its non-existence. This conversion was downright necessary, as categorical data classification by the K-Mode algorithm requires features in this discrete binary format.</w:t>
+      </w:r>
+    </w:p>
+    <w:p>
+      <w:pPr>
+        <w:spacing w:line="360" w:lineRule="auto"/>
+        <w:jc w:val="both"/>
+        <w:rPr>
+          <w:rFonts w:ascii="Times New Roman" w:hAnsi="Times New Roman" w:cs="Times New Roman"/>
+          <w:sz w:val="24"/>
+          <w:szCs w:val="24"/>
+          <w:lang w:val="en-US"/>
+        </w:rPr>
+      </w:pPr>
+    </w:p>
+    <w:p>
+      <w:pPr>
+        <w:spacing w:line="360" w:lineRule="auto"/>
+        <w:jc w:val="both"/>
+        <w:rPr>
+          <w:rFonts w:ascii="Times New Roman" w:hAnsi="Times New Roman" w:cs="Times New Roman"/>
+          <w:sz w:val="24"/>
+          <w:szCs w:val="24"/>
+          <w:lang w:val="en-US"/>
+        </w:rPr>
+      </w:pPr>
+      <w:r>
+        <w:rPr>
+          <w:rFonts w:ascii="Times New Roman" w:hAnsi="Times New Roman" w:cs="Times New Roman"/>
+          <w:sz w:val="24"/>
+          <w:szCs w:val="24"/>
+          <w:lang w:val="en-US"/>
+        </w:rPr>
+        <w:t>After proper preprocessing, there ensued a proper Exploratory Data Analysis (EDA) process. This preliminary analytic exploratory study was vital to preliminarily comprehend the intrinsic nature of the dataset, validate data quality, and empirically inform subsequent modeling decisions. The most significant things that were discovered through EDA were:</w:t>
+      </w:r>
+    </w:p>
+    <w:p>
+      <w:pPr>
+        <w:spacing w:line="360" w:lineRule="auto"/>
+        <w:jc w:val="both"/>
+        <w:rPr>
+          <w:rFonts w:ascii="Times New Roman" w:hAnsi="Times New Roman" w:cs="Times New Roman"/>
+          <w:sz w:val="24"/>
+          <w:szCs w:val="24"/>
+          <w:lang w:val="en-US"/>
+        </w:rPr>
+      </w:pPr>
+    </w:p>
+    <w:p>
+      <w:pPr>
+        <w:spacing w:line="360" w:lineRule="auto"/>
+        <w:jc w:val="both"/>
+        <w:rPr>
+          <w:rFonts w:ascii="Times New Roman" w:hAnsi="Times New Roman" w:cs="Times New Roman"/>
+          <w:sz w:val="24"/>
+          <w:szCs w:val="24"/>
+          <w:lang w:val="en-US"/>
+        </w:rPr>
+      </w:pPr>
+      <w:r>
+        <w:rPr>
+          <w:rFonts w:ascii="Times New Roman" w:hAnsi="Times New Roman" w:cs="Times New Roman"/>
+          <w:sz w:val="24"/>
+          <w:szCs w:val="24"/>
+          <w:lang w:val="en-US"/>
+        </w:rPr>
+        <w:t xml:space="preserve">• </w:t>
+      </w:r>
+      <w:r>
+        <w:rPr>
+          <w:rFonts w:ascii="Times New Roman" w:hAnsi="Times New Roman" w:cs="Times New Roman"/>
+          <w:b/>
+          <w:bCs/>
+          <w:sz w:val="24"/>
+          <w:szCs w:val="24"/>
+          <w:lang w:val="en-US"/>
+        </w:rPr>
+        <w:t>Distribution Analysis of Ratings:</w:t>
+      </w:r>
+      <w:r>
+        <w:rPr>
+          <w:rFonts w:ascii="Times New Roman" w:hAnsi="Times New Roman" w:cs="Times New Roman"/>
+          <w:sz w:val="24"/>
+          <w:szCs w:val="24"/>
+          <w:lang w:val="en-US"/>
+        </w:rPr>
+        <w:t xml:space="preserve"> A strict histogram of the rating distribution of the movie revealed an apparent skewing of ratings in the positive direction with most falling between 3.0 and 4.5 stars, with an estimated mean of 3.5 out of 5 stars. This result points toward a bias of general users to give positive ratings, or even perhaps an indicator of self-selection bias where users give ratings on content they liked. </w:t>
+      </w:r>
+      <w:proofErr w:type="gramStart"/>
+      <w:r>
+        <w:rPr>
+          <w:rFonts w:ascii="Times New Roman" w:hAnsi="Times New Roman" w:cs="Times New Roman"/>
+          <w:sz w:val="24"/>
+          <w:szCs w:val="24"/>
+          <w:lang w:val="en-US"/>
+        </w:rPr>
+        <w:t>Understanding of</w:t>
+      </w:r>
+      <w:proofErr w:type="gramEnd"/>
+      <w:r>
+        <w:rPr>
+          <w:rFonts w:ascii="Times New Roman" w:hAnsi="Times New Roman" w:cs="Times New Roman"/>
+          <w:sz w:val="24"/>
+          <w:szCs w:val="24"/>
+          <w:lang w:val="en-US"/>
+        </w:rPr>
+        <w:t xml:space="preserve"> the underlying distribution is important to putting and understanding the overall sentiment expressed within the dataset.</w:t>
+      </w:r>
+    </w:p>
+    <w:p>
+      <w:pPr>
+        <w:spacing w:line="360" w:lineRule="auto"/>
+        <w:jc w:val="both"/>
+        <w:rPr>
+          <w:rFonts w:ascii="Times New Roman" w:hAnsi="Times New Roman" w:cs="Times New Roman"/>
+          <w:sz w:val="24"/>
+          <w:szCs w:val="24"/>
+          <w:lang w:val="en-US"/>
+        </w:rPr>
+      </w:pPr>
+    </w:p>
+    <w:p>
+      <w:pPr>
+        <w:spacing w:line="360" w:lineRule="auto"/>
+        <w:jc w:val="both"/>
+        <w:rPr>
+          <w:rFonts w:ascii="Times New Roman" w:hAnsi="Times New Roman" w:cs="Times New Roman"/>
+          <w:sz w:val="24"/>
+          <w:szCs w:val="24"/>
+          <w:lang w:val="en-US"/>
+        </w:rPr>
+      </w:pPr>
+      <w:r>
+        <w:rPr>
+          <w:rFonts w:ascii="Times New Roman" w:hAnsi="Times New Roman" w:cs="Times New Roman"/>
+          <w:sz w:val="24"/>
+          <w:szCs w:val="24"/>
+          <w:lang w:val="en-US"/>
+        </w:rPr>
+        <w:t xml:space="preserve">• </w:t>
+      </w:r>
+      <w:r>
+        <w:rPr>
+          <w:rFonts w:ascii="Times New Roman" w:hAnsi="Times New Roman" w:cs="Times New Roman"/>
+          <w:b/>
+          <w:bCs/>
+          <w:sz w:val="24"/>
+          <w:szCs w:val="24"/>
+          <w:lang w:val="en-US"/>
+        </w:rPr>
+        <w:t>Dataset Size and Dimensionality:</w:t>
+      </w:r>
+      <w:r>
+        <w:rPr>
+          <w:rFonts w:ascii="Times New Roman" w:hAnsi="Times New Roman" w:cs="Times New Roman"/>
+          <w:sz w:val="24"/>
+          <w:szCs w:val="24"/>
+          <w:lang w:val="en-US"/>
+        </w:rPr>
+        <w:t xml:space="preserve"> The EDA identified that the dataset contained a vast inventory of 610 individual users and a vast library of 9,724 distinct films. The vast and heterogeneous scope reflects the size and usability of the dataset in capturing multiple and detailed behavioral patterns with adequate data points to enable statistical inference.</w:t>
+      </w:r>
+    </w:p>
+    <w:p>
+      <w:pPr>
+        <w:spacing w:line="360" w:lineRule="auto"/>
+        <w:jc w:val="both"/>
+        <w:rPr>
+          <w:rFonts w:ascii="Times New Roman" w:hAnsi="Times New Roman" w:cs="Times New Roman"/>
+          <w:sz w:val="24"/>
+          <w:szCs w:val="24"/>
+          <w:lang w:val="en-US"/>
+        </w:rPr>
+      </w:pPr>
+    </w:p>
+    <w:p>
+      <w:pPr>
+        <w:spacing w:line="360" w:lineRule="auto"/>
+        <w:jc w:val="both"/>
+        <w:rPr>
+          <w:rFonts w:ascii="Times New Roman" w:hAnsi="Times New Roman" w:cs="Times New Roman"/>
+          <w:sz w:val="24"/>
+          <w:szCs w:val="24"/>
+          <w:lang w:val="en-US"/>
+        </w:rPr>
+      </w:pPr>
+      <w:r>
+        <w:rPr>
+          <w:rFonts w:ascii="Times New Roman" w:hAnsi="Times New Roman" w:cs="Times New Roman"/>
+          <w:sz w:val="24"/>
+          <w:szCs w:val="24"/>
+          <w:lang w:val="en-US"/>
+        </w:rPr>
+        <w:t xml:space="preserve">•Identification of Popularity Trends: Identification of the most popular 10 movies, such as classic titles like "Forrest Gump (1994)," "Shawshank Redemption, </w:t>
+      </w:r>
+      <w:proofErr w:type="gramStart"/>
+      <w:r>
+        <w:rPr>
+          <w:rFonts w:ascii="Times New Roman" w:hAnsi="Times New Roman" w:cs="Times New Roman"/>
+          <w:sz w:val="24"/>
+          <w:szCs w:val="24"/>
+          <w:lang w:val="en-US"/>
+        </w:rPr>
+        <w:t>The</w:t>
+      </w:r>
+      <w:proofErr w:type="gramEnd"/>
+      <w:r>
+        <w:rPr>
+          <w:rFonts w:ascii="Times New Roman" w:hAnsi="Times New Roman" w:cs="Times New Roman"/>
+          <w:sz w:val="24"/>
+          <w:szCs w:val="24"/>
+          <w:lang w:val="en-US"/>
+        </w:rPr>
+        <w:t xml:space="preserve"> (1994)," and "Pulp Fiction (1994)," provided us with an initial empirical glimpse into well-rated and highly engaged-with material among the </w:t>
+      </w:r>
+      <w:proofErr w:type="spellStart"/>
+      <w:r>
+        <w:rPr>
+          <w:rFonts w:ascii="Times New Roman" w:hAnsi="Times New Roman" w:cs="Times New Roman"/>
+          <w:sz w:val="24"/>
+          <w:szCs w:val="24"/>
+          <w:lang w:val="en-US"/>
+        </w:rPr>
+        <w:t>MovieLens</w:t>
+      </w:r>
+      <w:proofErr w:type="spellEnd"/>
+      <w:r>
+        <w:rPr>
+          <w:rFonts w:ascii="Times New Roman" w:hAnsi="Times New Roman" w:cs="Times New Roman"/>
+          <w:sz w:val="24"/>
+          <w:szCs w:val="24"/>
+          <w:lang w:val="en-US"/>
+        </w:rPr>
+        <w:t xml:space="preserve"> user base. These blockbuster titles can be taken as reference measures for ascertaining general audience interest.</w:t>
+      </w:r>
+    </w:p>
+    <w:p>
+      <w:pPr>
+        <w:spacing w:line="360" w:lineRule="auto"/>
+        <w:jc w:val="both"/>
+        <w:rPr>
+          <w:rFonts w:ascii="Times New Roman" w:hAnsi="Times New Roman" w:cs="Times New Roman"/>
+          <w:sz w:val="24"/>
+          <w:szCs w:val="24"/>
+          <w:lang w:val="en-US"/>
+        </w:rPr>
+      </w:pPr>
+    </w:p>
+    <w:p>
+      <w:pPr>
+        <w:spacing w:line="360" w:lineRule="auto"/>
+        <w:jc w:val="both"/>
+        <w:rPr>
+          <w:rFonts w:ascii="Times New Roman" w:hAnsi="Times New Roman" w:cs="Times New Roman"/>
+          <w:sz w:val="24"/>
+          <w:szCs w:val="24"/>
+          <w:lang w:val="en-US"/>
+        </w:rPr>
+      </w:pPr>
+      <w:r>
+        <w:rPr>
+          <w:rFonts w:ascii="Times New Roman" w:hAnsi="Times New Roman" w:cs="Times New Roman"/>
+          <w:sz w:val="24"/>
+          <w:szCs w:val="24"/>
+          <w:lang w:val="en-US"/>
+        </w:rPr>
+        <w:lastRenderedPageBreak/>
+        <w:t xml:space="preserve">•  </w:t>
+      </w:r>
+      <w:r>
+        <w:rPr>
+          <w:rFonts w:ascii="Times New Roman" w:hAnsi="Times New Roman" w:cs="Times New Roman"/>
+          <w:b/>
+          <w:bCs/>
+          <w:sz w:val="24"/>
+          <w:szCs w:val="24"/>
+          <w:lang w:val="en-US"/>
+        </w:rPr>
+        <w:t>Distribution of Ratings Frequency and "Long Tail":</w:t>
+      </w:r>
+      <w:r>
+        <w:rPr>
+          <w:rFonts w:ascii="Times New Roman" w:hAnsi="Times New Roman" w:cs="Times New Roman"/>
+          <w:sz w:val="24"/>
+          <w:szCs w:val="24"/>
+          <w:lang w:val="en-US"/>
+        </w:rPr>
+        <w:t xml:space="preserve"> A histogram illustrating the distribution of the frequency of ratings per movie was created, aiming at movies with at least 10 ratings to exclude very thin records. This plot, shown critically on a log scale, visually depicted the pervasive "long-tail" phenomenon. </w:t>
+      </w:r>
+    </w:p>
+    <w:p>
+      <w:pPr>
+        <w:spacing w:line="360" w:lineRule="auto"/>
+        <w:jc w:val="both"/>
+        <w:rPr>
+          <w:rFonts w:ascii="Times New Roman" w:hAnsi="Times New Roman" w:cs="Times New Roman"/>
+          <w:sz w:val="24"/>
+          <w:szCs w:val="24"/>
+          <w:lang w:val="en-US"/>
+        </w:rPr>
+      </w:pPr>
+    </w:p>
+    <w:p>
+      <w:pPr>
+        <w:spacing w:line="360" w:lineRule="auto"/>
+        <w:jc w:val="both"/>
+        <w:rPr>
+          <w:rFonts w:ascii="Times New Roman" w:hAnsi="Times New Roman" w:cs="Times New Roman"/>
+          <w:sz w:val="24"/>
+          <w:szCs w:val="24"/>
+          <w:lang w:val="en-US"/>
+        </w:rPr>
+      </w:pPr>
+      <w:proofErr w:type="gramStart"/>
+      <w:r>
+        <w:rPr>
+          <w:rFonts w:ascii="Times New Roman" w:hAnsi="Times New Roman" w:cs="Times New Roman"/>
+          <w:sz w:val="24"/>
+          <w:szCs w:val="24"/>
+          <w:lang w:val="en-US"/>
+        </w:rPr>
+        <w:t>This characteristic reveals</w:t>
+      </w:r>
+      <w:proofErr w:type="gramEnd"/>
+      <w:r>
+        <w:rPr>
+          <w:rFonts w:ascii="Times New Roman" w:hAnsi="Times New Roman" w:cs="Times New Roman"/>
+          <w:sz w:val="24"/>
+          <w:szCs w:val="24"/>
+          <w:lang w:val="en-US"/>
+        </w:rPr>
+        <w:t xml:space="preserve"> that a very small percentage of movies gather a disproportionate majority of user activity and ratings, while a vast majority of films remain in the "tail" with minimal engagement. This inherent nature of consumption behavior on online content platforms presents a twofold challenge and opportunity for recommendation systems: the ability to effectively recommend both extremely popular blockbuster content as well as, more importantly, relevant but less conspicuous niche content to facilitate user discovery and satisfaction.</w:t>
+      </w:r>
+    </w:p>
     <w:p/>
     <w:sectPr>
-      <w:footerReference w:type="default" r:id="rId4"/>
+      <w:footerReference w:type="default" r:id="rId6"/>
       <w:pgSz w:w="12240" w:h="15840"/>
       <w:pgMar w:top="1440" w:right="1440" w:bottom="1440" w:left="1440" w:header="720" w:footer="720" w:gutter="0"/>
       <w:pgNumType w:start="1"/>
@@ -3972,6 +5570,31 @@
     </w:sectPr>
   </w:body>
 </w:document>
+</file>
+
+<file path=word/endnotes.xml><?xml version="1.0" encoding="utf-8"?>
+<w:endnotes xmlns:wpc="http://schemas.microsoft.com/office/word/2010/wordprocessingCanvas" xmlns:cx="http://schemas.microsoft.com/office/drawing/2014/chartex" xmlns:cx1="http://schemas.microsoft.com/office/drawing/2015/9/8/chartex" xmlns:cx2="http://schemas.microsoft.com/office/drawing/2015/10/21/chartex" xmlns:cx3="http://schemas.microsoft.com/office/drawing/2016/5/9/chartex" xmlns:cx4="http://schemas.microsoft.com/office/drawing/2016/5/10/chartex" xmlns:cx5="http://schemas.microsoft.com/office/drawing/2016/5/11/chartex" xmlns:cx6="http://schemas.microsoft.com/office/drawing/2016/5/12/chartex" xmlns:cx7="http://schemas.microsoft.com/office/drawing/2016/5/13/chartex" xmlns:cx8="http://schemas.microsoft.com/office/drawing/2016/5/14/chartex" xmlns:mc="http://schemas.openxmlformats.org/markup-compatibility/2006" xmlns:aink="http://schemas.microsoft.com/office/drawing/2016/ink" xmlns:am3d="http://schemas.microsoft.com/office/drawing/2017/model3d" xmlns:o="urn:schemas-microsoft-com:office:office" xmlns:oel="http://schemas.microsoft.com/office/2019/extlst" xmlns:r="http://schemas.openxmlformats.org/officeDocument/2006/relationships" xmlns:m="http://schemas.openxmlformats.org/officeDocument/2006/math" xmlns:v="urn:schemas-microsoft-com:vml" xmlns:wp14="http://schemas.microsoft.com/office/word/2010/wordprocessingDrawing" xmlns:wp="http://schemas.openxmlformats.org/drawingml/2006/wordprocessingDrawing" xmlns:w10="urn:schemas-microsoft-com:office:word" xmlns:w="http://schemas.openxmlformats.org/wordprocessingml/2006/main" xmlns:w14="http://schemas.microsoft.com/office/word/2010/wordml" xmlns:w15="http://schemas.microsoft.com/office/word/2012/wordml" xmlns:w16cex="http://schemas.microsoft.com/office/word/2018/wordml/cex" xmlns:w16cid="http://schemas.microsoft.com/office/word/2016/wordml/cid" xmlns:w16="http://schemas.microsoft.com/office/word/2018/wordml" xmlns:w16du="http://schemas.microsoft.com/office/word/2023/wordml/word16du" xmlns:w16sdtdh="http://schemas.microsoft.com/office/word/2020/wordml/sdtdatahash" xmlns:w16sdtfl="http://schemas.microsoft.com/office/word/2024/wordml/sdtformatlock" xmlns:w16se="http://schemas.microsoft.com/office/word/2015/wordml/symex" xmlns:wpg="http://schemas.microsoft.com/office/word/2010/wordprocessingGroup" xmlns:wpi="http://schemas.microsoft.com/office/word/2010/wordprocessingInk" xmlns:wne="http://schemas.microsoft.com/office/word/2006/wordml" xmlns:wps="http://schemas.microsoft.com/office/word/2010/wordprocessingShape" mc:Ignorable="w14 w15 w16se w16cid w16 w16cex w16sdtdh w16sdtfl w16du wp14">
+  <w:endnote w:type="separator" w:id="-1">
+    <w:p>
+      <w:pPr>
+        <w:spacing w:line="240" w:lineRule="auto"/>
+      </w:pPr>
+      <w:r>
+        <w:separator/>
+      </w:r>
+    </w:p>
+  </w:endnote>
+  <w:endnote w:type="continuationSeparator" w:id="0">
+    <w:p>
+      <w:pPr>
+        <w:spacing w:line="240" w:lineRule="auto"/>
+      </w:pPr>
+      <w:r>
+        <w:continuationSeparator/>
+      </w:r>
+    </w:p>
+  </w:endnote>
+</w:endnotes>
 </file>
 
 <file path=word/footer1.xml><?xml version="1.0" encoding="utf-8"?>
@@ -4000,6 +5623,31 @@
     </w:r>
   </w:p>
 </w:ftr>
+</file>
+
+<file path=word/footnotes.xml><?xml version="1.0" encoding="utf-8"?>
+<w:footnotes xmlns:wpc="http://schemas.microsoft.com/office/word/2010/wordprocessingCanvas" xmlns:cx="http://schemas.microsoft.com/office/drawing/2014/chartex" xmlns:cx1="http://schemas.microsoft.com/office/drawing/2015/9/8/chartex" xmlns:cx2="http://schemas.microsoft.com/office/drawing/2015/10/21/chartex" xmlns:cx3="http://schemas.microsoft.com/office/drawing/2016/5/9/chartex" xmlns:cx4="http://schemas.microsoft.com/office/drawing/2016/5/10/chartex" xmlns:cx5="http://schemas.microsoft.com/office/drawing/2016/5/11/chartex" xmlns:cx6="http://schemas.microsoft.com/office/drawing/2016/5/12/chartex" xmlns:cx7="http://schemas.microsoft.com/office/drawing/2016/5/13/chartex" xmlns:cx8="http://schemas.microsoft.com/office/drawing/2016/5/14/chartex" xmlns:mc="http://schemas.openxmlformats.org/markup-compatibility/2006" xmlns:aink="http://schemas.microsoft.com/office/drawing/2016/ink" xmlns:am3d="http://schemas.microsoft.com/office/drawing/2017/model3d" xmlns:o="urn:schemas-microsoft-com:office:office" xmlns:oel="http://schemas.microsoft.com/office/2019/extlst" xmlns:r="http://schemas.openxmlformats.org/officeDocument/2006/relationships" xmlns:m="http://schemas.openxmlformats.org/officeDocument/2006/math" xmlns:v="urn:schemas-microsoft-com:vml" xmlns:wp14="http://schemas.microsoft.com/office/word/2010/wordprocessingDrawing" xmlns:wp="http://schemas.openxmlformats.org/drawingml/2006/wordprocessingDrawing" xmlns:w10="urn:schemas-microsoft-com:office:word" xmlns:w="http://schemas.openxmlformats.org/wordprocessingml/2006/main" xmlns:w14="http://schemas.microsoft.com/office/word/2010/wordml" xmlns:w15="http://schemas.microsoft.com/office/word/2012/wordml" xmlns:w16cex="http://schemas.microsoft.com/office/word/2018/wordml/cex" xmlns:w16cid="http://schemas.microsoft.com/office/word/2016/wordml/cid" xmlns:w16="http://schemas.microsoft.com/office/word/2018/wordml" xmlns:w16du="http://schemas.microsoft.com/office/word/2023/wordml/word16du" xmlns:w16sdtdh="http://schemas.microsoft.com/office/word/2020/wordml/sdtdatahash" xmlns:w16sdtfl="http://schemas.microsoft.com/office/word/2024/wordml/sdtformatlock" xmlns:w16se="http://schemas.microsoft.com/office/word/2015/wordml/symex" xmlns:wpg="http://schemas.microsoft.com/office/word/2010/wordprocessingGroup" xmlns:wpi="http://schemas.microsoft.com/office/word/2010/wordprocessingInk" xmlns:wne="http://schemas.microsoft.com/office/word/2006/wordml" xmlns:wps="http://schemas.microsoft.com/office/word/2010/wordprocessingShape" mc:Ignorable="w14 w15 w16se w16cid w16 w16cex w16sdtdh w16sdtfl w16du wp14">
+  <w:footnote w:type="separator" w:id="-1">
+    <w:p>
+      <w:pPr>
+        <w:spacing w:line="240" w:lineRule="auto"/>
+      </w:pPr>
+      <w:r>
+        <w:separator/>
+      </w:r>
+    </w:p>
+  </w:footnote>
+  <w:footnote w:type="continuationSeparator" w:id="0">
+    <w:p>
+      <w:pPr>
+        <w:spacing w:line="240" w:lineRule="auto"/>
+      </w:pPr>
+      <w:r>
+        <w:continuationSeparator/>
+      </w:r>
+    </w:p>
+  </w:footnote>
+</w:footnotes>
 </file>
 
 <file path=word/styles.xml><?xml version="1.0" encoding="utf-8"?>

</xml_diff>

<commit_message>
Continue on Methodology with the Addition of K mode and the steps that took place for the task to be successful.
</commit_message>
<xml_diff>
--- a/project write up/(FPR)A STUDY ON CUSTOMER BEHAVIOUR ANALYSIS FOR RETAIL OPTIMIZATION USING K.docx
+++ b/project write up/(FPR)A STUDY ON CUSTOMER BEHAVIOUR ANALYSIS FOR RETAIL OPTIMIZATION USING K.docx
@@ -98,25 +98,7 @@
           <w:sz w:val="24"/>
           <w:szCs w:val="24"/>
         </w:rPr>
-        <w:t xml:space="preserve">Organizations' approaches to customer interaction and service delivery have experienced a fundamental transition in the modern business environment.  Personalized experiences and data-driven decision-making have become essential to corporate success in this digital age, radically altering how organizations engage with their clientele and understand their preferences.  This change reflects a total restructuring of the relationship between customers and businesses, not </w:t>
-      </w:r>
-      <w:proofErr w:type="gramStart"/>
-      <w:r>
-        <w:rPr>
-          <w:rFonts w:ascii="Times New Roman" w:eastAsia="Times New Roman" w:hAnsi="Times New Roman" w:cs="Times New Roman"/>
-          <w:sz w:val="24"/>
-          <w:szCs w:val="24"/>
-        </w:rPr>
-        <w:t>merely a technology</w:t>
-      </w:r>
-      <w:proofErr w:type="gramEnd"/>
-      <w:r>
-        <w:rPr>
-          <w:rFonts w:ascii="Times New Roman" w:eastAsia="Times New Roman" w:hAnsi="Times New Roman" w:cs="Times New Roman"/>
-          <w:sz w:val="24"/>
-          <w:szCs w:val="24"/>
-        </w:rPr>
-        <w:t xml:space="preserve"> advancement.</w:t>
+        <w:t>Organizations' approaches to customer interaction and service delivery have experienced a fundamental transition in the modern business environment.  Personalized experiences and data-driven decision-making have become essential to corporate success in this digital age, radically altering how organizations engage with their clientele and understand their preferences.  This change reflects a total restructuring of the relationship between customers and businesses, not merely a technology advancement.</w:t>
       </w:r>
     </w:p>
     <w:p>
@@ -148,41 +130,13 @@
           <w:szCs w:val="24"/>
         </w:rPr>
       </w:pPr>
-      <w:proofErr w:type="spellStart"/>
-      <w:r>
-        <w:rPr>
-          <w:rFonts w:ascii="Times New Roman" w:eastAsia="Times New Roman" w:hAnsi="Times New Roman" w:cs="Times New Roman"/>
-          <w:sz w:val="24"/>
-          <w:szCs w:val="24"/>
-        </w:rPr>
-        <w:t>GroupLens</w:t>
-      </w:r>
-      <w:proofErr w:type="spellEnd"/>
-      <w:r>
-        <w:rPr>
-          <w:rFonts w:ascii="Times New Roman" w:eastAsia="Times New Roman" w:hAnsi="Times New Roman" w:cs="Times New Roman"/>
-          <w:sz w:val="24"/>
-          <w:szCs w:val="24"/>
-        </w:rPr>
-        <w:t xml:space="preserve"> at the University of Minnesota created the </w:t>
-      </w:r>
-      <w:proofErr w:type="spellStart"/>
-      <w:r>
-        <w:rPr>
-          <w:rFonts w:ascii="Times New Roman" w:eastAsia="Times New Roman" w:hAnsi="Times New Roman" w:cs="Times New Roman"/>
-          <w:sz w:val="24"/>
-          <w:szCs w:val="24"/>
-        </w:rPr>
-        <w:t>MovieLens</w:t>
-      </w:r>
-      <w:proofErr w:type="spellEnd"/>
-      <w:r>
-        <w:rPr>
-          <w:rFonts w:ascii="Times New Roman" w:eastAsia="Times New Roman" w:hAnsi="Times New Roman" w:cs="Times New Roman"/>
-          <w:sz w:val="24"/>
-          <w:szCs w:val="24"/>
-        </w:rPr>
-        <w:t xml:space="preserve"> dataset, which is proof of the effectiveness of methodical data collection and analysis in understanding user behavior. This extensive collection presents a great chance to investigate user behavior in the entertainment industry, giving scholars and professionals a solid basis on which to delve into the subtle aspects of consumer preferences. The depth and breadth of the dataset make it a perfect platform for testing cutting-edge analytical methods that have applications outside of entertainment.</w:t>
+      <w:r>
+        <w:rPr>
+          <w:rFonts w:ascii="Times New Roman" w:eastAsia="Times New Roman" w:hAnsi="Times New Roman" w:cs="Times New Roman"/>
+          <w:sz w:val="24"/>
+          <w:szCs w:val="24"/>
+        </w:rPr>
+        <w:t>GroupLens at the University of Minnesota created the MovieLens dataset, which is proof of the effectiveness of methodical data collection and analysis in understanding user behavior. This extensive collection presents a great chance to investigate user behavior in the entertainment industry, giving scholars and professionals a solid basis on which to delve into the subtle aspects of consumer preferences. The depth and breadth of the dataset make it a perfect platform for testing cutting-edge analytical methods that have applications outside of entertainment.</w:t>
       </w:r>
     </w:p>
     <w:p>
@@ -210,172 +164,64 @@
           <w:szCs w:val="24"/>
         </w:rPr>
         <w:lastRenderedPageBreak/>
-        <w:t xml:space="preserve">sites, and countless other digital platforms that depend on knowing user preferences to increase engagement and revenue face similar difficulties as </w:t>
-      </w:r>
-      <w:proofErr w:type="spellStart"/>
-      <w:r>
-        <w:rPr>
-          <w:rFonts w:ascii="Times New Roman" w:eastAsia="Times New Roman" w:hAnsi="Times New Roman" w:cs="Times New Roman"/>
-          <w:sz w:val="24"/>
-          <w:szCs w:val="24"/>
-        </w:rPr>
-        <w:t>MovieLens</w:t>
-      </w:r>
-      <w:proofErr w:type="spellEnd"/>
-      <w:r>
-        <w:rPr>
-          <w:rFonts w:ascii="Times New Roman" w:eastAsia="Times New Roman" w:hAnsi="Times New Roman" w:cs="Times New Roman"/>
-          <w:sz w:val="24"/>
-          <w:szCs w:val="24"/>
-        </w:rPr>
-        <w:t xml:space="preserve"> data analysis.</w:t>
-      </w:r>
-    </w:p>
-    <w:p>
-      <w:pPr>
-        <w:spacing w:before="240" w:after="240" w:line="360" w:lineRule="auto"/>
-        <w:jc w:val="both"/>
-        <w:rPr>
-          <w:rFonts w:ascii="Times New Roman" w:eastAsia="Times New Roman" w:hAnsi="Times New Roman" w:cs="Times New Roman"/>
-          <w:sz w:val="24"/>
-          <w:szCs w:val="24"/>
-        </w:rPr>
-      </w:pPr>
-      <w:r>
-        <w:rPr>
-          <w:rFonts w:ascii="Times New Roman" w:eastAsia="Times New Roman" w:hAnsi="Times New Roman" w:cs="Times New Roman"/>
-          <w:sz w:val="24"/>
-          <w:szCs w:val="24"/>
-        </w:rPr>
-        <w:t xml:space="preserve">Customer segmentation and product affinity discovery are foundational concepts that underpin successful recommendation systems and customer engagement strategies. These concepts, traditionally explored in retail environments, have found new applications and relevance in digital entertainment platforms where the principles remain </w:t>
-      </w:r>
-      <w:proofErr w:type="gramStart"/>
-      <w:r>
-        <w:rPr>
-          <w:rFonts w:ascii="Times New Roman" w:eastAsia="Times New Roman" w:hAnsi="Times New Roman" w:cs="Times New Roman"/>
-          <w:sz w:val="24"/>
-          <w:szCs w:val="24"/>
-        </w:rPr>
-        <w:t>consistent</w:t>
-      </w:r>
-      <w:proofErr w:type="gramEnd"/>
-      <w:r>
-        <w:rPr>
-          <w:rFonts w:ascii="Times New Roman" w:eastAsia="Times New Roman" w:hAnsi="Times New Roman" w:cs="Times New Roman"/>
-          <w:sz w:val="24"/>
-          <w:szCs w:val="24"/>
-        </w:rPr>
-        <w:t xml:space="preserve"> but the implementation requires innovative approaches. The challenge lies in identifying similar users through clustering techniques while simultaneously uncovering patterns of association between products, content, or behaviors that can inform strategic decision-making.</w:t>
-      </w:r>
-    </w:p>
-    <w:p>
-      <w:pPr>
-        <w:spacing w:before="240" w:after="240" w:line="360" w:lineRule="auto"/>
-        <w:jc w:val="both"/>
-        <w:rPr>
-          <w:rFonts w:ascii="Times New Roman" w:eastAsia="Times New Roman" w:hAnsi="Times New Roman" w:cs="Times New Roman"/>
-          <w:sz w:val="24"/>
-          <w:szCs w:val="24"/>
-        </w:rPr>
-      </w:pPr>
-      <w:r>
-        <w:rPr>
-          <w:rFonts w:ascii="Times New Roman" w:eastAsia="Times New Roman" w:hAnsi="Times New Roman" w:cs="Times New Roman"/>
-          <w:sz w:val="24"/>
-          <w:szCs w:val="24"/>
-        </w:rPr>
-        <w:t>This project explores how K-</w:t>
-      </w:r>
-      <w:proofErr w:type="gramStart"/>
-      <w:r>
-        <w:rPr>
-          <w:rFonts w:ascii="Times New Roman" w:eastAsia="Times New Roman" w:hAnsi="Times New Roman" w:cs="Times New Roman"/>
-          <w:sz w:val="24"/>
-          <w:szCs w:val="24"/>
-        </w:rPr>
-        <w:t>Modes</w:t>
-      </w:r>
-      <w:proofErr w:type="gramEnd"/>
-      <w:r>
-        <w:rPr>
-          <w:rFonts w:ascii="Times New Roman" w:eastAsia="Times New Roman" w:hAnsi="Times New Roman" w:cs="Times New Roman"/>
-          <w:sz w:val="24"/>
-          <w:szCs w:val="24"/>
-        </w:rPr>
-        <w:t xml:space="preserve"> clustering and association rule mining—techniques typically applied to categorical retail data—can be thoughtfully adapted to analyze user </w:t>
-      </w:r>
-      <w:proofErr w:type="spellStart"/>
-      <w:r>
-        <w:rPr>
-          <w:rFonts w:ascii="Times New Roman" w:eastAsia="Times New Roman" w:hAnsi="Times New Roman" w:cs="Times New Roman"/>
-          <w:sz w:val="24"/>
-          <w:szCs w:val="24"/>
-        </w:rPr>
-        <w:t>behaviours</w:t>
-      </w:r>
-      <w:proofErr w:type="spellEnd"/>
-      <w:r>
-        <w:rPr>
-          <w:rFonts w:ascii="Times New Roman" w:eastAsia="Times New Roman" w:hAnsi="Times New Roman" w:cs="Times New Roman"/>
-          <w:sz w:val="24"/>
-          <w:szCs w:val="24"/>
-        </w:rPr>
-        <w:t xml:space="preserve"> in </w:t>
-      </w:r>
-      <w:proofErr w:type="spellStart"/>
-      <w:r>
-        <w:rPr>
-          <w:rFonts w:ascii="Times New Roman" w:eastAsia="Times New Roman" w:hAnsi="Times New Roman" w:cs="Times New Roman"/>
-          <w:sz w:val="24"/>
-          <w:szCs w:val="24"/>
-        </w:rPr>
-        <w:t>MovieLens</w:t>
-      </w:r>
-      <w:proofErr w:type="spellEnd"/>
-      <w:r>
-        <w:rPr>
-          <w:rFonts w:ascii="Times New Roman" w:eastAsia="Times New Roman" w:hAnsi="Times New Roman" w:cs="Times New Roman"/>
-          <w:sz w:val="24"/>
-          <w:szCs w:val="24"/>
-        </w:rPr>
-        <w:t>. The adaptation process requires careful consideration of the unique characteristics of entertainment data, including the subjective nature of ratings, the temporal aspects of viewing behavior, and the complex interplay between genre preferences and individual taste profiles. The goal is to derive actionable insights for content recommendation and platform optimization that can be translated into practical improvements in user experience and business outcomes.</w:t>
-      </w:r>
-    </w:p>
-    <w:p>
-      <w:pPr>
-        <w:spacing w:before="240" w:after="240" w:line="360" w:lineRule="auto"/>
-        <w:jc w:val="both"/>
-        <w:rPr>
-          <w:rFonts w:ascii="Times New Roman" w:eastAsia="Times New Roman" w:hAnsi="Times New Roman" w:cs="Times New Roman"/>
-          <w:sz w:val="24"/>
-          <w:szCs w:val="24"/>
-        </w:rPr>
-      </w:pPr>
-      <w:r>
-        <w:rPr>
-          <w:rFonts w:ascii="Times New Roman" w:eastAsia="Times New Roman" w:hAnsi="Times New Roman" w:cs="Times New Roman"/>
-          <w:sz w:val="24"/>
-          <w:szCs w:val="24"/>
-        </w:rPr>
-        <w:t xml:space="preserve">The integration of these analytical approaches represents a significant opportunity to advance our understanding of customer behavior in digital environments. By combining the strengths of clustering algorithms with the pattern </w:t>
-      </w:r>
-      <w:proofErr w:type="spellStart"/>
-      <w:r>
-        <w:rPr>
-          <w:rFonts w:ascii="Times New Roman" w:eastAsia="Times New Roman" w:hAnsi="Times New Roman" w:cs="Times New Roman"/>
-          <w:sz w:val="24"/>
-          <w:szCs w:val="24"/>
-        </w:rPr>
-        <w:t>rity</w:t>
-      </w:r>
-      <w:proofErr w:type="spellEnd"/>
-      <w:r>
-        <w:rPr>
-          <w:rFonts w:ascii="Times New Roman" w:eastAsia="Times New Roman" w:hAnsi="Times New Roman" w:cs="Times New Roman"/>
-          <w:sz w:val="24"/>
-          <w:szCs w:val="24"/>
-        </w:rPr>
-        <w:t xml:space="preserve"> to advance our understanding of customer behavior in digital environments. By combining the strengths of clustering algorithms with the pattern recognition capabilities of association rule mining, we can potentially uncover insights that neither technique could reveal independently. This multifaceted approach acknowledges the complexity of modern customer behavior and the need for equally sophisticated analytical frameworks to understand and respond to it effectively.</w:t>
+        <w:t>sites, and countless other digital platforms that depend on knowing user preferences to increase engagement and revenue face similar difficulties as MovieLens data analysis.</w:t>
+      </w:r>
+    </w:p>
+    <w:p>
+      <w:pPr>
+        <w:spacing w:before="240" w:after="240" w:line="360" w:lineRule="auto"/>
+        <w:jc w:val="both"/>
+        <w:rPr>
+          <w:rFonts w:ascii="Times New Roman" w:eastAsia="Times New Roman" w:hAnsi="Times New Roman" w:cs="Times New Roman"/>
+          <w:sz w:val="24"/>
+          <w:szCs w:val="24"/>
+        </w:rPr>
+      </w:pPr>
+      <w:r>
+        <w:rPr>
+          <w:rFonts w:ascii="Times New Roman" w:eastAsia="Times New Roman" w:hAnsi="Times New Roman" w:cs="Times New Roman"/>
+          <w:sz w:val="24"/>
+          <w:szCs w:val="24"/>
+        </w:rPr>
+        <w:t>Customer segmentation and product affinity discovery are foundational concepts that underpin successful recommendation systems and customer engagement strategies. These concepts, traditionally explored in retail environments, have found new applications and relevance in digital entertainment platforms where the principles remain consistent but the implementation requires innovative approaches. The challenge lies in identifying similar users through clustering techniques while simultaneously uncovering patterns of association between products, content, or behaviors that can inform strategic decision-making.</w:t>
+      </w:r>
+    </w:p>
+    <w:p>
+      <w:pPr>
+        <w:spacing w:before="240" w:after="240" w:line="360" w:lineRule="auto"/>
+        <w:jc w:val="both"/>
+        <w:rPr>
+          <w:rFonts w:ascii="Times New Roman" w:eastAsia="Times New Roman" w:hAnsi="Times New Roman" w:cs="Times New Roman"/>
+          <w:sz w:val="24"/>
+          <w:szCs w:val="24"/>
+        </w:rPr>
+      </w:pPr>
+      <w:r>
+        <w:rPr>
+          <w:rFonts w:ascii="Times New Roman" w:eastAsia="Times New Roman" w:hAnsi="Times New Roman" w:cs="Times New Roman"/>
+          <w:sz w:val="24"/>
+          <w:szCs w:val="24"/>
+        </w:rPr>
+        <w:t>This project explores how K-Modes clustering and association rule mining—techniques typically applied to categorical retail data—can be thoughtfully adapted to analyze user behaviours in MovieLens. The adaptation process requires careful consideration of the unique characteristics of entertainment data, including the subjective nature of ratings, the temporal aspects of viewing behavior, and the complex interplay between genre preferences and individual taste profiles. The goal is to derive actionable insights for content recommendation and platform optimization that can be translated into practical improvements in user experience and business outcomes.</w:t>
+      </w:r>
+    </w:p>
+    <w:p>
+      <w:pPr>
+        <w:spacing w:before="240" w:after="240" w:line="360" w:lineRule="auto"/>
+        <w:jc w:val="both"/>
+        <w:rPr>
+          <w:rFonts w:ascii="Times New Roman" w:eastAsia="Times New Roman" w:hAnsi="Times New Roman" w:cs="Times New Roman"/>
+          <w:sz w:val="24"/>
+          <w:szCs w:val="24"/>
+        </w:rPr>
+      </w:pPr>
+      <w:r>
+        <w:rPr>
+          <w:rFonts w:ascii="Times New Roman" w:eastAsia="Times New Roman" w:hAnsi="Times New Roman" w:cs="Times New Roman"/>
+          <w:sz w:val="24"/>
+          <w:szCs w:val="24"/>
+        </w:rPr>
+        <w:t>The integration of these analytical approaches represents a significant opportunity to advance our understanding of customer behavior in digital environments. By combining the strengths of clustering algorithms with the pattern rity to advance our understanding of customer behavior in digital environments. By combining the strengths of clustering algorithms with the pattern recognition capabilities of association rule mining, we can potentially uncover insights that neither technique could reveal independently. This multifaceted approach acknowledges the complexity of modern customer behavior and the need for equally sophisticated analytical frameworks to understand and respond to it effectively.</w:t>
       </w:r>
     </w:p>
     <w:p>
@@ -444,43 +290,13 @@
           <w:szCs w:val="24"/>
         </w:rPr>
       </w:pPr>
-      <w:proofErr w:type="gramStart"/>
-      <w:r>
-        <w:rPr>
-          <w:rFonts w:ascii="Times New Roman" w:eastAsia="Times New Roman" w:hAnsi="Times New Roman" w:cs="Times New Roman"/>
-          <w:sz w:val="24"/>
-          <w:szCs w:val="24"/>
-        </w:rPr>
-        <w:t>The majority of</w:t>
-      </w:r>
-      <w:proofErr w:type="gramEnd"/>
-      <w:r>
-        <w:rPr>
-          <w:rFonts w:ascii="Times New Roman" w:eastAsia="Times New Roman" w:hAnsi="Times New Roman" w:cs="Times New Roman"/>
-          <w:sz w:val="24"/>
-          <w:szCs w:val="24"/>
-        </w:rPr>
-        <w:t xml:space="preserve"> recommendation systems currently in use exhibit a separated approach, applying various analytical techniques separately and failing to recognize the potential synergistic benefits of integrating </w:t>
-      </w:r>
-      <w:proofErr w:type="spellStart"/>
-      <w:proofErr w:type="gramStart"/>
-      <w:r>
-        <w:rPr>
-          <w:rFonts w:ascii="Times New Roman" w:eastAsia="Times New Roman" w:hAnsi="Times New Roman" w:cs="Times New Roman"/>
-          <w:sz w:val="24"/>
-          <w:szCs w:val="24"/>
-        </w:rPr>
-        <w:t>them.Traditional</w:t>
-      </w:r>
-      <w:proofErr w:type="spellEnd"/>
-      <w:proofErr w:type="gramEnd"/>
-      <w:r>
-        <w:rPr>
-          <w:rFonts w:ascii="Times New Roman" w:eastAsia="Times New Roman" w:hAnsi="Times New Roman" w:cs="Times New Roman"/>
-          <w:sz w:val="24"/>
-          <w:szCs w:val="24"/>
-        </w:rPr>
-        <w:t xml:space="preserve"> methods frequently ignore the potential insights that may arise from concurrently understanding user segments and the associative linkages between material in favor of concentrating only on collaborative filtering or content-based techniques.</w:t>
+      <w:r>
+        <w:rPr>
+          <w:rFonts w:ascii="Times New Roman" w:eastAsia="Times New Roman" w:hAnsi="Times New Roman" w:cs="Times New Roman"/>
+          <w:sz w:val="24"/>
+          <w:szCs w:val="24"/>
+        </w:rPr>
+        <w:t>The majority of recommendation systems currently in use exhibit a separated approach, applying various analytical techniques separately and failing to recognize the potential synergistic benefits of integrating them.Traditional methods frequently ignore the potential insights that may arise from concurrently understanding user segments and the associative linkages between material in favor of concentrating only on collaborative filtering or content-based techniques.</w:t>
       </w:r>
     </w:p>
     <w:p>
@@ -584,25 +400,7 @@
           <w:sz w:val="24"/>
           <w:szCs w:val="24"/>
         </w:rPr>
-        <w:t>The main goal of this project is to develop a comprehensive machine learning-based system that effectively combines the advantages of K-</w:t>
-      </w:r>
-      <w:proofErr w:type="gramStart"/>
-      <w:r>
-        <w:rPr>
-          <w:rFonts w:ascii="Times New Roman" w:eastAsia="Times New Roman" w:hAnsi="Times New Roman" w:cs="Times New Roman"/>
-          <w:sz w:val="24"/>
-          <w:szCs w:val="24"/>
-        </w:rPr>
-        <w:t>Modes</w:t>
-      </w:r>
-      <w:proofErr w:type="gramEnd"/>
-      <w:r>
-        <w:rPr>
-          <w:rFonts w:ascii="Times New Roman" w:eastAsia="Times New Roman" w:hAnsi="Times New Roman" w:cs="Times New Roman"/>
-          <w:sz w:val="24"/>
-          <w:szCs w:val="24"/>
-        </w:rPr>
-        <w:t xml:space="preserve"> clustering and association rule mining for </w:t>
+        <w:t xml:space="preserve">The main goal of this project is to develop a comprehensive machine learning-based system that effectively combines the advantages of K-Modes clustering and association rule mining for </w:t>
       </w:r>
       <w:r>
         <w:rPr>
@@ -630,62 +428,26 @@
           <w:sz w:val="24"/>
           <w:szCs w:val="24"/>
         </w:rPr>
-        <w:t xml:space="preserve">There is a theoretical and practical aspect to the research aim. Theoretically, we wish to further </w:t>
-      </w:r>
-      <w:proofErr w:type="gramStart"/>
-      <w:r>
-        <w:rPr>
-          <w:rFonts w:ascii="Times New Roman" w:eastAsia="Times New Roman" w:hAnsi="Times New Roman" w:cs="Times New Roman"/>
-          <w:sz w:val="24"/>
-          <w:szCs w:val="24"/>
-        </w:rPr>
-        <w:t>understanding</w:t>
-      </w:r>
-      <w:proofErr w:type="gramEnd"/>
-      <w:r>
-        <w:rPr>
-          <w:rFonts w:ascii="Times New Roman" w:eastAsia="Times New Roman" w:hAnsi="Times New Roman" w:cs="Times New Roman"/>
-          <w:sz w:val="24"/>
-          <w:szCs w:val="24"/>
-        </w:rPr>
-        <w:t xml:space="preserve"> of how various unsupervised learning methods can be integrated to uncover knowledge that neither method could alone. This includes discussing the promise and challenges of combining association analysis and clustering, specifically for the scenario of entertainment data with some variations from typical retail datasets. From a practical perspective, the goal is to develop a system that streaming services, content producers, and other stakeholders in the entertainment ecosystem can easily implement to assist in their content strategy and recommendation engines. This pragmatic focus ensures that the study advances both academic knowledge and real-world applications that improve user experience and business outcomes.</w:t>
-      </w:r>
-    </w:p>
-    <w:p>
-      <w:pPr>
-        <w:spacing w:before="240" w:after="240" w:line="360" w:lineRule="auto"/>
-        <w:jc w:val="both"/>
-        <w:rPr>
-          <w:rFonts w:ascii="Times New Roman" w:eastAsia="Times New Roman" w:hAnsi="Times New Roman" w:cs="Times New Roman"/>
-          <w:sz w:val="24"/>
-          <w:szCs w:val="24"/>
-        </w:rPr>
-      </w:pPr>
-      <w:r>
-        <w:rPr>
-          <w:rFonts w:ascii="Times New Roman" w:eastAsia="Times New Roman" w:hAnsi="Times New Roman" w:cs="Times New Roman"/>
-          <w:sz w:val="24"/>
-          <w:szCs w:val="24"/>
-        </w:rPr>
-        <w:t xml:space="preserve">The framework development process </w:t>
-      </w:r>
-      <w:proofErr w:type="gramStart"/>
-      <w:r>
-        <w:rPr>
-          <w:rFonts w:ascii="Times New Roman" w:eastAsia="Times New Roman" w:hAnsi="Times New Roman" w:cs="Times New Roman"/>
-          <w:sz w:val="24"/>
-          <w:szCs w:val="24"/>
-        </w:rPr>
-        <w:t>takes into account</w:t>
-      </w:r>
-      <w:proofErr w:type="gramEnd"/>
-      <w:r>
-        <w:rPr>
-          <w:rFonts w:ascii="Times New Roman" w:eastAsia="Times New Roman" w:hAnsi="Times New Roman" w:cs="Times New Roman"/>
-          <w:sz w:val="24"/>
-          <w:szCs w:val="24"/>
-        </w:rPr>
-        <w:t xml:space="preserve"> factors like scalability, interpretability, and adaptability to different types of entertainment data. The objective is to create a solution that can handle the volume of contemporary streaming services while providing content strategists and decision-makers with results that are both statistically significant and practically useful.</w:t>
+        <w:t>There is a theoretical and practical aspect to the research aim. Theoretically, we wish to further understanding of how various unsupervised learning methods can be integrated to uncover knowledge that neither method could alone. This includes discussing the promise and challenges of combining association analysis and clustering, specifically for the scenario of entertainment data with some variations from typical retail datasets. From a practical perspective, the goal is to develop a system that streaming services, content producers, and other stakeholders in the entertainment ecosystem can easily implement to assist in their content strategy and recommendation engines. This pragmatic focus ensures that the study advances both academic knowledge and real-world applications that improve user experience and business outcomes.</w:t>
+      </w:r>
+    </w:p>
+    <w:p>
+      <w:pPr>
+        <w:spacing w:before="240" w:after="240" w:line="360" w:lineRule="auto"/>
+        <w:jc w:val="both"/>
+        <w:rPr>
+          <w:rFonts w:ascii="Times New Roman" w:eastAsia="Times New Roman" w:hAnsi="Times New Roman" w:cs="Times New Roman"/>
+          <w:sz w:val="24"/>
+          <w:szCs w:val="24"/>
+        </w:rPr>
+      </w:pPr>
+      <w:r>
+        <w:rPr>
+          <w:rFonts w:ascii="Times New Roman" w:eastAsia="Times New Roman" w:hAnsi="Times New Roman" w:cs="Times New Roman"/>
+          <w:sz w:val="24"/>
+          <w:szCs w:val="24"/>
+        </w:rPr>
+        <w:t>The framework development process takes into account factors like scalability, interpretability, and adaptability to different types of entertainment data. The objective is to create a solution that can handle the volume of contemporary streaming services while providing content strategists and decision-makers with results that are both statistically significant and practically useful.</w:t>
       </w:r>
     </w:p>
     <w:p>
@@ -760,80 +522,26 @@
           <w:sz w:val="24"/>
           <w:szCs w:val="24"/>
         </w:rPr>
-        <w:t xml:space="preserve"> How effectively can K-</w:t>
-      </w:r>
-      <w:proofErr w:type="gramStart"/>
-      <w:r>
-        <w:rPr>
-          <w:rFonts w:ascii="Times New Roman" w:eastAsia="Times New Roman" w:hAnsi="Times New Roman" w:cs="Times New Roman"/>
-          <w:sz w:val="24"/>
-          <w:szCs w:val="24"/>
-        </w:rPr>
-        <w:t>Modes</w:t>
-      </w:r>
-      <w:proofErr w:type="gramEnd"/>
-      <w:r>
-        <w:rPr>
-          <w:rFonts w:ascii="Times New Roman" w:eastAsia="Times New Roman" w:hAnsi="Times New Roman" w:cs="Times New Roman"/>
-          <w:sz w:val="24"/>
-          <w:szCs w:val="24"/>
-        </w:rPr>
-        <w:t xml:space="preserve"> clustering segment </w:t>
-      </w:r>
-      <w:proofErr w:type="spellStart"/>
-      <w:r>
-        <w:rPr>
-          <w:rFonts w:ascii="Times New Roman" w:eastAsia="Times New Roman" w:hAnsi="Times New Roman" w:cs="Times New Roman"/>
-          <w:sz w:val="24"/>
-          <w:szCs w:val="24"/>
-        </w:rPr>
-        <w:t>MovieLens</w:t>
-      </w:r>
-      <w:proofErr w:type="spellEnd"/>
-      <w:r>
-        <w:rPr>
-          <w:rFonts w:ascii="Times New Roman" w:eastAsia="Times New Roman" w:hAnsi="Times New Roman" w:cs="Times New Roman"/>
-          <w:sz w:val="24"/>
-          <w:szCs w:val="24"/>
-        </w:rPr>
-        <w:t xml:space="preserve"> users based on categorical features like genre preferences or tagging patterns?</w:t>
-      </w:r>
-    </w:p>
-    <w:p>
-      <w:pPr>
-        <w:spacing w:before="240" w:after="240" w:line="360" w:lineRule="auto"/>
-        <w:jc w:val="both"/>
-        <w:rPr>
-          <w:rFonts w:ascii="Times New Roman" w:eastAsia="Times New Roman" w:hAnsi="Times New Roman" w:cs="Times New Roman"/>
-          <w:sz w:val="24"/>
-          <w:szCs w:val="24"/>
-        </w:rPr>
-      </w:pPr>
-      <w:r>
-        <w:rPr>
-          <w:rFonts w:ascii="Times New Roman" w:eastAsia="Times New Roman" w:hAnsi="Times New Roman" w:cs="Times New Roman"/>
-          <w:sz w:val="24"/>
-          <w:szCs w:val="24"/>
-        </w:rPr>
-        <w:t>This question addresses the fundamental challenge of user segmentation in entertainment contexts. Unlike traditional retail scenarios where customer segments might be defined by demographic characteristics or purchase history, entertainment preferences involve complex psychological and cultural factors that manifest through viewing patterns, rating behaviors, and tagging activities. The effectiveness of K-</w:t>
-      </w:r>
-      <w:proofErr w:type="gramStart"/>
-      <w:r>
-        <w:rPr>
-          <w:rFonts w:ascii="Times New Roman" w:eastAsia="Times New Roman" w:hAnsi="Times New Roman" w:cs="Times New Roman"/>
-          <w:sz w:val="24"/>
-          <w:szCs w:val="24"/>
-        </w:rPr>
-        <w:t>Modes</w:t>
-      </w:r>
-      <w:proofErr w:type="gramEnd"/>
-      <w:r>
-        <w:rPr>
-          <w:rFonts w:ascii="Times New Roman" w:eastAsia="Times New Roman" w:hAnsi="Times New Roman" w:cs="Times New Roman"/>
-          <w:sz w:val="24"/>
-          <w:szCs w:val="24"/>
-        </w:rPr>
-        <w:t xml:space="preserve"> clustering in this context depends on its ability to identify meaningful patterns in these categorical behaviors that translate into actionable user segments.</w:t>
+        <w:t xml:space="preserve"> How effectively can K-Modes clustering segment MovieLens users based on categorical features like genre preferences or tagging patterns?</w:t>
+      </w:r>
+    </w:p>
+    <w:p>
+      <w:pPr>
+        <w:spacing w:before="240" w:after="240" w:line="360" w:lineRule="auto"/>
+        <w:jc w:val="both"/>
+        <w:rPr>
+          <w:rFonts w:ascii="Times New Roman" w:eastAsia="Times New Roman" w:hAnsi="Times New Roman" w:cs="Times New Roman"/>
+          <w:sz w:val="24"/>
+          <w:szCs w:val="24"/>
+        </w:rPr>
+      </w:pPr>
+      <w:r>
+        <w:rPr>
+          <w:rFonts w:ascii="Times New Roman" w:eastAsia="Times New Roman" w:hAnsi="Times New Roman" w:cs="Times New Roman"/>
+          <w:sz w:val="24"/>
+          <w:szCs w:val="24"/>
+        </w:rPr>
+        <w:t>This question addresses the fundamental challenge of user segmentation in entertainment contexts. Unlike traditional retail scenarios where customer segments might be defined by demographic characteristics or purchase history, entertainment preferences involve complex psychological and cultural factors that manifest through viewing patterns, rating behaviors, and tagging activities. The effectiveness of K-Modes clustering in this context depends on its ability to identify meaningful patterns in these categorical behaviors that translate into actionable user segments.</w:t>
       </w:r>
     </w:p>
     <w:p>
@@ -1022,25 +730,7 @@
           <w:sz w:val="24"/>
           <w:szCs w:val="24"/>
         </w:rPr>
-        <w:t xml:space="preserve"> The combined use of K-</w:t>
-      </w:r>
-      <w:proofErr w:type="gramStart"/>
-      <w:r>
-        <w:rPr>
-          <w:rFonts w:ascii="Times New Roman" w:eastAsia="Times New Roman" w:hAnsi="Times New Roman" w:cs="Times New Roman"/>
-          <w:sz w:val="24"/>
-          <w:szCs w:val="24"/>
-        </w:rPr>
-        <w:t>Modes</w:t>
-      </w:r>
-      <w:proofErr w:type="gramEnd"/>
-      <w:r>
-        <w:rPr>
-          <w:rFonts w:ascii="Times New Roman" w:eastAsia="Times New Roman" w:hAnsi="Times New Roman" w:cs="Times New Roman"/>
-          <w:sz w:val="24"/>
-          <w:szCs w:val="24"/>
-        </w:rPr>
-        <w:t xml:space="preserve"> clustering and association rule mining will result in more nuanced and actionable insights than using either method independently.</w:t>
+        <w:t xml:space="preserve"> The combined use of K-Modes clustering and association rule mining will result in more nuanced and actionable insights than using either method independently.</w:t>
       </w:r>
     </w:p>
     <w:p>
@@ -1153,25 +843,7 @@
           <w:sz w:val="24"/>
           <w:szCs w:val="24"/>
         </w:rPr>
-        <w:t xml:space="preserve">: </w:t>
-      </w:r>
-      <w:proofErr w:type="gramStart"/>
-      <w:r>
-        <w:rPr>
-          <w:rFonts w:ascii="Times New Roman" w:eastAsia="Times New Roman" w:hAnsi="Times New Roman" w:cs="Times New Roman"/>
-          <w:sz w:val="24"/>
-          <w:szCs w:val="24"/>
-        </w:rPr>
-        <w:t>In order to</w:t>
-      </w:r>
-      <w:proofErr w:type="gramEnd"/>
-      <w:r>
-        <w:rPr>
-          <w:rFonts w:ascii="Times New Roman" w:eastAsia="Times New Roman" w:hAnsi="Times New Roman" w:cs="Times New Roman"/>
-          <w:sz w:val="24"/>
-          <w:szCs w:val="24"/>
-        </w:rPr>
-        <w:t xml:space="preserve"> conduct a comprehensive and critical review of clustering and association rule mining techniques in recommender systems, specifically entertainment and categorical data scenarios. It comprises the identification of current state-of-the-art methodologies till date, their strengths and weaknesses, and opportunities for innovation through the fusion of multiple methodologies. The review will establish the theoretical background of the research and position the recommended method in the broader research context of recommendation systems.</w:t>
+        <w:t>: In order to conduct a comprehensive and critical review of clustering and association rule mining techniques in recommender systems, specifically entertainment and categorical data scenarios. It comprises the identification of current state-of-the-art methodologies till date, their strengths and weaknesses, and opportunities for innovation through the fusion of multiple methodologies. The review will establish the theoretical background of the research and position the recommended method in the broader research context of recommendation systems.</w:t>
       </w:r>
     </w:p>
     <w:p>
@@ -1199,25 +871,7 @@
           <w:sz w:val="24"/>
           <w:szCs w:val="24"/>
         </w:rPr>
-        <w:t xml:space="preserve">To pre-process and strategically convert the </w:t>
-      </w:r>
-      <w:proofErr w:type="spellStart"/>
-      <w:r>
-        <w:rPr>
-          <w:rFonts w:ascii="Times New Roman" w:eastAsia="Times New Roman" w:hAnsi="Times New Roman" w:cs="Times New Roman"/>
-          <w:sz w:val="24"/>
-          <w:szCs w:val="24"/>
-        </w:rPr>
-        <w:t>MovieLens</w:t>
-      </w:r>
-      <w:proofErr w:type="spellEnd"/>
-      <w:r>
-        <w:rPr>
-          <w:rFonts w:ascii="Times New Roman" w:eastAsia="Times New Roman" w:hAnsi="Times New Roman" w:cs="Times New Roman"/>
-          <w:sz w:val="24"/>
-          <w:szCs w:val="24"/>
-        </w:rPr>
-        <w:t xml:space="preserve"> data to set it up for categorical analysis so that data conversions preserve helpful </w:t>
+        <w:t xml:space="preserve">To pre-process and strategically convert the MovieLens data to set it up for categorical analysis so that data conversions preserve helpful </w:t>
       </w:r>
       <w:r>
         <w:rPr>
@@ -1254,43 +908,7 @@
           <w:sz w:val="24"/>
           <w:szCs w:val="24"/>
         </w:rPr>
-        <w:t xml:space="preserve"> To implement K-</w:t>
-      </w:r>
-      <w:proofErr w:type="gramStart"/>
-      <w:r>
-        <w:rPr>
-          <w:rFonts w:ascii="Times New Roman" w:eastAsia="Times New Roman" w:hAnsi="Times New Roman" w:cs="Times New Roman"/>
-          <w:sz w:val="24"/>
-          <w:szCs w:val="24"/>
-        </w:rPr>
-        <w:t>Modes</w:t>
-      </w:r>
-      <w:proofErr w:type="gramEnd"/>
-      <w:r>
-        <w:rPr>
-          <w:rFonts w:ascii="Times New Roman" w:eastAsia="Times New Roman" w:hAnsi="Times New Roman" w:cs="Times New Roman"/>
-          <w:sz w:val="24"/>
-          <w:szCs w:val="24"/>
-        </w:rPr>
-        <w:t xml:space="preserve"> clustering so that one can identify useful user segments by genre preference and tagging behavior. This goal encompasses not only the technical application of the cluster algorithm but also the design of appropriate validation procedures, determination of optimal cluster numbers, and understanding resulting segments in terms of entertainment preference context. The goal is to produce statistically significant user segments that are also </w:t>
-      </w:r>
-      <w:proofErr w:type="gramStart"/>
-      <w:r>
-        <w:rPr>
-          <w:rFonts w:ascii="Times New Roman" w:eastAsia="Times New Roman" w:hAnsi="Times New Roman" w:cs="Times New Roman"/>
-          <w:sz w:val="24"/>
-          <w:szCs w:val="24"/>
-        </w:rPr>
-        <w:t>fairly understandable</w:t>
-      </w:r>
-      <w:proofErr w:type="gramEnd"/>
-      <w:r>
-        <w:rPr>
-          <w:rFonts w:ascii="Times New Roman" w:eastAsia="Times New Roman" w:hAnsi="Times New Roman" w:cs="Times New Roman"/>
-          <w:sz w:val="24"/>
-          <w:szCs w:val="24"/>
-        </w:rPr>
-        <w:t xml:space="preserve"> for content recommendation.</w:t>
+        <w:t xml:space="preserve"> To implement K-Modes clustering so that one can identify useful user segments by genre preference and tagging behavior. This goal encompasses not only the technical application of the cluster algorithm but also the design of appropriate validation procedures, determination of optimal cluster numbers, and understanding resulting segments in terms of entertainment preference context. The goal is to produce statistically significant user segments that are also fairly understandable for content recommendation.</w:t>
       </w:r>
     </w:p>
     <w:p>
@@ -1318,25 +936,7 @@
           <w:sz w:val="24"/>
           <w:szCs w:val="24"/>
         </w:rPr>
-        <w:t xml:space="preserve"> To apply association rule mining techniques for discovering frequent co-tag patterns and genre co-occurrence relationships in the data. The definition of a transaction, choice of support and confidence levels, and rule interpretation within </w:t>
-      </w:r>
-      <w:proofErr w:type="gramStart"/>
-      <w:r>
-        <w:rPr>
-          <w:rFonts w:ascii="Times New Roman" w:eastAsia="Times New Roman" w:hAnsi="Times New Roman" w:cs="Times New Roman"/>
-          <w:sz w:val="24"/>
-          <w:szCs w:val="24"/>
-        </w:rPr>
-        <w:t>entertainment are</w:t>
-      </w:r>
-      <w:proofErr w:type="gramEnd"/>
-      <w:r>
-        <w:rPr>
-          <w:rFonts w:ascii="Times New Roman" w:eastAsia="Times New Roman" w:hAnsi="Times New Roman" w:cs="Times New Roman"/>
-          <w:sz w:val="24"/>
-          <w:szCs w:val="24"/>
-        </w:rPr>
-        <w:t xml:space="preserve"> all need careful consideration. Instead of looking for expected relationships, determination is aimed at discovering associations that result in actionable knowledge for content suggestion and platform optimization.</w:t>
+        <w:t xml:space="preserve"> To apply association rule mining techniques for discovering frequent co-tag patterns and genre co-occurrence relationships in the data. The definition of a transaction, choice of support and confidence levels, and rule interpretation within entertainment are all need careful consideration. Instead of looking for expected relationships, determination is aimed at discovering associations that result in actionable knowledge for content suggestion and platform optimization.</w:t>
       </w:r>
     </w:p>
     <w:p>
@@ -1778,62 +1378,26 @@
           <w:sz w:val="24"/>
           <w:szCs w:val="24"/>
         </w:rPr>
-        <w:t xml:space="preserve">In the modern data-driven business planning culture, user behavior modeling has become a cornerstone of intelligent systems in almost any industry sector. The challenge isn't as much in capturing </w:t>
-      </w:r>
-      <w:proofErr w:type="gramStart"/>
-      <w:r>
-        <w:rPr>
-          <w:rFonts w:ascii="Times New Roman" w:eastAsia="Times New Roman" w:hAnsi="Times New Roman" w:cs="Times New Roman"/>
-          <w:sz w:val="24"/>
-          <w:szCs w:val="24"/>
-        </w:rPr>
-        <w:t>the behavioral</w:t>
-      </w:r>
-      <w:proofErr w:type="gramEnd"/>
-      <w:r>
-        <w:rPr>
-          <w:rFonts w:ascii="Times New Roman" w:eastAsia="Times New Roman" w:hAnsi="Times New Roman" w:cs="Times New Roman"/>
-          <w:sz w:val="24"/>
-          <w:szCs w:val="24"/>
-        </w:rPr>
-        <w:t xml:space="preserve"> data, but in developing analytics processes that are capable of drawing meaningful, actionable insights from the complexity of the user interaction patterns. This challenge is particularly severe in entertainment and content recommendation use cases, where user preferences are personal and multifaceted.</w:t>
-      </w:r>
-    </w:p>
-    <w:p>
-      <w:pPr>
-        <w:spacing w:before="240" w:after="240" w:line="360" w:lineRule="auto"/>
-        <w:jc w:val="both"/>
-        <w:rPr>
-          <w:rFonts w:ascii="Times New Roman" w:eastAsia="Times New Roman" w:hAnsi="Times New Roman" w:cs="Times New Roman"/>
-          <w:sz w:val="24"/>
-          <w:szCs w:val="24"/>
-        </w:rPr>
-      </w:pPr>
-      <w:r>
-        <w:rPr>
-          <w:rFonts w:ascii="Times New Roman" w:eastAsia="Times New Roman" w:hAnsi="Times New Roman" w:cs="Times New Roman"/>
-          <w:sz w:val="24"/>
-          <w:szCs w:val="24"/>
-        </w:rPr>
-        <w:t xml:space="preserve">Two have been particularly robust approaches in this tool set: clustering, where users or items can be discerned and grouped based on affinities, and association rule mining, where underlying patterns of co-occurrence and relationship in behavior are uncovered from data. Not only is the robustness of each such that what each can accomplish individually, but also in how much greater magnitude their insights become by being </w:t>
-      </w:r>
-      <w:proofErr w:type="gramStart"/>
-      <w:r>
-        <w:rPr>
-          <w:rFonts w:ascii="Times New Roman" w:eastAsia="Times New Roman" w:hAnsi="Times New Roman" w:cs="Times New Roman"/>
-          <w:sz w:val="24"/>
-          <w:szCs w:val="24"/>
-        </w:rPr>
-        <w:t>merged together</w:t>
-      </w:r>
-      <w:proofErr w:type="gramEnd"/>
-      <w:r>
-        <w:rPr>
-          <w:rFonts w:ascii="Times New Roman" w:eastAsia="Times New Roman" w:hAnsi="Times New Roman" w:cs="Times New Roman"/>
-          <w:sz w:val="24"/>
-          <w:szCs w:val="24"/>
-        </w:rPr>
-        <w:t>, whereby such merged insights are more than each could accomplish individually.</w:t>
+        <w:t>In the modern data-driven business planning culture, user behavior modeling has become a cornerstone of intelligent systems in almost any industry sector. The challenge isn't as much in capturing the behavioral data, but in developing analytics processes that are capable of drawing meaningful, actionable insights from the complexity of the user interaction patterns. This challenge is particularly severe in entertainment and content recommendation use cases, where user preferences are personal and multifaceted.</w:t>
+      </w:r>
+    </w:p>
+    <w:p>
+      <w:pPr>
+        <w:spacing w:before="240" w:after="240" w:line="360" w:lineRule="auto"/>
+        <w:jc w:val="both"/>
+        <w:rPr>
+          <w:rFonts w:ascii="Times New Roman" w:eastAsia="Times New Roman" w:hAnsi="Times New Roman" w:cs="Times New Roman"/>
+          <w:sz w:val="24"/>
+          <w:szCs w:val="24"/>
+        </w:rPr>
+      </w:pPr>
+      <w:r>
+        <w:rPr>
+          <w:rFonts w:ascii="Times New Roman" w:eastAsia="Times New Roman" w:hAnsi="Times New Roman" w:cs="Times New Roman"/>
+          <w:sz w:val="24"/>
+          <w:szCs w:val="24"/>
+        </w:rPr>
+        <w:t>Two have been particularly robust approaches in this tool set: clustering, where users or items can be discerned and grouped based on affinities, and association rule mining, where underlying patterns of co-occurrence and relationship in behavior are uncovered from data. Not only is the robustness of each such that what each can accomplish individually, but also in how much greater magnitude their insights become by being merged together, whereby such merged insights are more than each could accomplish individually.</w:t>
       </w:r>
     </w:p>
     <w:p>
@@ -1948,25 +1512,7 @@
           <w:sz w:val="24"/>
           <w:szCs w:val="24"/>
         </w:rPr>
-        <w:t xml:space="preserve">The clustering problem of categorical data has been a fundamental limitation in the application of unsupervised learning techniques to real business issues for many years. Traditional algorithms such as K-Means, while solid and generally applicable, are fundamentally limited when it comes to the processing of categorical data due to their reliance on numerical distance measure considerations and mean-calculated centroids (Ahmad &amp; Dey, 2007). This limit has significant implications for regions where the most valuable behavioral data </w:t>
-      </w:r>
-      <w:proofErr w:type="gramStart"/>
-      <w:r>
-        <w:rPr>
-          <w:rFonts w:ascii="Times New Roman" w:eastAsia="Times New Roman" w:hAnsi="Times New Roman" w:cs="Times New Roman"/>
-          <w:sz w:val="24"/>
-          <w:szCs w:val="24"/>
-        </w:rPr>
-        <w:t>exist</w:t>
-      </w:r>
-      <w:proofErr w:type="gramEnd"/>
-      <w:r>
-        <w:rPr>
-          <w:rFonts w:ascii="Times New Roman" w:eastAsia="Times New Roman" w:hAnsi="Times New Roman" w:cs="Times New Roman"/>
-          <w:sz w:val="24"/>
-          <w:szCs w:val="24"/>
-        </w:rPr>
-        <w:t xml:space="preserve"> in categorical forms, such as entertainment interests, buying categories, or social media engagement patterns.</w:t>
+        <w:t>The clustering problem of categorical data has been a fundamental limitation in the application of unsupervised learning techniques to real business issues for many years. Traditional algorithms such as K-Means, while solid and generally applicable, are fundamentally limited when it comes to the processing of categorical data due to their reliance on numerical distance measure considerations and mean-calculated centroids (Ahmad &amp; Dey, 2007). This limit has significant implications for regions where the most valuable behavioral data exist in categorical forms, such as entertainment interests, buying categories, or social media engagement patterns.</w:t>
       </w:r>
     </w:p>
     <w:p>
@@ -2070,153 +1616,45 @@
           <w:sz w:val="24"/>
           <w:szCs w:val="24"/>
         </w:rPr>
-        <w:t>Recent advances in K-</w:t>
-      </w:r>
-      <w:proofErr w:type="gramStart"/>
-      <w:r>
-        <w:rPr>
-          <w:rFonts w:ascii="Times New Roman" w:eastAsia="Times New Roman" w:hAnsi="Times New Roman" w:cs="Times New Roman"/>
-          <w:sz w:val="24"/>
-          <w:szCs w:val="24"/>
-        </w:rPr>
-        <w:t>Modes</w:t>
-      </w:r>
-      <w:proofErr w:type="gramEnd"/>
-      <w:r>
-        <w:rPr>
-          <w:rFonts w:ascii="Times New Roman" w:eastAsia="Times New Roman" w:hAnsi="Times New Roman" w:cs="Times New Roman"/>
-          <w:sz w:val="24"/>
-          <w:szCs w:val="24"/>
-        </w:rPr>
-        <w:t xml:space="preserve"> implementation continued to enhance its application to modern data problems. Dinh et al. (2025) further applied the use of K-Modes to enable scalable high-dimensional categorical data clustering, which addressed one of the basic issues that previously restricted its application to small datasets. The advancement now places the algorithm for large-scale application such </w:t>
-      </w:r>
-      <w:proofErr w:type="gramStart"/>
-      <w:r>
-        <w:rPr>
-          <w:rFonts w:ascii="Times New Roman" w:eastAsia="Times New Roman" w:hAnsi="Times New Roman" w:cs="Times New Roman"/>
-          <w:sz w:val="24"/>
-          <w:szCs w:val="24"/>
-        </w:rPr>
-        <w:t>as in</w:t>
-      </w:r>
-      <w:proofErr w:type="gramEnd"/>
-      <w:r>
-        <w:rPr>
-          <w:rFonts w:ascii="Times New Roman" w:eastAsia="Times New Roman" w:hAnsi="Times New Roman" w:cs="Times New Roman"/>
-          <w:sz w:val="24"/>
-          <w:szCs w:val="24"/>
-        </w:rPr>
-        <w:t xml:space="preserve"> </w:t>
-      </w:r>
-      <w:proofErr w:type="spellStart"/>
-      <w:r>
-        <w:rPr>
-          <w:rFonts w:ascii="Times New Roman" w:eastAsia="Times New Roman" w:hAnsi="Times New Roman" w:cs="Times New Roman"/>
-          <w:sz w:val="24"/>
-          <w:szCs w:val="24"/>
-        </w:rPr>
-        <w:t>MovieLens</w:t>
-      </w:r>
-      <w:proofErr w:type="spellEnd"/>
-      <w:r>
-        <w:rPr>
-          <w:rFonts w:ascii="Times New Roman" w:eastAsia="Times New Roman" w:hAnsi="Times New Roman" w:cs="Times New Roman"/>
-          <w:sz w:val="24"/>
-          <w:szCs w:val="24"/>
-        </w:rPr>
-        <w:t xml:space="preserve"> analysis, where genre and tag data dimension may be high and dataset size requires optimal utilization of resources.</w:t>
-      </w:r>
-    </w:p>
-    <w:p>
-      <w:pPr>
-        <w:spacing w:before="240" w:after="240" w:line="360" w:lineRule="auto"/>
-        <w:jc w:val="both"/>
-        <w:rPr>
-          <w:rFonts w:ascii="Times New Roman" w:eastAsia="Times New Roman" w:hAnsi="Times New Roman" w:cs="Times New Roman"/>
-          <w:sz w:val="24"/>
-          <w:szCs w:val="24"/>
-        </w:rPr>
-      </w:pPr>
-      <w:r>
-        <w:rPr>
-          <w:rFonts w:ascii="Times New Roman" w:eastAsia="Times New Roman" w:hAnsi="Times New Roman" w:cs="Times New Roman"/>
-          <w:sz w:val="24"/>
-          <w:szCs w:val="24"/>
-        </w:rPr>
-        <w:t>The scalability improvements are a critical step towards real-world usage because modern entertainment devices and e-commerce platforms generate categorical behavioral data on previously unimaginable scales. Being able to process such data using K-</w:t>
-      </w:r>
-      <w:proofErr w:type="gramStart"/>
-      <w:r>
-        <w:rPr>
-          <w:rFonts w:ascii="Times New Roman" w:eastAsia="Times New Roman" w:hAnsi="Times New Roman" w:cs="Times New Roman"/>
-          <w:sz w:val="24"/>
-          <w:szCs w:val="24"/>
-        </w:rPr>
-        <w:t>Modes</w:t>
-      </w:r>
-      <w:proofErr w:type="gramEnd"/>
-      <w:r>
-        <w:rPr>
-          <w:rFonts w:ascii="Times New Roman" w:eastAsia="Times New Roman" w:hAnsi="Times New Roman" w:cs="Times New Roman"/>
-          <w:sz w:val="24"/>
-          <w:szCs w:val="24"/>
-        </w:rPr>
-        <w:t xml:space="preserve"> clustering in computationally efficient terms </w:t>
-      </w:r>
-      <w:proofErr w:type="gramStart"/>
-      <w:r>
-        <w:rPr>
-          <w:rFonts w:ascii="Times New Roman" w:eastAsia="Times New Roman" w:hAnsi="Times New Roman" w:cs="Times New Roman"/>
-          <w:sz w:val="24"/>
-          <w:szCs w:val="24"/>
-        </w:rPr>
-        <w:t>opens up</w:t>
-      </w:r>
-      <w:proofErr w:type="gramEnd"/>
-      <w:r>
-        <w:rPr>
-          <w:rFonts w:ascii="Times New Roman" w:eastAsia="Times New Roman" w:hAnsi="Times New Roman" w:cs="Times New Roman"/>
-          <w:sz w:val="24"/>
-          <w:szCs w:val="24"/>
-        </w:rPr>
-        <w:t xml:space="preserve"> new avenues for real-time behavioral analysis and dynamic user segmentation.</w:t>
-      </w:r>
-    </w:p>
-    <w:p>
-      <w:pPr>
-        <w:spacing w:before="240" w:after="240" w:line="360" w:lineRule="auto"/>
-        <w:jc w:val="both"/>
-        <w:rPr>
-          <w:rFonts w:ascii="Times New Roman" w:eastAsia="Times New Roman" w:hAnsi="Times New Roman" w:cs="Times New Roman"/>
-          <w:sz w:val="24"/>
-          <w:szCs w:val="24"/>
-        </w:rPr>
-      </w:pPr>
-      <w:r>
-        <w:rPr>
-          <w:rFonts w:ascii="Times New Roman" w:eastAsia="Times New Roman" w:hAnsi="Times New Roman" w:cs="Times New Roman"/>
-          <w:sz w:val="24"/>
-          <w:szCs w:val="24"/>
-        </w:rPr>
-        <w:t xml:space="preserve">Thapaliya and Zhuang (2025) have similarly extended K-Modes to accommodate big data environments through the suggestion of faster initialization techniques as well as enhanced algorithm convergence patterns. The breakthroughs are in direct response to practical problems of computation efficiency without compromising the algorithm's performance in identifying useful categorical patterns. to make K-Modes an established, scalable categorical clustering method that can service the requirements of modern data analytics applications. Such maturity makes the algorithm particularly well-suited for entertainment data analysis, where categorical fields such as genre preferences, tagging habits, and content interaction patterns are the prime </w:t>
-      </w:r>
-      <w:proofErr w:type="gramStart"/>
-      <w:r>
-        <w:rPr>
-          <w:rFonts w:ascii="Times New Roman" w:eastAsia="Times New Roman" w:hAnsi="Times New Roman" w:cs="Times New Roman"/>
-          <w:sz w:val="24"/>
-          <w:szCs w:val="24"/>
-        </w:rPr>
-        <w:t>wellsprings</w:t>
-      </w:r>
-      <w:proofErr w:type="gramEnd"/>
-      <w:r>
-        <w:rPr>
-          <w:rFonts w:ascii="Times New Roman" w:eastAsia="Times New Roman" w:hAnsi="Times New Roman" w:cs="Times New Roman"/>
-          <w:sz w:val="24"/>
-          <w:szCs w:val="24"/>
-        </w:rPr>
-        <w:t xml:space="preserve"> of behavioral information.</w:t>
+        <w:t>Recent advances in K-Modes implementation continued to enhance its application to modern data problems. Dinh et al. (2025) further applied the use of K-Modes to enable scalable high-dimensional categorical data clustering, which addressed one of the basic issues that previously restricted its application to small datasets. The advancement now places the algorithm for large-scale application such as in MovieLens analysis, where genre and tag data dimension may be high and dataset size requires optimal utilization of resources.</w:t>
+      </w:r>
+    </w:p>
+    <w:p>
+      <w:pPr>
+        <w:spacing w:before="240" w:after="240" w:line="360" w:lineRule="auto"/>
+        <w:jc w:val="both"/>
+        <w:rPr>
+          <w:rFonts w:ascii="Times New Roman" w:eastAsia="Times New Roman" w:hAnsi="Times New Roman" w:cs="Times New Roman"/>
+          <w:sz w:val="24"/>
+          <w:szCs w:val="24"/>
+        </w:rPr>
+      </w:pPr>
+      <w:r>
+        <w:rPr>
+          <w:rFonts w:ascii="Times New Roman" w:eastAsia="Times New Roman" w:hAnsi="Times New Roman" w:cs="Times New Roman"/>
+          <w:sz w:val="24"/>
+          <w:szCs w:val="24"/>
+        </w:rPr>
+        <w:t>The scalability improvements are a critical step towards real-world usage because modern entertainment devices and e-commerce platforms generate categorical behavioral data on previously unimaginable scales. Being able to process such data using K-Modes clustering in computationally efficient terms opens up new avenues for real-time behavioral analysis and dynamic user segmentation.</w:t>
+      </w:r>
+    </w:p>
+    <w:p>
+      <w:pPr>
+        <w:spacing w:before="240" w:after="240" w:line="360" w:lineRule="auto"/>
+        <w:jc w:val="both"/>
+        <w:rPr>
+          <w:rFonts w:ascii="Times New Roman" w:eastAsia="Times New Roman" w:hAnsi="Times New Roman" w:cs="Times New Roman"/>
+          <w:sz w:val="24"/>
+          <w:szCs w:val="24"/>
+        </w:rPr>
+      </w:pPr>
+      <w:r>
+        <w:rPr>
+          <w:rFonts w:ascii="Times New Roman" w:eastAsia="Times New Roman" w:hAnsi="Times New Roman" w:cs="Times New Roman"/>
+          <w:sz w:val="24"/>
+          <w:szCs w:val="24"/>
+        </w:rPr>
+        <w:t>Thapaliya and Zhuang (2025) have similarly extended K-Modes to accommodate big data environments through the suggestion of faster initialization techniques as well as enhanced algorithm convergence patterns. The breakthroughs are in direct response to practical problems of computation efficiency without compromising the algorithm's performance in identifying useful categorical patterns. to make K-Modes an established, scalable categorical clustering method that can service the requirements of modern data analytics applications. Such maturity makes the algorithm particularly well-suited for entertainment data analysis, where categorical fields such as genre preferences, tagging habits, and content interaction patterns are the prime wellsprings of behavioral information.</w:t>
       </w:r>
     </w:p>
     <w:p>
@@ -2310,25 +1748,7 @@
           <w:sz w:val="24"/>
           <w:szCs w:val="24"/>
         </w:rPr>
-        <w:t xml:space="preserve">Mathematical underpinnings of association rule mining provide a robust framework for pattern finding based on important metrics like support, confidence, and lift. Support identifies the frequency of occurrence of an itemset in the dataset, which reflects the frequency of occurrence of a specific set of items in all transactions. Confidence estimates the chance that a consequent item would be purchased when the antecedent items are already purchased, providing information on how strong the item association is. Lift estimates the ratio by which the consequent is more probable to be purchased when the antecedent exists than its base rate probability, which helps distinguish </w:t>
-      </w:r>
-      <w:proofErr w:type="gramStart"/>
-      <w:r>
-        <w:rPr>
-          <w:rFonts w:ascii="Times New Roman" w:eastAsia="Times New Roman" w:hAnsi="Times New Roman" w:cs="Times New Roman"/>
-          <w:sz w:val="24"/>
-          <w:szCs w:val="24"/>
-        </w:rPr>
-        <w:t>among</w:t>
-      </w:r>
-      <w:proofErr w:type="gramEnd"/>
-      <w:r>
-        <w:rPr>
-          <w:rFonts w:ascii="Times New Roman" w:eastAsia="Times New Roman" w:hAnsi="Times New Roman" w:cs="Times New Roman"/>
-          <w:sz w:val="24"/>
-          <w:szCs w:val="24"/>
-        </w:rPr>
-        <w:t xml:space="preserve"> genuine associations and those that could occur at random.</w:t>
+        <w:t>Mathematical underpinnings of association rule mining provide a robust framework for pattern finding based on important metrics like support, confidence, and lift. Support identifies the frequency of occurrence of an itemset in the dataset, which reflects the frequency of occurrence of a specific set of items in all transactions. Confidence estimates the chance that a consequent item would be purchased when the antecedent items are already purchased, providing information on how strong the item association is. Lift estimates the ratio by which the consequent is more probable to be purchased when the antecedent exists than its base rate probability, which helps distinguish among genuine associations and those that could occur at random.</w:t>
       </w:r>
     </w:p>
     <w:p>
@@ -2386,173 +1806,45 @@
           <w:szCs w:val="24"/>
         </w:rPr>
         <w:lastRenderedPageBreak/>
-        <w:t xml:space="preserve">Two of the most widespread algorithms that are the default procedures used to mine frequent </w:t>
-      </w:r>
-      <w:proofErr w:type="spellStart"/>
-      <w:r>
-        <w:rPr>
-          <w:rFonts w:ascii="Times New Roman" w:eastAsia="Times New Roman" w:hAnsi="Times New Roman" w:cs="Times New Roman"/>
-          <w:sz w:val="24"/>
-          <w:szCs w:val="24"/>
-        </w:rPr>
-        <w:t>itemsets</w:t>
-      </w:r>
-      <w:proofErr w:type="spellEnd"/>
-      <w:r>
-        <w:rPr>
-          <w:rFonts w:ascii="Times New Roman" w:eastAsia="Times New Roman" w:hAnsi="Times New Roman" w:cs="Times New Roman"/>
-          <w:sz w:val="24"/>
-          <w:szCs w:val="24"/>
-        </w:rPr>
-        <w:t xml:space="preserve"> and discover association rules are </w:t>
-      </w:r>
-      <w:proofErr w:type="spellStart"/>
-      <w:r>
-        <w:rPr>
-          <w:rFonts w:ascii="Times New Roman" w:eastAsia="Times New Roman" w:hAnsi="Times New Roman" w:cs="Times New Roman"/>
-          <w:sz w:val="24"/>
-          <w:szCs w:val="24"/>
-        </w:rPr>
-        <w:t>Apriori</w:t>
-      </w:r>
-      <w:proofErr w:type="spellEnd"/>
-      <w:r>
-        <w:rPr>
-          <w:rFonts w:ascii="Times New Roman" w:eastAsia="Times New Roman" w:hAnsi="Times New Roman" w:cs="Times New Roman"/>
-          <w:sz w:val="24"/>
-          <w:szCs w:val="24"/>
-        </w:rPr>
-        <w:t xml:space="preserve"> and FP-Growth. The two algorithms vary in computational approach and efficiency features but have the general goal of discovering patterns that pass thresholds in support, confidence, and lift (Tan et al., 2019). Decisions between the two usually reside in the properties of the dataset, computational power available, and needs of analysis.</w:t>
-      </w:r>
-    </w:p>
-    <w:p>
-      <w:pPr>
-        <w:spacing w:before="240" w:after="240" w:line="360" w:lineRule="auto"/>
-        <w:jc w:val="both"/>
-        <w:rPr>
-          <w:rFonts w:ascii="Times New Roman" w:eastAsia="Times New Roman" w:hAnsi="Times New Roman" w:cs="Times New Roman"/>
-          <w:sz w:val="24"/>
-          <w:szCs w:val="24"/>
-        </w:rPr>
-      </w:pPr>
-      <w:proofErr w:type="spellStart"/>
-      <w:r>
-        <w:rPr>
-          <w:rFonts w:ascii="Times New Roman" w:eastAsia="Times New Roman" w:hAnsi="Times New Roman" w:cs="Times New Roman"/>
-          <w:sz w:val="24"/>
-          <w:szCs w:val="24"/>
-        </w:rPr>
-        <w:t>Apriori</w:t>
-      </w:r>
-      <w:proofErr w:type="spellEnd"/>
-      <w:r>
-        <w:rPr>
-          <w:rFonts w:ascii="Times New Roman" w:eastAsia="Times New Roman" w:hAnsi="Times New Roman" w:cs="Times New Roman"/>
-          <w:sz w:val="24"/>
-          <w:szCs w:val="24"/>
-        </w:rPr>
-        <w:t xml:space="preserve"> has a level-wise approach, generating larger frequent </w:t>
-      </w:r>
-      <w:proofErr w:type="spellStart"/>
-      <w:r>
-        <w:rPr>
-          <w:rFonts w:ascii="Times New Roman" w:eastAsia="Times New Roman" w:hAnsi="Times New Roman" w:cs="Times New Roman"/>
-          <w:sz w:val="24"/>
-          <w:szCs w:val="24"/>
-        </w:rPr>
-        <w:t>itemsets</w:t>
-      </w:r>
-      <w:proofErr w:type="spellEnd"/>
-      <w:r>
-        <w:rPr>
-          <w:rFonts w:ascii="Times New Roman" w:eastAsia="Times New Roman" w:hAnsi="Times New Roman" w:cs="Times New Roman"/>
-          <w:sz w:val="24"/>
-          <w:szCs w:val="24"/>
-        </w:rPr>
-        <w:t xml:space="preserve"> by growing smaller frequent </w:t>
-      </w:r>
-      <w:proofErr w:type="spellStart"/>
-      <w:r>
-        <w:rPr>
-          <w:rFonts w:ascii="Times New Roman" w:eastAsia="Times New Roman" w:hAnsi="Times New Roman" w:cs="Times New Roman"/>
-          <w:sz w:val="24"/>
-          <w:szCs w:val="24"/>
-        </w:rPr>
-        <w:t>itemsets</w:t>
-      </w:r>
-      <w:proofErr w:type="spellEnd"/>
-      <w:r>
-        <w:rPr>
-          <w:rFonts w:ascii="Times New Roman" w:eastAsia="Times New Roman" w:hAnsi="Times New Roman" w:cs="Times New Roman"/>
-          <w:sz w:val="24"/>
-          <w:szCs w:val="24"/>
-        </w:rPr>
-        <w:t xml:space="preserve">. This ensures that all the frequent patterns are </w:t>
-      </w:r>
-      <w:proofErr w:type="gramStart"/>
-      <w:r>
-        <w:rPr>
-          <w:rFonts w:ascii="Times New Roman" w:eastAsia="Times New Roman" w:hAnsi="Times New Roman" w:cs="Times New Roman"/>
-          <w:sz w:val="24"/>
-          <w:szCs w:val="24"/>
-        </w:rPr>
-        <w:t>discovered, but</w:t>
-      </w:r>
-      <w:proofErr w:type="gramEnd"/>
-      <w:r>
-        <w:rPr>
-          <w:rFonts w:ascii="Times New Roman" w:eastAsia="Times New Roman" w:hAnsi="Times New Roman" w:cs="Times New Roman"/>
-          <w:sz w:val="24"/>
-          <w:szCs w:val="24"/>
-        </w:rPr>
-        <w:t xml:space="preserve"> could be computationally costly for large datasets with high item counts. FP-Growth reduces some of these computational burdens by using a space-efficient data structure called an FP-tree to hold the dataset, enabling more compact pattern discovery for large datasets.</w:t>
-      </w:r>
-    </w:p>
-    <w:p>
-      <w:pPr>
-        <w:spacing w:before="240" w:after="240" w:line="360" w:lineRule="auto"/>
-        <w:jc w:val="both"/>
-        <w:rPr>
-          <w:rFonts w:ascii="Times New Roman" w:eastAsia="Times New Roman" w:hAnsi="Times New Roman" w:cs="Times New Roman"/>
-          <w:sz w:val="24"/>
-          <w:szCs w:val="24"/>
-        </w:rPr>
-      </w:pPr>
-      <w:proofErr w:type="gramStart"/>
-      <w:r>
-        <w:rPr>
-          <w:rFonts w:ascii="Times New Roman" w:eastAsia="Times New Roman" w:hAnsi="Times New Roman" w:cs="Times New Roman"/>
-          <w:sz w:val="24"/>
-          <w:szCs w:val="24"/>
-        </w:rPr>
-        <w:t>Current</w:t>
-      </w:r>
-      <w:proofErr w:type="gramEnd"/>
-      <w:r>
-        <w:rPr>
-          <w:rFonts w:ascii="Times New Roman" w:eastAsia="Times New Roman" w:hAnsi="Times New Roman" w:cs="Times New Roman"/>
-          <w:sz w:val="24"/>
-          <w:szCs w:val="24"/>
-        </w:rPr>
-        <w:t xml:space="preserve"> application of ARM in entertainment contexts has highlighted its resilience in revealing novel relationships and trends. </w:t>
-      </w:r>
-      <w:proofErr w:type="spellStart"/>
-      <w:r>
-        <w:rPr>
-          <w:rFonts w:ascii="Times New Roman" w:eastAsia="Times New Roman" w:hAnsi="Times New Roman" w:cs="Times New Roman"/>
-          <w:sz w:val="24"/>
-          <w:szCs w:val="24"/>
-        </w:rPr>
-        <w:t>Hashad</w:t>
-      </w:r>
-      <w:proofErr w:type="spellEnd"/>
-      <w:r>
-        <w:rPr>
-          <w:rFonts w:ascii="Times New Roman" w:eastAsia="Times New Roman" w:hAnsi="Times New Roman" w:cs="Times New Roman"/>
-          <w:sz w:val="24"/>
-          <w:szCs w:val="24"/>
-        </w:rPr>
-        <w:t xml:space="preserve"> et al. (2024) demonstrated the resilience of ARM in revealing genre combinations and customer interests in retail contexts, demonstrating how the technique can reveal hidden associations informative to content strategy and recommendation systems. Their work demonstrates how ARM can be applied in the same way to identify movie preferences from user tags or co-ratings, proposing a foundation for learning content relationships that extend beyond simple genre tags.</w:t>
+        <w:t>Two of the most widespread algorithms that are the default procedures used to mine frequent itemsets and discover association rules are Apriori and FP-Growth. The two algorithms vary in computational approach and efficiency features but have the general goal of discovering patterns that pass thresholds in support, confidence, and lift (Tan et al., 2019). Decisions between the two usually reside in the properties of the dataset, computational power available, and needs of analysis.</w:t>
+      </w:r>
+    </w:p>
+    <w:p>
+      <w:pPr>
+        <w:spacing w:before="240" w:after="240" w:line="360" w:lineRule="auto"/>
+        <w:jc w:val="both"/>
+        <w:rPr>
+          <w:rFonts w:ascii="Times New Roman" w:eastAsia="Times New Roman" w:hAnsi="Times New Roman" w:cs="Times New Roman"/>
+          <w:sz w:val="24"/>
+          <w:szCs w:val="24"/>
+        </w:rPr>
+      </w:pPr>
+      <w:r>
+        <w:rPr>
+          <w:rFonts w:ascii="Times New Roman" w:eastAsia="Times New Roman" w:hAnsi="Times New Roman" w:cs="Times New Roman"/>
+          <w:sz w:val="24"/>
+          <w:szCs w:val="24"/>
+        </w:rPr>
+        <w:t>Apriori has a level-wise approach, generating larger frequent itemsets by growing smaller frequent itemsets. This ensures that all the frequent patterns are discovered, but could be computationally costly for large datasets with high item counts. FP-Growth reduces some of these computational burdens by using a space-efficient data structure called an FP-tree to hold the dataset, enabling more compact pattern discovery for large datasets.</w:t>
+      </w:r>
+    </w:p>
+    <w:p>
+      <w:pPr>
+        <w:spacing w:before="240" w:after="240" w:line="360" w:lineRule="auto"/>
+        <w:jc w:val="both"/>
+        <w:rPr>
+          <w:rFonts w:ascii="Times New Roman" w:eastAsia="Times New Roman" w:hAnsi="Times New Roman" w:cs="Times New Roman"/>
+          <w:sz w:val="24"/>
+          <w:szCs w:val="24"/>
+        </w:rPr>
+      </w:pPr>
+      <w:r>
+        <w:rPr>
+          <w:rFonts w:ascii="Times New Roman" w:eastAsia="Times New Roman" w:hAnsi="Times New Roman" w:cs="Times New Roman"/>
+          <w:sz w:val="24"/>
+          <w:szCs w:val="24"/>
+        </w:rPr>
+        <w:t>Current application of ARM in entertainment contexts has highlighted its resilience in revealing novel relationships and trends. Hashad et al. (2024) demonstrated the resilience of ARM in revealing genre combinations and customer interests in retail contexts, demonstrating how the technique can reveal hidden associations informative to content strategy and recommendation systems. Their work demonstrates how ARM can be applied in the same way to identify movie preferences from user tags or co-ratings, proposing a foundation for learning content relationships that extend beyond simple genre tags.</w:t>
       </w:r>
     </w:p>
     <w:p>
@@ -2665,117 +1957,45 @@
           <w:sz w:val="24"/>
           <w:szCs w:val="24"/>
         </w:rPr>
-        <w:t xml:space="preserve">This approach acknowledges the heterogeneity of most user populations and appreciates that valuable personalization requires understanding not just aggregate </w:t>
-      </w:r>
-      <w:proofErr w:type="gramStart"/>
-      <w:r>
-        <w:rPr>
-          <w:rFonts w:ascii="Times New Roman" w:eastAsia="Times New Roman" w:hAnsi="Times New Roman" w:cs="Times New Roman"/>
-          <w:sz w:val="24"/>
-          <w:szCs w:val="24"/>
-        </w:rPr>
-        <w:t>patterns  but</w:t>
-      </w:r>
-      <w:proofErr w:type="gramEnd"/>
-      <w:r>
-        <w:rPr>
-          <w:rFonts w:ascii="Times New Roman" w:eastAsia="Times New Roman" w:hAnsi="Times New Roman" w:cs="Times New Roman"/>
-          <w:sz w:val="24"/>
-          <w:szCs w:val="24"/>
-        </w:rPr>
-        <w:t xml:space="preserve"> segment-level behavior and preferences. By first identifying valuable user segments via clustering and then applying association rule mining within those segments, analysts can uncover patterns that are not just statistically significant but also meaningful in practice to specific user groups.</w:t>
-      </w:r>
-    </w:p>
-    <w:p>
-      <w:pPr>
-        <w:spacing w:before="240" w:after="240" w:line="360" w:lineRule="auto"/>
-        <w:jc w:val="both"/>
-        <w:rPr>
-          <w:rFonts w:ascii="Times New Roman" w:eastAsia="Times New Roman" w:hAnsi="Times New Roman" w:cs="Times New Roman"/>
-          <w:sz w:val="24"/>
-          <w:szCs w:val="24"/>
-        </w:rPr>
-      </w:pPr>
-      <w:r>
-        <w:rPr>
-          <w:rFonts w:ascii="Times New Roman" w:eastAsia="Times New Roman" w:hAnsi="Times New Roman" w:cs="Times New Roman"/>
-          <w:sz w:val="24"/>
-          <w:szCs w:val="24"/>
-        </w:rPr>
-        <w:t xml:space="preserve">The methodological framework for integration is typically a sequential one whereby clustering is carried out first </w:t>
-      </w:r>
-      <w:proofErr w:type="gramStart"/>
-      <w:r>
-        <w:rPr>
-          <w:rFonts w:ascii="Times New Roman" w:eastAsia="Times New Roman" w:hAnsi="Times New Roman" w:cs="Times New Roman"/>
-          <w:sz w:val="24"/>
-          <w:szCs w:val="24"/>
-        </w:rPr>
-        <w:t>in order to</w:t>
-      </w:r>
-      <w:proofErr w:type="gramEnd"/>
-      <w:r>
-        <w:rPr>
-          <w:rFonts w:ascii="Times New Roman" w:eastAsia="Times New Roman" w:hAnsi="Times New Roman" w:cs="Times New Roman"/>
-          <w:sz w:val="24"/>
-          <w:szCs w:val="24"/>
-        </w:rPr>
-        <w:t xml:space="preserve"> identify homogeneous user segments, and then association rule mining is applied within each cluster found. This is so that association rules are mined within the context in which users share similar characteristics or tastes, and therefore it will be more probable that the rules identify genuine behavior patterns rather than being artifacts of population heterogeneity.</w:t>
-      </w:r>
-    </w:p>
-    <w:p>
-      <w:pPr>
-        <w:spacing w:before="240" w:after="240" w:line="360" w:lineRule="auto"/>
-        <w:jc w:val="both"/>
-        <w:rPr>
-          <w:rFonts w:ascii="Times New Roman" w:eastAsia="Times New Roman" w:hAnsi="Times New Roman" w:cs="Times New Roman"/>
-          <w:sz w:val="24"/>
-          <w:szCs w:val="24"/>
-        </w:rPr>
-      </w:pPr>
-      <w:r>
-        <w:rPr>
-          <w:rFonts w:ascii="Times New Roman" w:eastAsia="Times New Roman" w:hAnsi="Times New Roman" w:cs="Times New Roman"/>
-          <w:sz w:val="24"/>
-          <w:szCs w:val="24"/>
-        </w:rPr>
-        <w:t xml:space="preserve">More recent research has explored the integration of </w:t>
-      </w:r>
-      <w:proofErr w:type="spellStart"/>
-      <w:r>
-        <w:rPr>
-          <w:rFonts w:ascii="Times New Roman" w:eastAsia="Times New Roman" w:hAnsi="Times New Roman" w:cs="Times New Roman"/>
-          <w:sz w:val="24"/>
-          <w:szCs w:val="24"/>
-        </w:rPr>
-        <w:t>kmodes</w:t>
-      </w:r>
-      <w:proofErr w:type="spellEnd"/>
-      <w:r>
-        <w:rPr>
-          <w:rFonts w:ascii="Times New Roman" w:eastAsia="Times New Roman" w:hAnsi="Times New Roman" w:cs="Times New Roman"/>
-          <w:sz w:val="24"/>
-          <w:szCs w:val="24"/>
-        </w:rPr>
-        <w:t xml:space="preserve"> clustering with association rule mining to analyze categorical data more effectively. </w:t>
-      </w:r>
-      <w:proofErr w:type="spellStart"/>
-      <w:r>
-        <w:rPr>
-          <w:rFonts w:ascii="Times New Roman" w:eastAsia="Times New Roman" w:hAnsi="Times New Roman" w:cs="Times New Roman"/>
-          <w:sz w:val="24"/>
-          <w:szCs w:val="24"/>
-        </w:rPr>
-        <w:t>Kmodes</w:t>
-      </w:r>
-      <w:proofErr w:type="spellEnd"/>
-      <w:r>
-        <w:rPr>
-          <w:rFonts w:ascii="Times New Roman" w:eastAsia="Times New Roman" w:hAnsi="Times New Roman" w:cs="Times New Roman"/>
-          <w:sz w:val="24"/>
-          <w:szCs w:val="24"/>
-        </w:rPr>
-        <w:t xml:space="preserve"> clustering is an extension of k-means designed specifically for categorical attributes, using modes instead of means and a simple matching dissimilarity measure rather than Euclidean distance. It groups data points into clusters of similar categorical profiles efficiently and with scalability. When combined with association rule mining, this method segments the dataset into meaningful groups, allowing cluster-specific association rules to be mined. This approach reduces the search space and uncovers more targeted, precise, and actionable patterns relevant to each segment.</w:t>
+        <w:t>This approach acknowledges the heterogeneity of most user populations and appreciates that valuable personalization requires understanding not just aggregate patterns  but segment-level behavior and preferences. By first identifying valuable user segments via clustering and then applying association rule mining within those segments, analysts can uncover patterns that are not just statistically significant but also meaningful in practice to specific user groups.</w:t>
+      </w:r>
+    </w:p>
+    <w:p>
+      <w:pPr>
+        <w:spacing w:before="240" w:after="240" w:line="360" w:lineRule="auto"/>
+        <w:jc w:val="both"/>
+        <w:rPr>
+          <w:rFonts w:ascii="Times New Roman" w:eastAsia="Times New Roman" w:hAnsi="Times New Roman" w:cs="Times New Roman"/>
+          <w:sz w:val="24"/>
+          <w:szCs w:val="24"/>
+        </w:rPr>
+      </w:pPr>
+      <w:r>
+        <w:rPr>
+          <w:rFonts w:ascii="Times New Roman" w:eastAsia="Times New Roman" w:hAnsi="Times New Roman" w:cs="Times New Roman"/>
+          <w:sz w:val="24"/>
+          <w:szCs w:val="24"/>
+        </w:rPr>
+        <w:t>The methodological framework for integration is typically a sequential one whereby clustering is carried out first in order to identify homogeneous user segments, and then association rule mining is applied within each cluster found. This is so that association rules are mined within the context in which users share similar characteristics or tastes, and therefore it will be more probable that the rules identify genuine behavior patterns rather than being artifacts of population heterogeneity.</w:t>
+      </w:r>
+    </w:p>
+    <w:p>
+      <w:pPr>
+        <w:spacing w:before="240" w:after="240" w:line="360" w:lineRule="auto"/>
+        <w:jc w:val="both"/>
+        <w:rPr>
+          <w:rFonts w:ascii="Times New Roman" w:eastAsia="Times New Roman" w:hAnsi="Times New Roman" w:cs="Times New Roman"/>
+          <w:sz w:val="24"/>
+          <w:szCs w:val="24"/>
+        </w:rPr>
+      </w:pPr>
+      <w:r>
+        <w:rPr>
+          <w:rFonts w:ascii="Times New Roman" w:eastAsia="Times New Roman" w:hAnsi="Times New Roman" w:cs="Times New Roman"/>
+          <w:sz w:val="24"/>
+          <w:szCs w:val="24"/>
+        </w:rPr>
+        <w:t>More recent research has explored the integration of kmodes clustering with association rule mining to analyze categorical data more effectively. Kmodes clustering is an extension of k-means designed specifically for categorical attributes, using modes instead of means and a simple matching dissimilarity measure rather than Euclidean distance. It groups data points into clusters of similar categorical profiles efficiently and with scalability. When combined with association rule mining, this method segments the dataset into meaningful groups, allowing cluster-specific association rules to be mined. This approach reduces the search space and uncovers more targeted, precise, and actionable patterns relevant to each segment.</w:t>
       </w:r>
     </w:p>
     <w:p>
@@ -2806,80 +2026,26 @@
           <w:szCs w:val="24"/>
         </w:rPr>
         <w:lastRenderedPageBreak/>
-        <w:t xml:space="preserve">This hybrid method finds application in areas like market basket analysis, customer segmentation, and other categorical data mining problems. The sequential use where </w:t>
-      </w:r>
-      <w:proofErr w:type="spellStart"/>
-      <w:r>
-        <w:rPr>
-          <w:rFonts w:ascii="Times New Roman" w:eastAsia="Times New Roman" w:hAnsi="Times New Roman" w:cs="Times New Roman"/>
-          <w:sz w:val="24"/>
-          <w:szCs w:val="24"/>
-        </w:rPr>
-        <w:t>kmodes</w:t>
-      </w:r>
-      <w:proofErr w:type="spellEnd"/>
-      <w:r>
-        <w:rPr>
-          <w:rFonts w:ascii="Times New Roman" w:eastAsia="Times New Roman" w:hAnsi="Times New Roman" w:cs="Times New Roman"/>
-          <w:sz w:val="24"/>
-          <w:szCs w:val="24"/>
-        </w:rPr>
-        <w:t xml:space="preserve"> </w:t>
-      </w:r>
-      <w:proofErr w:type="gramStart"/>
-      <w:r>
-        <w:rPr>
-          <w:rFonts w:ascii="Times New Roman" w:eastAsia="Times New Roman" w:hAnsi="Times New Roman" w:cs="Times New Roman"/>
-          <w:sz w:val="24"/>
-          <w:szCs w:val="24"/>
-        </w:rPr>
-        <w:t>clusters</w:t>
-      </w:r>
-      <w:proofErr w:type="gramEnd"/>
-      <w:r>
-        <w:rPr>
-          <w:rFonts w:ascii="Times New Roman" w:eastAsia="Times New Roman" w:hAnsi="Times New Roman" w:cs="Times New Roman"/>
-          <w:sz w:val="24"/>
-          <w:szCs w:val="24"/>
-        </w:rPr>
-        <w:t xml:space="preserve"> the data, followed by association rule mining within each cluster, has shown potential to enhance the relevance and interpretability of discovered rules compared to global rule mining alone.</w:t>
-      </w:r>
-    </w:p>
-    <w:p>
-      <w:pPr>
-        <w:spacing w:before="240" w:after="240" w:line="360" w:lineRule="auto"/>
-        <w:jc w:val="both"/>
-        <w:rPr>
-          <w:rFonts w:ascii="Times New Roman" w:eastAsia="Times New Roman" w:hAnsi="Times New Roman" w:cs="Times New Roman"/>
-          <w:sz w:val="24"/>
-          <w:szCs w:val="24"/>
-        </w:rPr>
-      </w:pPr>
-      <w:r>
-        <w:rPr>
-          <w:rFonts w:ascii="Times New Roman" w:eastAsia="Times New Roman" w:hAnsi="Times New Roman" w:cs="Times New Roman"/>
-          <w:sz w:val="24"/>
-          <w:szCs w:val="24"/>
-        </w:rPr>
-        <w:t xml:space="preserve">Gupta &amp; Goyal (2023) extended this line of research further by demonstrating the application of hybrid clustering-association approaches </w:t>
-      </w:r>
-      <w:proofErr w:type="gramStart"/>
-      <w:r>
-        <w:rPr>
-          <w:rFonts w:ascii="Times New Roman" w:eastAsia="Times New Roman" w:hAnsi="Times New Roman" w:cs="Times New Roman"/>
-          <w:sz w:val="24"/>
-          <w:szCs w:val="24"/>
-        </w:rPr>
-        <w:t>in the area of</w:t>
-      </w:r>
-      <w:proofErr w:type="gramEnd"/>
-      <w:r>
-        <w:rPr>
-          <w:rFonts w:ascii="Times New Roman" w:eastAsia="Times New Roman" w:hAnsi="Times New Roman" w:cs="Times New Roman"/>
-          <w:sz w:val="24"/>
-          <w:szCs w:val="24"/>
-        </w:rPr>
-        <w:t xml:space="preserve"> personalized marketing. Their paper demonstrates how an understanding of both customer segments and product associations within these segments can be utilized to make more focused marketing decisions and product recommendations. The insights from their hybrid approach provided marketing professionals with better customer behavioral insights and more precise targeting.</w:t>
+        <w:t>This hybrid method finds application in areas like market basket analysis, customer segmentation, and other categorical data mining problems. The sequential use where kmodes clusters the data, followed by association rule mining within each cluster, has shown potential to enhance the relevance and interpretability of discovered rules compared to global rule mining alone.</w:t>
+      </w:r>
+    </w:p>
+    <w:p>
+      <w:pPr>
+        <w:spacing w:before="240" w:after="240" w:line="360" w:lineRule="auto"/>
+        <w:jc w:val="both"/>
+        <w:rPr>
+          <w:rFonts w:ascii="Times New Roman" w:eastAsia="Times New Roman" w:hAnsi="Times New Roman" w:cs="Times New Roman"/>
+          <w:sz w:val="24"/>
+          <w:szCs w:val="24"/>
+        </w:rPr>
+      </w:pPr>
+      <w:r>
+        <w:rPr>
+          <w:rFonts w:ascii="Times New Roman" w:eastAsia="Times New Roman" w:hAnsi="Times New Roman" w:cs="Times New Roman"/>
+          <w:sz w:val="24"/>
+          <w:szCs w:val="24"/>
+        </w:rPr>
+        <w:t>Gupta &amp; Goyal (2023) extended this line of research further by demonstrating the application of hybrid clustering-association approaches in the area of personalized marketing. Their paper demonstrates how an understanding of both customer segments and product associations within these segments can be utilized to make more focused marketing decisions and product recommendations. The insights from their hybrid approach provided marketing professionals with better customer behavioral insights and more precise targeting.</w:t>
       </w:r>
     </w:p>
     <w:p>
@@ -2930,23 +2096,13 @@
           <w:szCs w:val="24"/>
         </w:rPr>
       </w:pPr>
-      <w:proofErr w:type="gramStart"/>
-      <w:r>
-        <w:rPr>
-          <w:rFonts w:ascii="Times New Roman" w:eastAsia="Times New Roman" w:hAnsi="Times New Roman" w:cs="Times New Roman"/>
-          <w:sz w:val="24"/>
-          <w:szCs w:val="24"/>
-        </w:rPr>
-        <w:t>while</w:t>
-      </w:r>
-      <w:proofErr w:type="gramEnd"/>
-      <w:r>
-        <w:rPr>
-          <w:rFonts w:ascii="Times New Roman" w:eastAsia="Times New Roman" w:hAnsi="Times New Roman" w:cs="Times New Roman"/>
-          <w:sz w:val="24"/>
-          <w:szCs w:val="24"/>
-        </w:rPr>
-        <w:t xml:space="preserve"> successful clustering can significantly enhance the relevance and actionability of discovered rules.</w:t>
+      <w:r>
+        <w:rPr>
+          <w:rFonts w:ascii="Times New Roman" w:eastAsia="Times New Roman" w:hAnsi="Times New Roman" w:cs="Times New Roman"/>
+          <w:sz w:val="24"/>
+          <w:szCs w:val="24"/>
+        </w:rPr>
+        <w:t>while successful clustering can significantly enhance the relevance and actionability of discovered rules.</w:t>
       </w:r>
     </w:p>
     <w:p>
@@ -3013,298 +2169,64 @@
           <w:szCs w:val="24"/>
         </w:rPr>
         <w:lastRenderedPageBreak/>
-        <w:t xml:space="preserve">Conventional </w:t>
-      </w:r>
-      <w:proofErr w:type="gramStart"/>
-      <w:r>
-        <w:rPr>
-          <w:rFonts w:ascii="Times New Roman" w:eastAsia="Times New Roman" w:hAnsi="Times New Roman" w:cs="Times New Roman"/>
-          <w:sz w:val="24"/>
-          <w:szCs w:val="24"/>
-        </w:rPr>
-        <w:t>recommender</w:t>
-      </w:r>
-      <w:proofErr w:type="gramEnd"/>
-      <w:r>
-        <w:rPr>
-          <w:rFonts w:ascii="Times New Roman" w:eastAsia="Times New Roman" w:hAnsi="Times New Roman" w:cs="Times New Roman"/>
-          <w:sz w:val="24"/>
-          <w:szCs w:val="24"/>
-        </w:rPr>
-        <w:t xml:space="preserve"> systems have typically employed collaborative filtering (Bobadilla et al., 2013) or content-based approaches (Lu et al., 2015), both of which possess their own strengths and </w:t>
-      </w:r>
-      <w:proofErr w:type="gramStart"/>
-      <w:r>
-        <w:rPr>
-          <w:rFonts w:ascii="Times New Roman" w:eastAsia="Times New Roman" w:hAnsi="Times New Roman" w:cs="Times New Roman"/>
-          <w:sz w:val="24"/>
-          <w:szCs w:val="24"/>
-        </w:rPr>
-        <w:t>limitations..</w:t>
-      </w:r>
-      <w:proofErr w:type="gramEnd"/>
-      <w:r>
-        <w:rPr>
-          <w:rFonts w:ascii="Times New Roman" w:eastAsia="Times New Roman" w:hAnsi="Times New Roman" w:cs="Times New Roman"/>
-          <w:sz w:val="24"/>
-          <w:szCs w:val="24"/>
-        </w:rPr>
-        <w:t xml:space="preserve"> Collaborative filtering systems identify like-minded users and suggest items that similar users have enjoyed, while content-based systems suggest items that are </w:t>
-      </w:r>
-      <w:proofErr w:type="gramStart"/>
-      <w:r>
-        <w:rPr>
-          <w:rFonts w:ascii="Times New Roman" w:eastAsia="Times New Roman" w:hAnsi="Times New Roman" w:cs="Times New Roman"/>
-          <w:sz w:val="24"/>
-          <w:szCs w:val="24"/>
-        </w:rPr>
-        <w:t>similar to</w:t>
-      </w:r>
-      <w:proofErr w:type="gramEnd"/>
-      <w:r>
-        <w:rPr>
-          <w:rFonts w:ascii="Times New Roman" w:eastAsia="Times New Roman" w:hAnsi="Times New Roman" w:cs="Times New Roman"/>
-          <w:sz w:val="24"/>
-          <w:szCs w:val="24"/>
-        </w:rPr>
-        <w:t xml:space="preserve"> ones a user has enjoyed in the past. While these approaches have worked well in most environments, they do not fare well with issues such as the cold start problem, scalability, and an inability to provide transparent and interpretable recommendations.</w:t>
-      </w:r>
-    </w:p>
-    <w:p>
-      <w:pPr>
-        <w:spacing w:before="240" w:after="240" w:line="360" w:lineRule="auto"/>
-        <w:jc w:val="both"/>
-        <w:rPr>
-          <w:rFonts w:ascii="Times New Roman" w:eastAsia="Times New Roman" w:hAnsi="Times New Roman" w:cs="Times New Roman"/>
-          <w:sz w:val="24"/>
-          <w:szCs w:val="24"/>
-        </w:rPr>
-      </w:pPr>
-      <w:r>
-        <w:rPr>
-          <w:rFonts w:ascii="Times New Roman" w:eastAsia="Times New Roman" w:hAnsi="Times New Roman" w:cs="Times New Roman"/>
-          <w:sz w:val="24"/>
-          <w:szCs w:val="24"/>
-        </w:rPr>
-        <w:t>The integration of clustering and association rule mining with recommender systems holds the potential to surmount some of these limitations and provide additional functionality. Hybrid models (</w:t>
-      </w:r>
-      <w:proofErr w:type="spellStart"/>
-      <w:r>
-        <w:rPr>
-          <w:rFonts w:ascii="Times New Roman" w:eastAsia="Times New Roman" w:hAnsi="Times New Roman" w:cs="Times New Roman"/>
-          <w:sz w:val="24"/>
-          <w:szCs w:val="24"/>
-        </w:rPr>
-        <w:t>Çano</w:t>
-      </w:r>
-      <w:proofErr w:type="spellEnd"/>
-      <w:r>
-        <w:rPr>
-          <w:rFonts w:ascii="Times New Roman" w:eastAsia="Times New Roman" w:hAnsi="Times New Roman" w:cs="Times New Roman"/>
-          <w:sz w:val="24"/>
-          <w:szCs w:val="24"/>
-        </w:rPr>
-        <w:t xml:space="preserve"> &amp; </w:t>
-      </w:r>
-      <w:proofErr w:type="spellStart"/>
-      <w:r>
-        <w:rPr>
-          <w:rFonts w:ascii="Times New Roman" w:eastAsia="Times New Roman" w:hAnsi="Times New Roman" w:cs="Times New Roman"/>
-          <w:sz w:val="24"/>
-          <w:szCs w:val="24"/>
-        </w:rPr>
-        <w:t>Morisio</w:t>
-      </w:r>
-      <w:proofErr w:type="spellEnd"/>
-      <w:r>
-        <w:rPr>
-          <w:rFonts w:ascii="Times New Roman" w:eastAsia="Times New Roman" w:hAnsi="Times New Roman" w:cs="Times New Roman"/>
-          <w:sz w:val="24"/>
-          <w:szCs w:val="24"/>
-        </w:rPr>
-        <w:t>, 2017) that merge collaborative filtering with content-based or unsupervised learning methods have been demonstrated to improve recommender systems (</w:t>
-      </w:r>
-      <w:proofErr w:type="spellStart"/>
-      <w:r>
-        <w:rPr>
-          <w:rFonts w:ascii="Times New Roman" w:eastAsia="Times New Roman" w:hAnsi="Times New Roman" w:cs="Times New Roman"/>
-          <w:sz w:val="24"/>
-          <w:szCs w:val="24"/>
-        </w:rPr>
-        <w:t>Jannach</w:t>
-      </w:r>
-      <w:proofErr w:type="spellEnd"/>
-      <w:r>
-        <w:rPr>
-          <w:rFonts w:ascii="Times New Roman" w:eastAsia="Times New Roman" w:hAnsi="Times New Roman" w:cs="Times New Roman"/>
-          <w:sz w:val="24"/>
-          <w:szCs w:val="24"/>
-        </w:rPr>
-        <w:t xml:space="preserve"> et al., 2016), creating systems capable of leveraging more than a single kind of information as well as analytic method for the purpose of generating more accurate and diverse recommendations.</w:t>
-      </w:r>
-    </w:p>
-    <w:p>
-      <w:pPr>
-        <w:spacing w:before="240" w:after="240" w:line="360" w:lineRule="auto"/>
-        <w:jc w:val="both"/>
-        <w:rPr>
-          <w:rFonts w:ascii="Times New Roman" w:eastAsia="Times New Roman" w:hAnsi="Times New Roman" w:cs="Times New Roman"/>
-          <w:sz w:val="24"/>
-          <w:szCs w:val="24"/>
-        </w:rPr>
-      </w:pPr>
-      <w:r>
-        <w:rPr>
-          <w:rFonts w:ascii="Times New Roman" w:eastAsia="Times New Roman" w:hAnsi="Times New Roman" w:cs="Times New Roman"/>
-          <w:sz w:val="24"/>
-          <w:szCs w:val="24"/>
-        </w:rPr>
-        <w:t xml:space="preserve">The </w:t>
-      </w:r>
-      <w:proofErr w:type="spellStart"/>
-      <w:r>
-        <w:rPr>
-          <w:rFonts w:ascii="Times New Roman" w:eastAsia="Times New Roman" w:hAnsi="Times New Roman" w:cs="Times New Roman"/>
-          <w:sz w:val="24"/>
-          <w:szCs w:val="24"/>
-        </w:rPr>
-        <w:t>MovieLens</w:t>
-      </w:r>
-      <w:proofErr w:type="spellEnd"/>
-      <w:r>
-        <w:rPr>
-          <w:rFonts w:ascii="Times New Roman" w:eastAsia="Times New Roman" w:hAnsi="Times New Roman" w:cs="Times New Roman"/>
-          <w:sz w:val="24"/>
-          <w:szCs w:val="24"/>
-        </w:rPr>
-        <w:t xml:space="preserve"> dataset has been extensively used in recommender system research, providing a rich foundation for the exploration of different content recommendation approaches. While it has been put to considerable use, there has been little exploration of the application of K-</w:t>
-      </w:r>
-      <w:proofErr w:type="gramStart"/>
-      <w:r>
-        <w:rPr>
-          <w:rFonts w:ascii="Times New Roman" w:eastAsia="Times New Roman" w:hAnsi="Times New Roman" w:cs="Times New Roman"/>
-          <w:sz w:val="24"/>
-          <w:szCs w:val="24"/>
-        </w:rPr>
-        <w:t>Modes</w:t>
-      </w:r>
-      <w:proofErr w:type="gramEnd"/>
-      <w:r>
-        <w:rPr>
-          <w:rFonts w:ascii="Times New Roman" w:eastAsia="Times New Roman" w:hAnsi="Times New Roman" w:cs="Times New Roman"/>
-          <w:sz w:val="24"/>
-          <w:szCs w:val="24"/>
-        </w:rPr>
-        <w:t xml:space="preserve"> clustering in conjunction with association rule mining for </w:t>
-      </w:r>
-      <w:proofErr w:type="spellStart"/>
-      <w:r>
-        <w:rPr>
-          <w:rFonts w:ascii="Times New Roman" w:eastAsia="Times New Roman" w:hAnsi="Times New Roman" w:cs="Times New Roman"/>
-          <w:sz w:val="24"/>
-          <w:szCs w:val="24"/>
-        </w:rPr>
-        <w:t>MovieLens</w:t>
-      </w:r>
-      <w:proofErr w:type="spellEnd"/>
-      <w:r>
-        <w:rPr>
-          <w:rFonts w:ascii="Times New Roman" w:eastAsia="Times New Roman" w:hAnsi="Times New Roman" w:cs="Times New Roman"/>
-          <w:sz w:val="24"/>
-          <w:szCs w:val="24"/>
-        </w:rPr>
-        <w:t xml:space="preserve"> analysis. This is a significant lacuna in the literature, as the categorical nature of most </w:t>
-      </w:r>
-      <w:proofErr w:type="spellStart"/>
-      <w:r>
-        <w:rPr>
-          <w:rFonts w:ascii="Times New Roman" w:eastAsia="Times New Roman" w:hAnsi="Times New Roman" w:cs="Times New Roman"/>
-          <w:sz w:val="24"/>
-          <w:szCs w:val="24"/>
-        </w:rPr>
-        <w:t>MovieLens</w:t>
-      </w:r>
-      <w:proofErr w:type="spellEnd"/>
-      <w:r>
-        <w:rPr>
-          <w:rFonts w:ascii="Times New Roman" w:eastAsia="Times New Roman" w:hAnsi="Times New Roman" w:cs="Times New Roman"/>
-          <w:sz w:val="24"/>
-          <w:szCs w:val="24"/>
-        </w:rPr>
-        <w:t xml:space="preserve"> data (tags, genres, user demographics) makes it particularly well-suited to K-</w:t>
-      </w:r>
-      <w:proofErr w:type="gramStart"/>
-      <w:r>
-        <w:rPr>
-          <w:rFonts w:ascii="Times New Roman" w:eastAsia="Times New Roman" w:hAnsi="Times New Roman" w:cs="Times New Roman"/>
-          <w:sz w:val="24"/>
-          <w:szCs w:val="24"/>
-        </w:rPr>
-        <w:t>Modes</w:t>
-      </w:r>
-      <w:proofErr w:type="gramEnd"/>
-      <w:r>
-        <w:rPr>
-          <w:rFonts w:ascii="Times New Roman" w:eastAsia="Times New Roman" w:hAnsi="Times New Roman" w:cs="Times New Roman"/>
-          <w:sz w:val="24"/>
-          <w:szCs w:val="24"/>
-        </w:rPr>
-        <w:t xml:space="preserve"> analysis, and the co-occurrence patterns in user behavior provide rich territory for association rule mining.</w:t>
-      </w:r>
-    </w:p>
-    <w:p>
-      <w:pPr>
-        <w:spacing w:before="240" w:after="240" w:line="360" w:lineRule="auto"/>
-        <w:jc w:val="both"/>
-        <w:rPr>
-          <w:rFonts w:ascii="Times New Roman" w:eastAsia="Times New Roman" w:hAnsi="Times New Roman" w:cs="Times New Roman"/>
-          <w:sz w:val="24"/>
-          <w:szCs w:val="24"/>
-        </w:rPr>
-      </w:pPr>
-      <w:r>
-        <w:rPr>
-          <w:rFonts w:ascii="Times New Roman" w:eastAsia="Times New Roman" w:hAnsi="Times New Roman" w:cs="Times New Roman"/>
-          <w:sz w:val="24"/>
-          <w:szCs w:val="24"/>
-        </w:rPr>
-        <w:t xml:space="preserve">Clustering for recommender systems has typically been directed toward finding user segments or item clusters from which to inform recommendation strategies. User clustering may be utilized </w:t>
-      </w:r>
-      <w:proofErr w:type="gramStart"/>
-      <w:r>
-        <w:rPr>
-          <w:rFonts w:ascii="Times New Roman" w:eastAsia="Times New Roman" w:hAnsi="Times New Roman" w:cs="Times New Roman"/>
-          <w:sz w:val="24"/>
-          <w:szCs w:val="24"/>
-        </w:rPr>
-        <w:t>in order to</w:t>
-      </w:r>
-      <w:proofErr w:type="gramEnd"/>
-      <w:r>
-        <w:rPr>
-          <w:rFonts w:ascii="Times New Roman" w:eastAsia="Times New Roman" w:hAnsi="Times New Roman" w:cs="Times New Roman"/>
-          <w:sz w:val="24"/>
-          <w:szCs w:val="24"/>
-        </w:rPr>
-        <w:t xml:space="preserve"> identify clusters of users with similar preferences so that more targeted recommendations can be made, and the cold start problem for new users can be addressed by adding them to appropriate clusters based on limited initial data. Item clustering may be utilized to identify content relationships that can inform recommendation diversity and enable users to locate content that is not immediately obvious </w:t>
-      </w:r>
-      <w:proofErr w:type="gramStart"/>
-      <w:r>
-        <w:rPr>
-          <w:rFonts w:ascii="Times New Roman" w:eastAsia="Times New Roman" w:hAnsi="Times New Roman" w:cs="Times New Roman"/>
-          <w:sz w:val="24"/>
-          <w:szCs w:val="24"/>
-        </w:rPr>
-        <w:t>through the use of</w:t>
-      </w:r>
-      <w:proofErr w:type="gramEnd"/>
-      <w:r>
-        <w:rPr>
-          <w:rFonts w:ascii="Times New Roman" w:eastAsia="Times New Roman" w:hAnsi="Times New Roman" w:cs="Times New Roman"/>
-          <w:sz w:val="24"/>
-          <w:szCs w:val="24"/>
-        </w:rPr>
-        <w:t xml:space="preserve"> collaborative filtering techniques.</w:t>
+        <w:t>Conventional recommender systems have typically employed collaborative filtering (Bobadilla et al., 2013) or content-based approaches (Lu et al., 2015), both of which possess their own strengths and limitations.. Collaborative filtering systems identify like-minded users and suggest items that similar users have enjoyed, while content-based systems suggest items that are similar to ones a user has enjoyed in the past. While these approaches have worked well in most environments, they do not fare well with issues such as the cold start problem, scalability, and an inability to provide transparent and interpretable recommendations.</w:t>
+      </w:r>
+    </w:p>
+    <w:p>
+      <w:pPr>
+        <w:spacing w:before="240" w:after="240" w:line="360" w:lineRule="auto"/>
+        <w:jc w:val="both"/>
+        <w:rPr>
+          <w:rFonts w:ascii="Times New Roman" w:eastAsia="Times New Roman" w:hAnsi="Times New Roman" w:cs="Times New Roman"/>
+          <w:sz w:val="24"/>
+          <w:szCs w:val="24"/>
+        </w:rPr>
+      </w:pPr>
+      <w:r>
+        <w:rPr>
+          <w:rFonts w:ascii="Times New Roman" w:eastAsia="Times New Roman" w:hAnsi="Times New Roman" w:cs="Times New Roman"/>
+          <w:sz w:val="24"/>
+          <w:szCs w:val="24"/>
+        </w:rPr>
+        <w:t>The integration of clustering and association rule mining with recommender systems holds the potential to surmount some of these limitations and provide additional functionality. Hybrid models (Çano &amp; Morisio, 2017) that merge collaborative filtering with content-based or unsupervised learning methods have been demonstrated to improve recommender systems (Jannach et al., 2016), creating systems capable of leveraging more than a single kind of information as well as analytic method for the purpose of generating more accurate and diverse recommendations.</w:t>
+      </w:r>
+    </w:p>
+    <w:p>
+      <w:pPr>
+        <w:spacing w:before="240" w:after="240" w:line="360" w:lineRule="auto"/>
+        <w:jc w:val="both"/>
+        <w:rPr>
+          <w:rFonts w:ascii="Times New Roman" w:eastAsia="Times New Roman" w:hAnsi="Times New Roman" w:cs="Times New Roman"/>
+          <w:sz w:val="24"/>
+          <w:szCs w:val="24"/>
+        </w:rPr>
+      </w:pPr>
+      <w:r>
+        <w:rPr>
+          <w:rFonts w:ascii="Times New Roman" w:eastAsia="Times New Roman" w:hAnsi="Times New Roman" w:cs="Times New Roman"/>
+          <w:sz w:val="24"/>
+          <w:szCs w:val="24"/>
+        </w:rPr>
+        <w:t>The MovieLens dataset has been extensively used in recommender system research, providing a rich foundation for the exploration of different content recommendation approaches. While it has been put to considerable use, there has been little exploration of the application of K-Modes clustering in conjunction with association rule mining for MovieLens analysis. This is a significant lacuna in the literature, as the categorical nature of most MovieLens data (tags, genres, user demographics) makes it particularly well-suited to K-Modes analysis, and the co-occurrence patterns in user behavior provide rich territory for association rule mining.</w:t>
+      </w:r>
+    </w:p>
+    <w:p>
+      <w:pPr>
+        <w:spacing w:before="240" w:after="240" w:line="360" w:lineRule="auto"/>
+        <w:jc w:val="both"/>
+        <w:rPr>
+          <w:rFonts w:ascii="Times New Roman" w:eastAsia="Times New Roman" w:hAnsi="Times New Roman" w:cs="Times New Roman"/>
+          <w:sz w:val="24"/>
+          <w:szCs w:val="24"/>
+        </w:rPr>
+      </w:pPr>
+      <w:r>
+        <w:rPr>
+          <w:rFonts w:ascii="Times New Roman" w:eastAsia="Times New Roman" w:hAnsi="Times New Roman" w:cs="Times New Roman"/>
+          <w:sz w:val="24"/>
+          <w:szCs w:val="24"/>
+        </w:rPr>
+        <w:t>Clustering for recommender systems has typically been directed toward finding user segments or item clusters from which to inform recommendation strategies. User clustering may be utilized in order to identify clusters of users with similar preferences so that more targeted recommendations can be made, and the cold start problem for new users can be addressed by adding them to appropriate clusters based on limited initial data. Item clustering may be utilized to identify content relationships that can inform recommendation diversity and enable users to locate content that is not immediately obvious through the use of collaborative filtering techniques.</w:t>
       </w:r>
     </w:p>
     <w:p>
@@ -3324,156 +2246,64 @@
           <w:szCs w:val="24"/>
         </w:rPr>
         <w:lastRenderedPageBreak/>
-        <w:t xml:space="preserve">Recommender system association rule mining is interested in discovering co-preference or co-consumption patterns that can be utilized to make recommendation algorithms aware. These can involve discovering that users who positively rate the same films also positively rate other specific </w:t>
-      </w:r>
-      <w:proofErr w:type="gramStart"/>
-      <w:r>
-        <w:rPr>
-          <w:rFonts w:ascii="Times New Roman" w:eastAsia="Times New Roman" w:hAnsi="Times New Roman" w:cs="Times New Roman"/>
-          <w:sz w:val="24"/>
-          <w:szCs w:val="24"/>
-        </w:rPr>
-        <w:t>films, or</w:t>
-      </w:r>
-      <w:proofErr w:type="gramEnd"/>
-      <w:r>
-        <w:rPr>
-          <w:rFonts w:ascii="Times New Roman" w:eastAsia="Times New Roman" w:hAnsi="Times New Roman" w:cs="Times New Roman"/>
-          <w:sz w:val="24"/>
-          <w:szCs w:val="24"/>
-        </w:rPr>
-        <w:t xml:space="preserve"> discovering that users who tag films with specific attributes also tag them with other specific attributes. These patterns can be used to augment recommendation sets, improve recommendation accuracy, and provide more diverse suggestions.</w:t>
-      </w:r>
-    </w:p>
-    <w:p>
-      <w:pPr>
-        <w:spacing w:before="240" w:after="240" w:line="360" w:lineRule="auto"/>
-        <w:jc w:val="both"/>
-        <w:rPr>
-          <w:rFonts w:ascii="Times New Roman" w:eastAsia="Times New Roman" w:hAnsi="Times New Roman" w:cs="Times New Roman"/>
-          <w:sz w:val="24"/>
-          <w:szCs w:val="24"/>
-        </w:rPr>
-      </w:pPr>
-      <w:r>
-        <w:rPr>
-          <w:rFonts w:ascii="Times New Roman" w:eastAsia="Times New Roman" w:hAnsi="Times New Roman" w:cs="Times New Roman"/>
-          <w:sz w:val="24"/>
-          <w:szCs w:val="24"/>
-        </w:rPr>
-        <w:t xml:space="preserve">The integration of these methods in recommender systems needs to be well thought out in how to blend results from clustering and association analysis into unified recommendation approaches. This may involve using cluster membership to filter or weight association </w:t>
-      </w:r>
-      <w:proofErr w:type="gramStart"/>
-      <w:r>
-        <w:rPr>
-          <w:rFonts w:ascii="Times New Roman" w:eastAsia="Times New Roman" w:hAnsi="Times New Roman" w:cs="Times New Roman"/>
-          <w:sz w:val="24"/>
-          <w:szCs w:val="24"/>
-        </w:rPr>
-        <w:t>rules, or</w:t>
-      </w:r>
-      <w:proofErr w:type="gramEnd"/>
-      <w:r>
-        <w:rPr>
-          <w:rFonts w:ascii="Times New Roman" w:eastAsia="Times New Roman" w:hAnsi="Times New Roman" w:cs="Times New Roman"/>
-          <w:sz w:val="24"/>
-          <w:szCs w:val="24"/>
-        </w:rPr>
-        <w:t xml:space="preserve"> using association patterns to explain cluster definitions and refine segmentation accuracy.</w:t>
-      </w:r>
-    </w:p>
-    <w:p>
-      <w:pPr>
-        <w:spacing w:before="240" w:after="240" w:line="360" w:lineRule="auto"/>
-        <w:jc w:val="both"/>
-        <w:rPr>
-          <w:rFonts w:ascii="Times New Roman" w:eastAsia="Times New Roman" w:hAnsi="Times New Roman" w:cs="Times New Roman"/>
-          <w:sz w:val="24"/>
-          <w:szCs w:val="24"/>
-        </w:rPr>
-      </w:pPr>
-      <w:r>
-        <w:rPr>
-          <w:rFonts w:ascii="Times New Roman" w:eastAsia="Times New Roman" w:hAnsi="Times New Roman" w:cs="Times New Roman"/>
-          <w:sz w:val="24"/>
-          <w:szCs w:val="24"/>
-        </w:rPr>
-        <w:t xml:space="preserve">The technical challenges in the integration of hybrid approaches in recommender systems include scalability, real-time computation, and the requirement for interpretable results that can be explained to users. Modern recommender systems must process millions of users and items and make recommendations in real-time, which requires effective algorithms and extensive optimization of analysis </w:t>
-      </w:r>
-      <w:proofErr w:type="spellStart"/>
-      <w:proofErr w:type="gramStart"/>
-      <w:r>
-        <w:rPr>
-          <w:rFonts w:ascii="Times New Roman" w:eastAsia="Times New Roman" w:hAnsi="Times New Roman" w:cs="Times New Roman"/>
-          <w:sz w:val="24"/>
-          <w:szCs w:val="24"/>
-        </w:rPr>
-        <w:t>processes.The</w:t>
-      </w:r>
-      <w:proofErr w:type="spellEnd"/>
-      <w:proofErr w:type="gramEnd"/>
-      <w:r>
-        <w:rPr>
-          <w:rFonts w:ascii="Times New Roman" w:eastAsia="Times New Roman" w:hAnsi="Times New Roman" w:cs="Times New Roman"/>
-          <w:sz w:val="24"/>
-          <w:szCs w:val="24"/>
-        </w:rPr>
-        <w:t xml:space="preserve"> main goal of this project is to develop a comprehensive machine learning-based system that effectively combines the advantages of K-</w:t>
-      </w:r>
-      <w:proofErr w:type="gramStart"/>
-      <w:r>
-        <w:rPr>
-          <w:rFonts w:ascii="Times New Roman" w:eastAsia="Times New Roman" w:hAnsi="Times New Roman" w:cs="Times New Roman"/>
-          <w:sz w:val="24"/>
-          <w:szCs w:val="24"/>
-        </w:rPr>
-        <w:t>Modes</w:t>
-      </w:r>
-      <w:proofErr w:type="gramEnd"/>
-      <w:r>
-        <w:rPr>
-          <w:rFonts w:ascii="Times New Roman" w:eastAsia="Times New Roman" w:hAnsi="Times New Roman" w:cs="Times New Roman"/>
-          <w:sz w:val="24"/>
-          <w:szCs w:val="24"/>
-        </w:rPr>
-        <w:t xml:space="preserve"> clustering and association rule mining for analyzing people's movie viewing habits. The system seeks to enable platform optimization and personalized content by better understanding user behavior patterns and content relationships.</w:t>
-      </w:r>
-    </w:p>
-    <w:p>
-      <w:pPr>
-        <w:spacing w:before="240" w:after="240" w:line="360" w:lineRule="auto"/>
-        <w:jc w:val="both"/>
-        <w:rPr>
-          <w:rFonts w:ascii="Times New Roman" w:eastAsia="Times New Roman" w:hAnsi="Times New Roman" w:cs="Times New Roman"/>
-          <w:sz w:val="24"/>
-          <w:szCs w:val="24"/>
-        </w:rPr>
-      </w:pPr>
-      <w:r>
-        <w:rPr>
-          <w:rFonts w:ascii="Times New Roman" w:eastAsia="Times New Roman" w:hAnsi="Times New Roman" w:cs="Times New Roman"/>
-          <w:sz w:val="24"/>
-          <w:szCs w:val="24"/>
-        </w:rPr>
-        <w:t xml:space="preserve">There is a theoretical and practical aspect to the research aim. Theoretically, we wish to further </w:t>
-      </w:r>
-      <w:proofErr w:type="gramStart"/>
-      <w:r>
-        <w:rPr>
-          <w:rFonts w:ascii="Times New Roman" w:eastAsia="Times New Roman" w:hAnsi="Times New Roman" w:cs="Times New Roman"/>
-          <w:sz w:val="24"/>
-          <w:szCs w:val="24"/>
-        </w:rPr>
-        <w:t>understanding</w:t>
-      </w:r>
-      <w:proofErr w:type="gramEnd"/>
-      <w:r>
-        <w:rPr>
-          <w:rFonts w:ascii="Times New Roman" w:eastAsia="Times New Roman" w:hAnsi="Times New Roman" w:cs="Times New Roman"/>
-          <w:sz w:val="24"/>
-          <w:szCs w:val="24"/>
-        </w:rPr>
-        <w:t xml:space="preserve"> of how various unsupervised learning methods can be integrated to uncover knowledge that neither method could alone. This includes discussing the promise and challenges of combining association analysis and clustering, specifically for the scenario of entertainment data with some variations from typical retail datasets. From a practical perspective, the goal is to develop a system that streaming services, content producers, and other stakeholders in the entertainment ecosystem can easily implement to assist in their content strategy and recommendation engines. This pragmatic focus ensures that the study advances both academic knowledge and real-world applications that improve user experience and business outcomes.</w:t>
+        <w:t>Recommender system association rule mining is interested in discovering co-preference or co-consumption patterns that can be utilized to make recommendation algorithms aware. These can involve discovering that users who positively rate the same films also positively rate other specific films, or discovering that users who tag films with specific attributes also tag them with other specific attributes. These patterns can be used to augment recommendation sets, improve recommendation accuracy, and provide more diverse suggestions.</w:t>
+      </w:r>
+    </w:p>
+    <w:p>
+      <w:pPr>
+        <w:spacing w:before="240" w:after="240" w:line="360" w:lineRule="auto"/>
+        <w:jc w:val="both"/>
+        <w:rPr>
+          <w:rFonts w:ascii="Times New Roman" w:eastAsia="Times New Roman" w:hAnsi="Times New Roman" w:cs="Times New Roman"/>
+          <w:sz w:val="24"/>
+          <w:szCs w:val="24"/>
+        </w:rPr>
+      </w:pPr>
+      <w:r>
+        <w:rPr>
+          <w:rFonts w:ascii="Times New Roman" w:eastAsia="Times New Roman" w:hAnsi="Times New Roman" w:cs="Times New Roman"/>
+          <w:sz w:val="24"/>
+          <w:szCs w:val="24"/>
+        </w:rPr>
+        <w:t>The integration of these methods in recommender systems needs to be well thought out in how to blend results from clustering and association analysis into unified recommendation approaches. This may involve using cluster membership to filter or weight association rules, or using association patterns to explain cluster definitions and refine segmentation accuracy.</w:t>
+      </w:r>
+    </w:p>
+    <w:p>
+      <w:pPr>
+        <w:spacing w:before="240" w:after="240" w:line="360" w:lineRule="auto"/>
+        <w:jc w:val="both"/>
+        <w:rPr>
+          <w:rFonts w:ascii="Times New Roman" w:eastAsia="Times New Roman" w:hAnsi="Times New Roman" w:cs="Times New Roman"/>
+          <w:sz w:val="24"/>
+          <w:szCs w:val="24"/>
+        </w:rPr>
+      </w:pPr>
+      <w:r>
+        <w:rPr>
+          <w:rFonts w:ascii="Times New Roman" w:eastAsia="Times New Roman" w:hAnsi="Times New Roman" w:cs="Times New Roman"/>
+          <w:sz w:val="24"/>
+          <w:szCs w:val="24"/>
+        </w:rPr>
+        <w:t>The technical challenges in the integration of hybrid approaches in recommender systems include scalability, real-time computation, and the requirement for interpretable results that can be explained to users. Modern recommender systems must process millions of users and items and make recommendations in real-time, which requires effective algorithms and extensive optimization of analysis processes.The main goal of this project is to develop a comprehensive machine learning-based system that effectively combines the advantages of K-Modes clustering and association rule mining for analyzing people's movie viewing habits. The system seeks to enable platform optimization and personalized content by better understanding user behavior patterns and content relationships.</w:t>
+      </w:r>
+    </w:p>
+    <w:p>
+      <w:pPr>
+        <w:spacing w:before="240" w:after="240" w:line="360" w:lineRule="auto"/>
+        <w:jc w:val="both"/>
+        <w:rPr>
+          <w:rFonts w:ascii="Times New Roman" w:eastAsia="Times New Roman" w:hAnsi="Times New Roman" w:cs="Times New Roman"/>
+          <w:sz w:val="24"/>
+          <w:szCs w:val="24"/>
+        </w:rPr>
+      </w:pPr>
+      <w:r>
+        <w:rPr>
+          <w:rFonts w:ascii="Times New Roman" w:eastAsia="Times New Roman" w:hAnsi="Times New Roman" w:cs="Times New Roman"/>
+          <w:sz w:val="24"/>
+          <w:szCs w:val="24"/>
+        </w:rPr>
+        <w:t>There is a theoretical and practical aspect to the research aim. Theoretically, we wish to further understanding of how various unsupervised learning methods can be integrated to uncover knowledge that neither method could alone. This includes discussing the promise and challenges of combining association analysis and clustering, specifically for the scenario of entertainment data with some variations from typical retail datasets. From a practical perspective, the goal is to develop a system that streaming services, content producers, and other stakeholders in the entertainment ecosystem can easily implement to assist in their content strategy and recommendation engines. This pragmatic focus ensures that the study advances both academic knowledge and real-world applications that improve user experience and business outcomes.</w:t>
       </w:r>
     </w:p>
     <w:p>
@@ -3493,25 +2323,7 @@
           <w:szCs w:val="24"/>
         </w:rPr>
         <w:lastRenderedPageBreak/>
-        <w:t xml:space="preserve">The framework development process </w:t>
-      </w:r>
-      <w:proofErr w:type="gramStart"/>
-      <w:r>
-        <w:rPr>
-          <w:rFonts w:ascii="Times New Roman" w:eastAsia="Times New Roman" w:hAnsi="Times New Roman" w:cs="Times New Roman"/>
-          <w:sz w:val="24"/>
-          <w:szCs w:val="24"/>
-        </w:rPr>
-        <w:t>takes into account</w:t>
-      </w:r>
-      <w:proofErr w:type="gramEnd"/>
-      <w:r>
-        <w:rPr>
-          <w:rFonts w:ascii="Times New Roman" w:eastAsia="Times New Roman" w:hAnsi="Times New Roman" w:cs="Times New Roman"/>
-          <w:sz w:val="24"/>
-          <w:szCs w:val="24"/>
-        </w:rPr>
-        <w:t xml:space="preserve"> factors like scalability, interpretability, and adaptability to different types of entertainment data. The objective is to create a solution that can handle the volume of contemporary streaming services while providing content strategists and decision-makers with results that are both statistically significant and practically useful.</w:t>
+        <w:t>The framework development process takes into account factors like scalability, interpretability, and adaptability to different types of entertainment data. The objective is to create a solution that can handle the volume of contemporary streaming services while providing content strategists and decision-makers with results that are both statistically significant and practically useful.</w:t>
       </w:r>
     </w:p>
     <w:p>
@@ -3596,34 +2408,15 @@
           <w:sz w:val="24"/>
           <w:szCs w:val="24"/>
         </w:rPr>
-        <w:t>Limited Integration of Clustering and Association Rule Mining</w:t>
-      </w:r>
-      <w:proofErr w:type="gramStart"/>
-      <w:r>
-        <w:rPr>
-          <w:rFonts w:ascii="Times New Roman" w:eastAsia="Times New Roman" w:hAnsi="Times New Roman" w:cs="Times New Roman"/>
-          <w:b/>
-          <w:sz w:val="24"/>
-          <w:szCs w:val="24"/>
-        </w:rPr>
-        <w:t xml:space="preserve">: </w:t>
-      </w:r>
-      <w:r>
-        <w:rPr>
-          <w:rFonts w:ascii="Times New Roman" w:eastAsia="Times New Roman" w:hAnsi="Times New Roman" w:cs="Times New Roman"/>
-          <w:sz w:val="24"/>
-          <w:szCs w:val="24"/>
-        </w:rPr>
-        <w:t xml:space="preserve"> While</w:t>
-      </w:r>
-      <w:proofErr w:type="gramEnd"/>
-      <w:r>
-        <w:rPr>
-          <w:rFonts w:ascii="Times New Roman" w:eastAsia="Times New Roman" w:hAnsi="Times New Roman" w:cs="Times New Roman"/>
-          <w:sz w:val="24"/>
-          <w:szCs w:val="24"/>
-        </w:rPr>
-        <w:t xml:space="preserve"> numerous have applied clustering techniques or association rule mining individually on recommender system problems, not many have considered their potential combined, particularly for categorical movie data. This is a major missed potential, as the strengths of the two approaches complement each other in such a way that combining them would provide findings which neither could independently provide. The lack of effort along this line leaves the yet untapped potential synergies between association analysis and clustering, particularly in entertainment use cases with frequent categorical data. </w:t>
+        <w:t xml:space="preserve">Limited Integration of Clustering and Association Rule Mining: </w:t>
+      </w:r>
+      <w:r>
+        <w:rPr>
+          <w:rFonts w:ascii="Times New Roman" w:eastAsia="Times New Roman" w:hAnsi="Times New Roman" w:cs="Times New Roman"/>
+          <w:sz w:val="24"/>
+          <w:szCs w:val="24"/>
+        </w:rPr>
+        <w:t xml:space="preserve"> While numerous have applied clustering techniques or association rule mining individually on recommender system problems, not many have considered their potential combined, particularly for categorical movie data. This is a major missed potential, as the strengths of the two approaches complement each other in such a way that combining them would provide findings which neither could independently provide. The lack of effort along this line leaves the yet untapped potential synergies between association analysis and clustering, particularly in entertainment use cases with frequent categorical data. </w:t>
       </w:r>
     </w:p>
     <w:p>
@@ -3651,25 +2444,7 @@
           <w:sz w:val="24"/>
           <w:szCs w:val="24"/>
         </w:rPr>
-        <w:t xml:space="preserve"> </w:t>
-      </w:r>
-      <w:proofErr w:type="gramStart"/>
-      <w:r>
-        <w:rPr>
-          <w:rFonts w:ascii="Times New Roman" w:eastAsia="Times New Roman" w:hAnsi="Times New Roman" w:cs="Times New Roman"/>
-          <w:sz w:val="24"/>
-          <w:szCs w:val="24"/>
-        </w:rPr>
-        <w:t>The majority of</w:t>
-      </w:r>
-      <w:proofErr w:type="gramEnd"/>
-      <w:r>
-        <w:rPr>
-          <w:rFonts w:ascii="Times New Roman" w:eastAsia="Times New Roman" w:hAnsi="Times New Roman" w:cs="Times New Roman"/>
-          <w:sz w:val="24"/>
-          <w:szCs w:val="24"/>
-        </w:rPr>
-        <w:t xml:space="preserve"> existing clustering techniques in recommender system literature is focused on numerical ratings at the cost of other facets of user behavior, with little consideration of the rich behavioral data associated with categorical features like genre interest, tagging behavior, and content usage patterns. This emphasis on quantitative data is a carryover of past dominance of techniques directed at continuous variables, but it fails to tap the richness of categorical behavior data that tend to be more interpretable and informative than ratings alone.</w:t>
+        <w:t xml:space="preserve"> The majority of existing clustering techniques in recommender system literature is focused on numerical ratings at the cost of other facets of user behavior, with little consideration of the rich behavioral data associated with categorical features like genre interest, tagging behavior, and content usage patterns. This emphasis on quantitative data is a carryover of past dominance of techniques directed at continuous variables, but it fails to tap the richness of categorical behavior data that tend to be more interpretable and informative than ratings alone.</w:t>
       </w:r>
     </w:p>
     <w:p>
@@ -4074,79 +2849,7 @@
           <w:sz w:val="24"/>
           <w:szCs w:val="24"/>
         </w:rPr>
-        <w:t xml:space="preserve">The foundation on which the present research was firmly established is the </w:t>
-      </w:r>
-      <w:proofErr w:type="spellStart"/>
-      <w:r>
-        <w:rPr>
-          <w:rFonts w:ascii="Times New Roman" w:hAnsi="Times New Roman" w:cs="Times New Roman"/>
-          <w:sz w:val="24"/>
-          <w:szCs w:val="24"/>
-        </w:rPr>
-        <w:t>MovieLens</w:t>
-      </w:r>
-      <w:proofErr w:type="spellEnd"/>
-      <w:r>
-        <w:rPr>
-          <w:rFonts w:ascii="Times New Roman" w:hAnsi="Times New Roman" w:cs="Times New Roman"/>
-          <w:sz w:val="24"/>
-          <w:szCs w:val="24"/>
-        </w:rPr>
-        <w:t xml:space="preserve"> 25M dataset, which is a seminal and very well-known benchmark in recommender systems and user behavior research (</w:t>
-      </w:r>
-      <w:proofErr w:type="spellStart"/>
-      <w:r>
-        <w:rPr>
-          <w:rFonts w:ascii="Times New Roman" w:hAnsi="Times New Roman" w:cs="Times New Roman"/>
-          <w:sz w:val="24"/>
-          <w:szCs w:val="24"/>
-        </w:rPr>
-        <w:t>Jannach</w:t>
-      </w:r>
-      <w:proofErr w:type="spellEnd"/>
-      <w:r>
-        <w:rPr>
-          <w:rFonts w:ascii="Times New Roman" w:hAnsi="Times New Roman" w:cs="Times New Roman"/>
-          <w:sz w:val="24"/>
-          <w:szCs w:val="24"/>
-        </w:rPr>
-        <w:t xml:space="preserve"> et al., 2016; Lu et al., 2015). The deliberate selection of this dataset was due to its scale record, innate diversity, and profound granularity, which renders it very appropriate for complex analysis of consumers' tastes in the dynamic digital content context. Maintained and nurtured by </w:t>
-      </w:r>
-      <w:proofErr w:type="spellStart"/>
-      <w:r>
-        <w:rPr>
-          <w:rFonts w:ascii="Times New Roman" w:hAnsi="Times New Roman" w:cs="Times New Roman"/>
-          <w:sz w:val="24"/>
-          <w:szCs w:val="24"/>
-        </w:rPr>
-        <w:t>GroupLens</w:t>
-      </w:r>
-      <w:proofErr w:type="spellEnd"/>
-      <w:r>
-        <w:rPr>
-          <w:rFonts w:ascii="Times New Roman" w:hAnsi="Times New Roman" w:cs="Times New Roman"/>
-          <w:sz w:val="24"/>
-          <w:szCs w:val="24"/>
-        </w:rPr>
-        <w:t xml:space="preserve"> in the University of Minnesota, this public data set is comprised of over 25 million explicit ratings, used across a massive repository of movies, paired with critical metadata that enriches the analytical potential. Its old past and widespread academic use also </w:t>
-      </w:r>
-      <w:proofErr w:type="gramStart"/>
-      <w:r>
-        <w:rPr>
-          <w:rFonts w:ascii="Times New Roman" w:hAnsi="Times New Roman" w:cs="Times New Roman"/>
-          <w:sz w:val="24"/>
-          <w:szCs w:val="24"/>
-        </w:rPr>
-        <w:t>facilitates</w:t>
-      </w:r>
-      <w:proofErr w:type="gramEnd"/>
-      <w:r>
-        <w:rPr>
-          <w:rFonts w:ascii="Times New Roman" w:hAnsi="Times New Roman" w:cs="Times New Roman"/>
-          <w:sz w:val="24"/>
-          <w:szCs w:val="24"/>
-        </w:rPr>
-        <w:t xml:space="preserve"> easier reproduction and comparison across the broader scientific community.</w:t>
+        <w:t>The foundation on which the present research was firmly established is the MovieLens 25M dataset, which is a seminal and very well-known benchmark in recommender systems and user behavior research (Jannach et al., 2016; Lu et al., 2015). The deliberate selection of this dataset was due to its scale record, innate diversity, and profound granularity, which renders it very appropriate for complex analysis of consumers' tastes in the dynamic digital content context. Maintained and nurtured by GroupLens in the University of Minnesota, this public data set is comprised of over 25 million explicit ratings, used across a massive repository of movies, paired with critical metadata that enriches the analytical potential. Its old past and widespread academic use also facilitates easier reproduction and comparison across the broader scientific community.</w:t>
       </w:r>
       <w:r>
         <w:rPr>
@@ -4155,25 +2858,7 @@
           <w:szCs w:val="24"/>
         </w:rPr>
         <w:br/>
-        <w:t xml:space="preserve">The following critical components of the </w:t>
-      </w:r>
-      <w:proofErr w:type="spellStart"/>
-      <w:r>
-        <w:rPr>
-          <w:rFonts w:ascii="Times New Roman" w:hAnsi="Times New Roman" w:cs="Times New Roman"/>
-          <w:sz w:val="24"/>
-          <w:szCs w:val="24"/>
-        </w:rPr>
-        <w:t>MovieLens</w:t>
-      </w:r>
-      <w:proofErr w:type="spellEnd"/>
-      <w:r>
-        <w:rPr>
-          <w:rFonts w:ascii="Times New Roman" w:hAnsi="Times New Roman" w:cs="Times New Roman"/>
-          <w:sz w:val="24"/>
-          <w:szCs w:val="24"/>
-        </w:rPr>
-        <w:t xml:space="preserve"> 25M dataset were the primary drivers for the completion of this project:</w:t>
+        <w:t>The following critical components of the MovieLens 25M dataset were the primary drivers for the completion of this project:</w:t>
       </w:r>
     </w:p>
     <w:p>
@@ -4205,47 +2890,7 @@
           <w:szCs w:val="24"/>
           <w:lang w:val="en-US"/>
         </w:rPr>
-        <w:t xml:space="preserve">: This fundamental file is the source text from which the user interaction information is derived. Each row precisely captures the overt sentiment of one user towards one film, a unique </w:t>
-      </w:r>
-      <w:proofErr w:type="spellStart"/>
-      <w:r>
-        <w:rPr>
-          <w:rFonts w:ascii="Times New Roman" w:hAnsi="Times New Roman" w:cs="Times New Roman"/>
-          <w:sz w:val="24"/>
-          <w:szCs w:val="24"/>
-          <w:lang w:val="en-US"/>
-        </w:rPr>
-        <w:t>userId</w:t>
-      </w:r>
-      <w:proofErr w:type="spellEnd"/>
-      <w:r>
-        <w:rPr>
-          <w:rFonts w:ascii="Times New Roman" w:hAnsi="Times New Roman" w:cs="Times New Roman"/>
-          <w:sz w:val="24"/>
-          <w:szCs w:val="24"/>
-          <w:lang w:val="en-US"/>
-        </w:rPr>
-        <w:t xml:space="preserve">, a </w:t>
-      </w:r>
-      <w:proofErr w:type="spellStart"/>
-      <w:r>
-        <w:rPr>
-          <w:rFonts w:ascii="Times New Roman" w:hAnsi="Times New Roman" w:cs="Times New Roman"/>
-          <w:sz w:val="24"/>
-          <w:szCs w:val="24"/>
-          <w:lang w:val="en-US"/>
-        </w:rPr>
-        <w:t>movieId</w:t>
-      </w:r>
-      <w:proofErr w:type="spellEnd"/>
-      <w:r>
-        <w:rPr>
-          <w:rFonts w:ascii="Times New Roman" w:hAnsi="Times New Roman" w:cs="Times New Roman"/>
-          <w:sz w:val="24"/>
-          <w:szCs w:val="24"/>
-          <w:lang w:val="en-US"/>
-        </w:rPr>
-        <w:t>, a numerical rating (0.5 to 5.0 stars), and a timestamp of the actual time left for the rating. This vast collection of overt likes and dislikes provides the raw behavioral signals used to model personal tastes and mass consumption patterns, both of which are essential to guide recommendation models.</w:t>
+        <w:t>: This fundamental file is the source text from which the user interaction information is derived. Each row precisely captures the overt sentiment of one user towards one film, a unique userId, a movieId, a numerical rating (0.5 to 5.0 stars), and a timestamp of the actual time left for the rating. This vast collection of overt likes and dislikes provides the raw behavioral signals used to model personal tastes and mass consumption patterns, both of which are essential to guide recommendation models.</w:t>
       </w:r>
     </w:p>
     <w:p>
@@ -4277,47 +2922,7 @@
           <w:szCs w:val="24"/>
           <w:lang w:val="en-US"/>
         </w:rPr>
-        <w:t xml:space="preserve">: This ancillary dataset includes principal descriptive attributes for all the movies. Key columns are the </w:t>
-      </w:r>
-      <w:proofErr w:type="spellStart"/>
-      <w:r>
-        <w:rPr>
-          <w:rFonts w:ascii="Times New Roman" w:hAnsi="Times New Roman" w:cs="Times New Roman"/>
-          <w:sz w:val="24"/>
-          <w:szCs w:val="24"/>
-          <w:lang w:val="en-US"/>
-        </w:rPr>
-        <w:t>movieId</w:t>
-      </w:r>
-      <w:proofErr w:type="spellEnd"/>
-      <w:r>
-        <w:rPr>
-          <w:rFonts w:ascii="Times New Roman" w:hAnsi="Times New Roman" w:cs="Times New Roman"/>
-          <w:sz w:val="24"/>
-          <w:szCs w:val="24"/>
-          <w:lang w:val="en-US"/>
-        </w:rPr>
-        <w:t xml:space="preserve"> (serving as the gateway to the ratings data), the title (typically followed by its release year to disambiguate), and notably, the genres. The genre feature is a multi-label categorical attribute, i.e., a single movie belongs to more than one category (e.g., "</w:t>
-      </w:r>
-      <w:proofErr w:type="spellStart"/>
-      <w:r>
-        <w:rPr>
-          <w:rFonts w:ascii="Times New Roman" w:hAnsi="Times New Roman" w:cs="Times New Roman"/>
-          <w:sz w:val="24"/>
-          <w:szCs w:val="24"/>
-          <w:lang w:val="en-US"/>
-        </w:rPr>
-        <w:t>Action|Adventure|Sci-Fi</w:t>
-      </w:r>
-      <w:proofErr w:type="spellEnd"/>
-      <w:r>
-        <w:rPr>
-          <w:rFonts w:ascii="Times New Roman" w:hAnsi="Times New Roman" w:cs="Times New Roman"/>
-          <w:sz w:val="24"/>
-          <w:szCs w:val="24"/>
-          <w:lang w:val="en-US"/>
-        </w:rPr>
-        <w:t>"). Such native multi-label character renders it a very rich dataset for studying movie attributes and is the primary input to the K-Mode clustering and the subsequent association rule mining based on shared genre membership.</w:t>
+        <w:t>: This ancillary dataset includes principal descriptive attributes for all the movies. Key columns are the movieId (serving as the gateway to the ratings data), the title (typically followed by its release year to disambiguate), and notably, the genres. The genre feature is a multi-label categorical attribute, i.e., a single movie belongs to more than one category (e.g., "Action|Adventure|Sci-Fi"). Such native multi-label character renders it a very rich dataset for studying movie attributes and is the primary input to the K-Mode clustering and the subsequent association rule mining based on shared genre membership.</w:t>
       </w:r>
     </w:p>
     <w:p>
@@ -4349,67 +2954,7 @@
           <w:szCs w:val="24"/>
           <w:lang w:val="en-US"/>
         </w:rPr>
-        <w:t xml:space="preserve">: This comprises user-generated textual tags for movies, along with the corresponding </w:t>
-      </w:r>
-      <w:proofErr w:type="spellStart"/>
-      <w:r>
-        <w:rPr>
-          <w:rFonts w:ascii="Times New Roman" w:hAnsi="Times New Roman" w:cs="Times New Roman"/>
-          <w:sz w:val="24"/>
-          <w:szCs w:val="24"/>
-          <w:lang w:val="en-US"/>
-        </w:rPr>
-        <w:t>userId</w:t>
-      </w:r>
-      <w:proofErr w:type="spellEnd"/>
-      <w:r>
-        <w:rPr>
-          <w:rFonts w:ascii="Times New Roman" w:hAnsi="Times New Roman" w:cs="Times New Roman"/>
-          <w:sz w:val="24"/>
-          <w:szCs w:val="24"/>
-          <w:lang w:val="en-US"/>
-        </w:rPr>
-        <w:t xml:space="preserve">, </w:t>
-      </w:r>
-      <w:proofErr w:type="spellStart"/>
-      <w:r>
-        <w:rPr>
-          <w:rFonts w:ascii="Times New Roman" w:hAnsi="Times New Roman" w:cs="Times New Roman"/>
-          <w:sz w:val="24"/>
-          <w:szCs w:val="24"/>
-          <w:lang w:val="en-US"/>
-        </w:rPr>
-        <w:t>movieId</w:t>
-      </w:r>
-      <w:proofErr w:type="spellEnd"/>
-      <w:r>
-        <w:rPr>
-          <w:rFonts w:ascii="Times New Roman" w:hAnsi="Times New Roman" w:cs="Times New Roman"/>
-          <w:sz w:val="24"/>
-          <w:szCs w:val="24"/>
-          <w:lang w:val="en-US"/>
-        </w:rPr>
-        <w:t xml:space="preserve">, and timestamp. Although not directly incorporated into the K-Mode or </w:t>
-      </w:r>
-      <w:proofErr w:type="spellStart"/>
-      <w:r>
-        <w:rPr>
-          <w:rFonts w:ascii="Times New Roman" w:hAnsi="Times New Roman" w:cs="Times New Roman"/>
-          <w:sz w:val="24"/>
-          <w:szCs w:val="24"/>
-          <w:lang w:val="en-US"/>
-        </w:rPr>
-        <w:t>Apriori</w:t>
-      </w:r>
-      <w:proofErr w:type="spellEnd"/>
-      <w:r>
-        <w:rPr>
-          <w:rFonts w:ascii="Times New Roman" w:hAnsi="Times New Roman" w:cs="Times New Roman"/>
-          <w:sz w:val="24"/>
-          <w:szCs w:val="24"/>
-          <w:lang w:val="en-US"/>
-        </w:rPr>
-        <w:t xml:space="preserve"> algorithms in this specific study (due to the limited focus on genres for clustering and rule extraction), the presence of the same in the dataset underlines the potential for future applications </w:t>
+        <w:t xml:space="preserve">: This comprises user-generated textual tags for movies, along with the corresponding userId, movieId, and timestamp. Although not directly incorporated into the K-Mode or Apriori algorithms in this specific study (due to the limited focus on genres for clustering and rule extraction), the presence of the same in the dataset underlines the potential for future applications </w:t>
       </w:r>
       <w:r>
         <w:rPr>
@@ -4463,140 +3008,40 @@
           <w:szCs w:val="24"/>
           <w:lang w:val="en-US"/>
         </w:rPr>
-        <w:t xml:space="preserve">: This information is a bridge, establishing connections between </w:t>
-      </w:r>
-      <w:proofErr w:type="spellStart"/>
-      <w:r>
-        <w:rPr>
-          <w:rFonts w:ascii="Times New Roman" w:hAnsi="Times New Roman" w:cs="Times New Roman"/>
-          <w:sz w:val="24"/>
-          <w:szCs w:val="24"/>
-          <w:lang w:val="en-US"/>
-        </w:rPr>
-        <w:t>MovieLens</w:t>
-      </w:r>
-      <w:proofErr w:type="spellEnd"/>
-      <w:r>
-        <w:rPr>
-          <w:rFonts w:ascii="Times New Roman" w:hAnsi="Times New Roman" w:cs="Times New Roman"/>
-          <w:sz w:val="24"/>
-          <w:szCs w:val="24"/>
-          <w:lang w:val="en-US"/>
-        </w:rPr>
-        <w:t xml:space="preserve"> movie IDs and external database IDs, i.e., </w:t>
-      </w:r>
-      <w:proofErr w:type="spellStart"/>
-      <w:r>
-        <w:rPr>
-          <w:rFonts w:ascii="Times New Roman" w:hAnsi="Times New Roman" w:cs="Times New Roman"/>
-          <w:sz w:val="24"/>
-          <w:szCs w:val="24"/>
-          <w:lang w:val="en-US"/>
-        </w:rPr>
-        <w:t>imdbId</w:t>
-      </w:r>
-      <w:proofErr w:type="spellEnd"/>
-      <w:r>
-        <w:rPr>
-          <w:rFonts w:ascii="Times New Roman" w:hAnsi="Times New Roman" w:cs="Times New Roman"/>
-          <w:sz w:val="24"/>
-          <w:szCs w:val="24"/>
-          <w:lang w:val="en-US"/>
-        </w:rPr>
-        <w:t xml:space="preserve"> (Internet Movie Database) and </w:t>
-      </w:r>
-      <w:proofErr w:type="spellStart"/>
-      <w:r>
-        <w:rPr>
-          <w:rFonts w:ascii="Times New Roman" w:hAnsi="Times New Roman" w:cs="Times New Roman"/>
-          <w:sz w:val="24"/>
-          <w:szCs w:val="24"/>
-          <w:lang w:val="en-US"/>
-        </w:rPr>
-        <w:t>tmdbId</w:t>
-      </w:r>
-      <w:proofErr w:type="spellEnd"/>
-      <w:r>
-        <w:rPr>
-          <w:rFonts w:ascii="Times New Roman" w:hAnsi="Times New Roman" w:cs="Times New Roman"/>
-          <w:sz w:val="24"/>
-          <w:szCs w:val="24"/>
-          <w:lang w:val="en-US"/>
-        </w:rPr>
-        <w:t xml:space="preserve"> (The Movie Database). Not used directly for the main analytical processes of this project, the fact that it exists in the data acquisition pipeline is an indicator of the provision of thought for potential means by which the dataset could be augmented with external film information or cross-checked against larger filmography datasets.</w:t>
-      </w:r>
-    </w:p>
-    <w:p>
-      <w:pPr>
-        <w:spacing w:line="360" w:lineRule="auto"/>
-        <w:jc w:val="both"/>
-        <w:rPr>
-          <w:rFonts w:ascii="Times New Roman" w:hAnsi="Times New Roman" w:cs="Times New Roman"/>
-          <w:sz w:val="24"/>
-          <w:szCs w:val="24"/>
-          <w:lang w:val="en-US"/>
-        </w:rPr>
-      </w:pPr>
-    </w:p>
-    <w:p>
-      <w:pPr>
-        <w:spacing w:line="360" w:lineRule="auto"/>
-        <w:jc w:val="both"/>
-        <w:rPr>
-          <w:rFonts w:ascii="Times New Roman" w:hAnsi="Times New Roman" w:cs="Times New Roman"/>
-          <w:sz w:val="24"/>
-          <w:szCs w:val="24"/>
-          <w:lang w:val="en-US"/>
-        </w:rPr>
-      </w:pPr>
-      <w:r>
-        <w:rPr>
-          <w:rFonts w:ascii="Times New Roman" w:hAnsi="Times New Roman" w:cs="Times New Roman"/>
-          <w:sz w:val="24"/>
-          <w:szCs w:val="24"/>
-          <w:lang w:val="en-US"/>
-        </w:rPr>
-        <w:t xml:space="preserve">The significance of the </w:t>
-      </w:r>
-      <w:proofErr w:type="spellStart"/>
-      <w:r>
-        <w:rPr>
-          <w:rFonts w:ascii="Times New Roman" w:hAnsi="Times New Roman" w:cs="Times New Roman"/>
-          <w:sz w:val="24"/>
-          <w:szCs w:val="24"/>
-          <w:lang w:val="en-US"/>
-        </w:rPr>
-        <w:t>MovieLens</w:t>
-      </w:r>
-      <w:proofErr w:type="spellEnd"/>
-      <w:r>
-        <w:rPr>
-          <w:rFonts w:ascii="Times New Roman" w:hAnsi="Times New Roman" w:cs="Times New Roman"/>
-          <w:sz w:val="24"/>
-          <w:szCs w:val="24"/>
-          <w:lang w:val="en-US"/>
-        </w:rPr>
-        <w:t xml:space="preserve"> dataset transcends just its size; it mirrors the evolved dynamics that characterize </w:t>
-      </w:r>
-      <w:proofErr w:type="gramStart"/>
-      <w:r>
-        <w:rPr>
-          <w:rFonts w:ascii="Times New Roman" w:hAnsi="Times New Roman" w:cs="Times New Roman"/>
-          <w:sz w:val="24"/>
-          <w:szCs w:val="24"/>
-          <w:lang w:val="en-US"/>
-        </w:rPr>
-        <w:t>the contemporary</w:t>
-      </w:r>
-      <w:proofErr w:type="gramEnd"/>
-      <w:r>
-        <w:rPr>
-          <w:rFonts w:ascii="Times New Roman" w:hAnsi="Times New Roman" w:cs="Times New Roman"/>
-          <w:sz w:val="24"/>
-          <w:szCs w:val="24"/>
-          <w:lang w:val="en-US"/>
-        </w:rPr>
-        <w:t xml:space="preserve"> digital consumer and entertainment landscapes. In these landscapes, platforms become increasingly reliant on the strategic procurement and sophisticated examination of vast data streams in a bid to successfully traverse the rich landscape of diverse user interests as well as constantly evolving content consumption models. This judicious selection of a robust and representative dataset was the working assumption upon which the project aimed to create a data-driven framework for actualizing and optimizing retail experiences via predictive analytics.</w:t>
+        <w:t>: This information is a bridge, establishing connections between MovieLens movie IDs and external database IDs, i.e., imdbId (Internet Movie Database) and tmdbId (The Movie Database). Not used directly for the main analytical processes of this project, the fact that it exists in the data acquisition pipeline is an indicator of the provision of thought for potential means by which the dataset could be augmented with external film information or cross-checked against larger filmography datasets.</w:t>
+      </w:r>
+    </w:p>
+    <w:p>
+      <w:pPr>
+        <w:spacing w:line="360" w:lineRule="auto"/>
+        <w:jc w:val="both"/>
+        <w:rPr>
+          <w:rFonts w:ascii="Times New Roman" w:hAnsi="Times New Roman" w:cs="Times New Roman"/>
+          <w:sz w:val="24"/>
+          <w:szCs w:val="24"/>
+          <w:lang w:val="en-US"/>
+        </w:rPr>
+      </w:pPr>
+    </w:p>
+    <w:p>
+      <w:pPr>
+        <w:spacing w:line="360" w:lineRule="auto"/>
+        <w:jc w:val="both"/>
+        <w:rPr>
+          <w:rFonts w:ascii="Times New Roman" w:hAnsi="Times New Roman" w:cs="Times New Roman"/>
+          <w:sz w:val="24"/>
+          <w:szCs w:val="24"/>
+          <w:lang w:val="en-US"/>
+        </w:rPr>
+      </w:pPr>
+      <w:r>
+        <w:rPr>
+          <w:rFonts w:ascii="Times New Roman" w:hAnsi="Times New Roman" w:cs="Times New Roman"/>
+          <w:sz w:val="24"/>
+          <w:szCs w:val="24"/>
+          <w:lang w:val="en-US"/>
+        </w:rPr>
+        <w:t>The significance of the MovieLens dataset transcends just its size; it mirrors the evolved dynamics that characterize the contemporary digital consumer and entertainment landscapes. In these landscapes, platforms become increasingly reliant on the strategic procurement and sophisticated examination of vast data streams in a bid to successfully traverse the rich landscape of diverse user interests as well as constantly evolving content consumption models. This judicious selection of a robust and representative dataset was the working assumption upon which the project aimed to create a data-driven framework for actualizing and optimizing retail experiences via predictive analytics.</w:t>
       </w:r>
     </w:p>
     <w:p>
@@ -4654,27 +3099,7 @@
           <w:szCs w:val="24"/>
           <w:lang w:val="en-US"/>
         </w:rPr>
-        <w:t xml:space="preserve">The effectiveness and validity of any data-driven analytical effort are inherently dependent on the quality and proper preparation of the original data. Therefore, a strict and ordered data preprocessing workflow was an absolute necessity, carefully constructed to remove dirt and inconsistencies from the original </w:t>
-      </w:r>
-      <w:proofErr w:type="spellStart"/>
-      <w:r>
-        <w:rPr>
-          <w:rFonts w:ascii="Times New Roman" w:hAnsi="Times New Roman" w:cs="Times New Roman"/>
-          <w:sz w:val="24"/>
-          <w:szCs w:val="24"/>
-          <w:lang w:val="en-US"/>
-        </w:rPr>
-        <w:t>MovieLens</w:t>
-      </w:r>
-      <w:proofErr w:type="spellEnd"/>
-      <w:r>
-        <w:rPr>
-          <w:rFonts w:ascii="Times New Roman" w:hAnsi="Times New Roman" w:cs="Times New Roman"/>
-          <w:sz w:val="24"/>
-          <w:szCs w:val="24"/>
-          <w:lang w:val="en-US"/>
-        </w:rPr>
-        <w:t xml:space="preserve"> data, thereby transforming and standardizing it to its utmost suitability for the subsequent stages of analytical modeling. This data integrity is important, as faulty input data inevitably leads to inconclusive or deceptive results, irrespective of the level of quality in the used analytical models.</w:t>
+        <w:t>The effectiveness and validity of any data-driven analytical effort are inherently dependent on the quality and proper preparation of the original data. Therefore, a strict and ordered data preprocessing workflow was an absolute necessity, carefully constructed to remove dirt and inconsistencies from the original MovieLens data, thereby transforming and standardizing it to its utmost suitability for the subsequent stages of analytical modeling. This data integrity is important, as faulty input data inevitably leads to inconclusive or deceptive results, irrespective of the level of quality in the used analytical models.</w:t>
       </w:r>
     </w:p>
     <w:p>
@@ -4758,27 +3183,7 @@
           <w:lang w:val="en-US"/>
         </w:rPr>
         <w:lastRenderedPageBreak/>
-        <w:t xml:space="preserve">by default. To enable improvement in interpretability and accommodation for any potential temporal analysis (for example, identifying trends in particular time periods, albeit not the primary analytic objective of this project), these numerical timestamps were automatically converted into a normalized, human-interpretable datetime object representation. This transformation helps not only </w:t>
-      </w:r>
-      <w:proofErr w:type="gramStart"/>
-      <w:r>
-        <w:rPr>
-          <w:rFonts w:ascii="Times New Roman" w:hAnsi="Times New Roman" w:cs="Times New Roman"/>
-          <w:sz w:val="24"/>
-          <w:szCs w:val="24"/>
-          <w:lang w:val="en-US"/>
-        </w:rPr>
-        <w:t>exploratory</w:t>
-      </w:r>
-      <w:proofErr w:type="gramEnd"/>
-      <w:r>
-        <w:rPr>
-          <w:rFonts w:ascii="Times New Roman" w:hAnsi="Times New Roman" w:cs="Times New Roman"/>
-          <w:sz w:val="24"/>
-          <w:szCs w:val="24"/>
-          <w:lang w:val="en-US"/>
-        </w:rPr>
-        <w:t xml:space="preserve"> visualizations but also simplifies any eventual time-series feature engineering or data filtering based on specific dates or ranges.</w:t>
+        <w:t>by default. To enable improvement in interpretability and accommodation for any potential temporal analysis (for example, identifying trends in particular time periods, albeit not the primary analytic objective of this project), these numerical timestamps were automatically converted into a normalized, human-interpretable datetime object representation. This transformation helps not only exploratory visualizations but also simplifies any eventual time-series feature engineering or data filtering based on specific dates or ranges.</w:t>
       </w:r>
     </w:p>
     <w:p>
@@ -4831,147 +3236,7 @@
           <w:szCs w:val="24"/>
           <w:lang w:val="en-US"/>
         </w:rPr>
-        <w:t xml:space="preserve"> A rigorous and complete check for missing values was performed stringently for all loaded </w:t>
-      </w:r>
-      <w:proofErr w:type="spellStart"/>
-      <w:r>
-        <w:rPr>
-          <w:rFonts w:ascii="Times New Roman" w:hAnsi="Times New Roman" w:cs="Times New Roman"/>
-          <w:sz w:val="24"/>
-          <w:szCs w:val="24"/>
-          <w:lang w:val="en-US"/>
-        </w:rPr>
-        <w:t>dataframes</w:t>
-      </w:r>
-      <w:proofErr w:type="spellEnd"/>
-      <w:r>
-        <w:rPr>
-          <w:rFonts w:ascii="Times New Roman" w:hAnsi="Times New Roman" w:cs="Times New Roman"/>
-          <w:sz w:val="24"/>
-          <w:szCs w:val="24"/>
-          <w:lang w:val="en-US"/>
-        </w:rPr>
-        <w:t xml:space="preserve"> (ratings, movies, tags, links). The diagnostic process revealed a predominantly clean dataset, with the sole exception of a small number of 8 missing records in the </w:t>
-      </w:r>
-      <w:proofErr w:type="spellStart"/>
-      <w:r>
-        <w:rPr>
-          <w:rFonts w:ascii="Times New Roman" w:hAnsi="Times New Roman" w:cs="Times New Roman"/>
-          <w:sz w:val="24"/>
-          <w:szCs w:val="24"/>
-          <w:lang w:val="en-US"/>
-        </w:rPr>
-        <w:t>tmdbId</w:t>
-      </w:r>
-      <w:proofErr w:type="spellEnd"/>
-      <w:r>
-        <w:rPr>
-          <w:rFonts w:ascii="Times New Roman" w:hAnsi="Times New Roman" w:cs="Times New Roman"/>
-          <w:sz w:val="24"/>
-          <w:szCs w:val="24"/>
-          <w:lang w:val="en-US"/>
-        </w:rPr>
-        <w:t xml:space="preserve"> column of the links.csv </w:t>
-      </w:r>
-      <w:proofErr w:type="spellStart"/>
-      <w:r>
-        <w:rPr>
-          <w:rFonts w:ascii="Times New Roman" w:hAnsi="Times New Roman" w:cs="Times New Roman"/>
-          <w:sz w:val="24"/>
-          <w:szCs w:val="24"/>
-          <w:lang w:val="en-US"/>
-        </w:rPr>
-        <w:t>dataframe</w:t>
-      </w:r>
-      <w:proofErr w:type="spellEnd"/>
-      <w:r>
-        <w:rPr>
-          <w:rFonts w:ascii="Times New Roman" w:hAnsi="Times New Roman" w:cs="Times New Roman"/>
-          <w:sz w:val="24"/>
-          <w:szCs w:val="24"/>
-          <w:lang w:val="en-US"/>
-        </w:rPr>
-        <w:t>. Notably, all the additional main columns—</w:t>
-      </w:r>
-      <w:proofErr w:type="spellStart"/>
-      <w:r>
-        <w:rPr>
-          <w:rFonts w:ascii="Times New Roman" w:hAnsi="Times New Roman" w:cs="Times New Roman"/>
-          <w:sz w:val="24"/>
-          <w:szCs w:val="24"/>
-          <w:lang w:val="en-US"/>
-        </w:rPr>
-        <w:t>userId</w:t>
-      </w:r>
-      <w:proofErr w:type="spellEnd"/>
-      <w:r>
-        <w:rPr>
-          <w:rFonts w:ascii="Times New Roman" w:hAnsi="Times New Roman" w:cs="Times New Roman"/>
-          <w:sz w:val="24"/>
-          <w:szCs w:val="24"/>
-          <w:lang w:val="en-US"/>
-        </w:rPr>
-        <w:t xml:space="preserve">, </w:t>
-      </w:r>
-      <w:proofErr w:type="spellStart"/>
-      <w:r>
-        <w:rPr>
-          <w:rFonts w:ascii="Times New Roman" w:hAnsi="Times New Roman" w:cs="Times New Roman"/>
-          <w:sz w:val="24"/>
-          <w:szCs w:val="24"/>
-          <w:lang w:val="en-US"/>
-        </w:rPr>
-        <w:t>movieId</w:t>
-      </w:r>
-      <w:proofErr w:type="spellEnd"/>
-      <w:r>
-        <w:rPr>
-          <w:rFonts w:ascii="Times New Roman" w:hAnsi="Times New Roman" w:cs="Times New Roman"/>
-          <w:sz w:val="24"/>
-          <w:szCs w:val="24"/>
-          <w:lang w:val="en-US"/>
-        </w:rPr>
-        <w:t xml:space="preserve">, rating, title, and genres—that were strictly required for the execution of the basic K-Mode and </w:t>
-      </w:r>
-      <w:proofErr w:type="spellStart"/>
-      <w:r>
-        <w:rPr>
-          <w:rFonts w:ascii="Times New Roman" w:hAnsi="Times New Roman" w:cs="Times New Roman"/>
-          <w:sz w:val="24"/>
-          <w:szCs w:val="24"/>
-          <w:lang w:val="en-US"/>
-        </w:rPr>
-        <w:t>Apriori</w:t>
-      </w:r>
-      <w:proofErr w:type="spellEnd"/>
-      <w:r>
-        <w:rPr>
-          <w:rFonts w:ascii="Times New Roman" w:hAnsi="Times New Roman" w:cs="Times New Roman"/>
-          <w:sz w:val="24"/>
-          <w:szCs w:val="24"/>
-          <w:lang w:val="en-US"/>
-        </w:rPr>
-        <w:t xml:space="preserve"> algorithms, were confirmed to be entirely complete and clear of any missing values. As the </w:t>
-      </w:r>
-      <w:proofErr w:type="spellStart"/>
-      <w:r>
-        <w:rPr>
-          <w:rFonts w:ascii="Times New Roman" w:hAnsi="Times New Roman" w:cs="Times New Roman"/>
-          <w:sz w:val="24"/>
-          <w:szCs w:val="24"/>
-          <w:lang w:val="en-US"/>
-        </w:rPr>
-        <w:t>tmdbId</w:t>
-      </w:r>
-      <w:proofErr w:type="spellEnd"/>
-      <w:r>
-        <w:rPr>
-          <w:rFonts w:ascii="Times New Roman" w:hAnsi="Times New Roman" w:cs="Times New Roman"/>
-          <w:sz w:val="24"/>
-          <w:szCs w:val="24"/>
-          <w:lang w:val="en-US"/>
-        </w:rPr>
-        <w:t xml:space="preserve"> column was not directly included in the basic analytical models for clustering or rule mining, these single missing values were rightfully deemed non-vital and therefore were not imputed. This option preserved the native character of the native dataset and circumvented the introduction of potential biases most likely to originate from non-discriminative imputation techniques.</w:t>
+        <w:t xml:space="preserve"> A rigorous and complete check for missing values was performed stringently for all loaded dataframes (ratings, movies, tags, links). The diagnostic process revealed a predominantly clean dataset, with the sole exception of a small number of 8 missing records in the tmdbId column of the links.csv dataframe. Notably, all the additional main columns—userId, movieId, rating, title, and genres—that were strictly required for the execution of the basic K-Mode and Apriori algorithms, were confirmed to be entirely complete and clear of any missing values. As the tmdbId column was not directly included in the basic analytical models for clustering or rule mining, these single missing values were rightfully deemed non-vital and therefore were not imputed. This option preserved the native character of the native dataset and circumvented the introduction of potential biases most likely to originate from non-discriminative imputation techniques.</w:t>
       </w:r>
     </w:p>
     <w:p>
@@ -5024,27 +3289,7 @@
           <w:szCs w:val="24"/>
           <w:lang w:val="en-US"/>
         </w:rPr>
-        <w:t xml:space="preserve">To maintain integrity and prevent manipulation of knowledge or statistical anomaly, a strict verification and elimination process of duplicates was systematically followed. This particularly applied to the tags.csv data whose duplicates would otherwise skew frequency counts. All duplicate entries were eliminated with extreme care such that every data point became </w:t>
-      </w:r>
-      <w:proofErr w:type="gramStart"/>
-      <w:r>
-        <w:rPr>
-          <w:rFonts w:ascii="Times New Roman" w:hAnsi="Times New Roman" w:cs="Times New Roman"/>
-          <w:sz w:val="24"/>
-          <w:szCs w:val="24"/>
-          <w:lang w:val="en-US"/>
-        </w:rPr>
-        <w:t>an</w:t>
-      </w:r>
-      <w:proofErr w:type="gramEnd"/>
-      <w:r>
-        <w:rPr>
-          <w:rFonts w:ascii="Times New Roman" w:hAnsi="Times New Roman" w:cs="Times New Roman"/>
-          <w:sz w:val="24"/>
-          <w:szCs w:val="24"/>
-          <w:lang w:val="en-US"/>
-        </w:rPr>
-        <w:t xml:space="preserve"> one-of-a-kind and unique observation and thereby preserved integrity of future analyses.</w:t>
+        <w:t>To maintain integrity and prevent manipulation of knowledge or statistical anomaly, a strict verification and elimination process of duplicates was systematically followed. This particularly applied to the tags.csv data whose duplicates would otherwise skew frequency counts. All duplicate entries were eliminated with extreme care such that every data point became an one-of-a-kind and unique observation and thereby preserved integrity of future analyses.</w:t>
       </w:r>
     </w:p>
     <w:p>
@@ -5097,107 +3342,7 @@
           <w:szCs w:val="24"/>
           <w:lang w:val="en-US"/>
         </w:rPr>
-        <w:t xml:space="preserve"> A pivotal step was the intelligent merging of the ratings and </w:t>
-      </w:r>
-      <w:proofErr w:type="gramStart"/>
-      <w:r>
-        <w:rPr>
-          <w:rFonts w:ascii="Times New Roman" w:hAnsi="Times New Roman" w:cs="Times New Roman"/>
-          <w:sz w:val="24"/>
-          <w:szCs w:val="24"/>
-          <w:lang w:val="en-US"/>
-        </w:rPr>
-        <w:t>movies</w:t>
-      </w:r>
-      <w:proofErr w:type="gramEnd"/>
-      <w:r>
-        <w:rPr>
-          <w:rFonts w:ascii="Times New Roman" w:hAnsi="Times New Roman" w:cs="Times New Roman"/>
-          <w:sz w:val="24"/>
-          <w:szCs w:val="24"/>
-          <w:lang w:val="en-US"/>
-        </w:rPr>
-        <w:t xml:space="preserve"> </w:t>
-      </w:r>
-      <w:proofErr w:type="spellStart"/>
-      <w:r>
-        <w:rPr>
-          <w:rFonts w:ascii="Times New Roman" w:hAnsi="Times New Roman" w:cs="Times New Roman"/>
-          <w:sz w:val="24"/>
-          <w:szCs w:val="24"/>
-          <w:lang w:val="en-US"/>
-        </w:rPr>
-        <w:t>dataframes</w:t>
-      </w:r>
-      <w:proofErr w:type="spellEnd"/>
-      <w:r>
-        <w:rPr>
-          <w:rFonts w:ascii="Times New Roman" w:hAnsi="Times New Roman" w:cs="Times New Roman"/>
-          <w:sz w:val="24"/>
-          <w:szCs w:val="24"/>
-          <w:lang w:val="en-US"/>
-        </w:rPr>
-        <w:t xml:space="preserve">. This was achieved through the common </w:t>
-      </w:r>
-      <w:proofErr w:type="spellStart"/>
-      <w:r>
-        <w:rPr>
-          <w:rFonts w:ascii="Times New Roman" w:hAnsi="Times New Roman" w:cs="Times New Roman"/>
-          <w:sz w:val="24"/>
-          <w:szCs w:val="24"/>
-          <w:lang w:val="en-US"/>
-        </w:rPr>
-        <w:t>movieId</w:t>
-      </w:r>
-      <w:proofErr w:type="spellEnd"/>
-      <w:r>
-        <w:rPr>
-          <w:rFonts w:ascii="Times New Roman" w:hAnsi="Times New Roman" w:cs="Times New Roman"/>
-          <w:sz w:val="24"/>
-          <w:szCs w:val="24"/>
-          <w:lang w:val="en-US"/>
-        </w:rPr>
-        <w:t xml:space="preserve"> identifier to form a combined </w:t>
-      </w:r>
-      <w:proofErr w:type="spellStart"/>
-      <w:r>
-        <w:rPr>
-          <w:rFonts w:ascii="Times New Roman" w:hAnsi="Times New Roman" w:cs="Times New Roman"/>
-          <w:sz w:val="24"/>
-          <w:szCs w:val="24"/>
-          <w:lang w:val="en-US"/>
-        </w:rPr>
-        <w:t>ratings_movies</w:t>
-      </w:r>
-      <w:proofErr w:type="spellEnd"/>
-      <w:r>
-        <w:rPr>
-          <w:rFonts w:ascii="Times New Roman" w:hAnsi="Times New Roman" w:cs="Times New Roman"/>
-          <w:sz w:val="24"/>
-          <w:szCs w:val="24"/>
-          <w:lang w:val="en-US"/>
-        </w:rPr>
-        <w:t xml:space="preserve"> </w:t>
-      </w:r>
-      <w:proofErr w:type="spellStart"/>
-      <w:r>
-        <w:rPr>
-          <w:rFonts w:ascii="Times New Roman" w:hAnsi="Times New Roman" w:cs="Times New Roman"/>
-          <w:sz w:val="24"/>
-          <w:szCs w:val="24"/>
-          <w:lang w:val="en-US"/>
-        </w:rPr>
-        <w:t>dataframe</w:t>
-      </w:r>
-      <w:proofErr w:type="spellEnd"/>
-      <w:r>
-        <w:rPr>
-          <w:rFonts w:ascii="Times New Roman" w:hAnsi="Times New Roman" w:cs="Times New Roman"/>
-          <w:sz w:val="24"/>
-          <w:szCs w:val="24"/>
-          <w:lang w:val="en-US"/>
-        </w:rPr>
-        <w:t xml:space="preserve">. This enriched dataset formed the input basis for the following analytical stages, offering a general overview combining implicit user opinion (ratings) with informative movie attributes (titles and genres). Also, the genres column, presented in the </w:t>
+        <w:t xml:space="preserve"> A pivotal step was the intelligent merging of the ratings and movies dataframes. This was achieved through the common movieId identifier to form a combined ratings_movies dataframe. This enriched dataset formed the input basis for the following analytical stages, offering a general overview combining implicit user opinion (ratings) with informative movie attributes (titles and genres). Also, the genres column, presented in the </w:t>
       </w:r>
       <w:r>
         <w:rPr>
@@ -5207,27 +3352,7 @@
           <w:lang w:val="en-US"/>
         </w:rPr>
         <w:lastRenderedPageBreak/>
-        <w:t>initial state as a pipe-separated string (for example, "</w:t>
-      </w:r>
-      <w:proofErr w:type="spellStart"/>
-      <w:r>
-        <w:rPr>
-          <w:rFonts w:ascii="Times New Roman" w:hAnsi="Times New Roman" w:cs="Times New Roman"/>
-          <w:sz w:val="24"/>
-          <w:szCs w:val="24"/>
-          <w:lang w:val="en-US"/>
-        </w:rPr>
-        <w:t>Action|Adventure|Sci-Fi</w:t>
-      </w:r>
-      <w:proofErr w:type="spellEnd"/>
-      <w:r>
-        <w:rPr>
-          <w:rFonts w:ascii="Times New Roman" w:hAnsi="Times New Roman" w:cs="Times New Roman"/>
-          <w:sz w:val="24"/>
-          <w:szCs w:val="24"/>
-          <w:lang w:val="en-US"/>
-        </w:rPr>
-        <w:t>"), was put through an important and obligatory transformation: one-hot encoding. This operation converted each unique genre to a binary feature, and a sparse matrix was the result, in which a '1' was set for the existence of a specific genre in a specific movie, and a '0' set for its non-existence. This conversion was downright necessary, as categorical data classification by the K-Mode algorithm requires features in this discrete binary format.</w:t>
+        <w:t>initial state as a pipe-separated string (for example, "Action|Adventure|Sci-Fi"), was put through an important and obligatory transformation: one-hot encoding. This operation converted each unique genre to a binary feature, and a sparse matrix was the result, in which a '1' was set for the existence of a specific genre in a specific movie, and a '0' set for its non-existence. This conversion was downright necessary, as categorical data classification by the K-Mode algorithm requires features in this discrete binary format.</w:t>
       </w:r>
     </w:p>
     <w:p>
@@ -5313,27 +3438,7 @@
           <w:szCs w:val="24"/>
           <w:lang w:val="en-US"/>
         </w:rPr>
-        <w:t xml:space="preserve"> A strict histogram of the rating distribution of the movie revealed an apparent skewing of ratings in the positive direction with most falling between 3.0 and 4.5 stars, with an estimated mean of 3.5 out of 5 stars. This result points toward a bias of general users to give positive ratings, or even perhaps an indicator of self-selection bias where users give ratings on content they liked. </w:t>
-      </w:r>
-      <w:proofErr w:type="gramStart"/>
-      <w:r>
-        <w:rPr>
-          <w:rFonts w:ascii="Times New Roman" w:hAnsi="Times New Roman" w:cs="Times New Roman"/>
-          <w:sz w:val="24"/>
-          <w:szCs w:val="24"/>
-          <w:lang w:val="en-US"/>
-        </w:rPr>
-        <w:t>Understanding of</w:t>
-      </w:r>
-      <w:proofErr w:type="gramEnd"/>
-      <w:r>
-        <w:rPr>
-          <w:rFonts w:ascii="Times New Roman" w:hAnsi="Times New Roman" w:cs="Times New Roman"/>
-          <w:sz w:val="24"/>
-          <w:szCs w:val="24"/>
-          <w:lang w:val="en-US"/>
-        </w:rPr>
-        <w:t xml:space="preserve"> the underlying distribution is important to putting and understanding the overall sentiment expressed within the dataset.</w:t>
+        <w:t xml:space="preserve"> A strict histogram of the rating distribution of the movie revealed an apparent skewing of ratings in the positive direction with most falling between 3.0 and 4.5 stars, with an estimated mean of 3.5 out of 5 stars. This result points toward a bias of general users to give positive ratings, or even perhaps an indicator of self-selection bias where users give ratings on content they liked. Understanding of the underlying distribution is important to putting and understanding the overall sentiment expressed within the dataset.</w:t>
       </w:r>
     </w:p>
     <w:p>
@@ -5419,47 +3524,7 @@
           <w:szCs w:val="24"/>
           <w:lang w:val="en-US"/>
         </w:rPr>
-        <w:t xml:space="preserve">•Identification of Popularity Trends: Identification of the most popular 10 movies, such as classic titles like "Forrest Gump (1994)," "Shawshank Redemption, </w:t>
-      </w:r>
-      <w:proofErr w:type="gramStart"/>
-      <w:r>
-        <w:rPr>
-          <w:rFonts w:ascii="Times New Roman" w:hAnsi="Times New Roman" w:cs="Times New Roman"/>
-          <w:sz w:val="24"/>
-          <w:szCs w:val="24"/>
-          <w:lang w:val="en-US"/>
-        </w:rPr>
-        <w:t>The</w:t>
-      </w:r>
-      <w:proofErr w:type="gramEnd"/>
-      <w:r>
-        <w:rPr>
-          <w:rFonts w:ascii="Times New Roman" w:hAnsi="Times New Roman" w:cs="Times New Roman"/>
-          <w:sz w:val="24"/>
-          <w:szCs w:val="24"/>
-          <w:lang w:val="en-US"/>
-        </w:rPr>
-        <w:t xml:space="preserve"> (1994)," and "Pulp Fiction (1994)," provided us with an initial empirical glimpse into well-rated and highly engaged-with material among the </w:t>
-      </w:r>
-      <w:proofErr w:type="spellStart"/>
-      <w:r>
-        <w:rPr>
-          <w:rFonts w:ascii="Times New Roman" w:hAnsi="Times New Roman" w:cs="Times New Roman"/>
-          <w:sz w:val="24"/>
-          <w:szCs w:val="24"/>
-          <w:lang w:val="en-US"/>
-        </w:rPr>
-        <w:t>MovieLens</w:t>
-      </w:r>
-      <w:proofErr w:type="spellEnd"/>
-      <w:r>
-        <w:rPr>
-          <w:rFonts w:ascii="Times New Roman" w:hAnsi="Times New Roman" w:cs="Times New Roman"/>
-          <w:sz w:val="24"/>
-          <w:szCs w:val="24"/>
-          <w:lang w:val="en-US"/>
-        </w:rPr>
-        <w:t xml:space="preserve"> user base. These blockbuster titles can be taken as reference measures for ascertaining general audience interest.</w:t>
+        <w:t>•Identification of Popularity Trends: Identification of the most popular 10 movies, such as classic titles like "Forrest Gump (1994)," "Shawshank Redemption, The (1994)," and "Pulp Fiction (1994)," provided us with an initial empirical glimpse into well-rated and highly engaged-with material among the MovieLens user base. These blockbuster titles can be taken as reference measures for ascertaining general audience interest.</w:t>
       </w:r>
     </w:p>
     <w:p>
@@ -5539,26 +3604,576 @@
           <w:lang w:val="en-US"/>
         </w:rPr>
       </w:pPr>
-      <w:proofErr w:type="gramStart"/>
-      <w:r>
-        <w:rPr>
-          <w:rFonts w:ascii="Times New Roman" w:hAnsi="Times New Roman" w:cs="Times New Roman"/>
-          <w:sz w:val="24"/>
-          <w:szCs w:val="24"/>
-          <w:lang w:val="en-US"/>
-        </w:rPr>
-        <w:t>This characteristic reveals</w:t>
-      </w:r>
-      <w:proofErr w:type="gramEnd"/>
-      <w:r>
-        <w:rPr>
-          <w:rFonts w:ascii="Times New Roman" w:hAnsi="Times New Roman" w:cs="Times New Roman"/>
-          <w:sz w:val="24"/>
-          <w:szCs w:val="24"/>
-          <w:lang w:val="en-US"/>
-        </w:rPr>
-        <w:t xml:space="preserve"> that a very small percentage of movies gather a disproportionate majority of user activity and ratings, while a vast majority of films remain in the "tail" with minimal engagement. This inherent nature of consumption behavior on online content platforms presents a twofold challenge and opportunity for recommendation systems: the ability to effectively recommend both extremely popular blockbuster content as well as, more importantly, relevant but less conspicuous niche content to facilitate user discovery and satisfaction.</w:t>
-      </w:r>
+      <w:r>
+        <w:rPr>
+          <w:rFonts w:ascii="Times New Roman" w:hAnsi="Times New Roman" w:cs="Times New Roman"/>
+          <w:sz w:val="24"/>
+          <w:szCs w:val="24"/>
+          <w:lang w:val="en-US"/>
+        </w:rPr>
+        <w:t>This characteristic reveals that a very small percentage of movies gather a disproportionate majority of user activity and ratings, while a vast majority of films remain in the "tail" with minimal engagement. This inherent nature of consumption behavior on online content platforms presents a twofold challenge and opportunity for recommendation systems: the ability to effectively recommend both extremely popular blockbuster content as well as, more importantly, relevant but less conspicuous niche content to facilitate user discovery and satisfaction.</w:t>
+      </w:r>
+    </w:p>
+    <w:p>
+      <w:pPr>
+        <w:spacing w:line="360" w:lineRule="auto"/>
+        <w:jc w:val="both"/>
+        <w:rPr>
+          <w:rFonts w:ascii="Times New Roman" w:hAnsi="Times New Roman" w:cs="Times New Roman"/>
+          <w:sz w:val="24"/>
+          <w:szCs w:val="24"/>
+          <w:lang w:val="en-US"/>
+        </w:rPr>
+      </w:pPr>
+    </w:p>
+    <w:p>
+      <w:pPr>
+        <w:spacing w:line="360" w:lineRule="auto"/>
+        <w:jc w:val="both"/>
+        <w:rPr>
+          <w:rFonts w:ascii="Times New Roman" w:hAnsi="Times New Roman" w:cs="Times New Roman"/>
+          <w:sz w:val="24"/>
+          <w:szCs w:val="24"/>
+          <w:lang w:val="en-US"/>
+        </w:rPr>
+      </w:pPr>
+    </w:p>
+    <w:p>
+      <w:pPr>
+        <w:spacing w:line="360" w:lineRule="auto"/>
+        <w:jc w:val="both"/>
+        <w:rPr>
+          <w:rFonts w:ascii="Times New Roman" w:hAnsi="Times New Roman" w:cs="Times New Roman"/>
+          <w:sz w:val="24"/>
+          <w:szCs w:val="24"/>
+          <w:lang w:val="en-US"/>
+        </w:rPr>
+      </w:pPr>
+    </w:p>
+    <w:p>
+      <w:pPr>
+        <w:spacing w:line="360" w:lineRule="auto"/>
+        <w:jc w:val="both"/>
+        <w:rPr>
+          <w:rFonts w:ascii="Times New Roman" w:hAnsi="Times New Roman" w:cs="Times New Roman"/>
+          <w:b/>
+          <w:bCs/>
+          <w:sz w:val="24"/>
+          <w:szCs w:val="24"/>
+          <w:lang w:val="en-US"/>
+        </w:rPr>
+      </w:pPr>
+      <w:r>
+        <w:rPr>
+          <w:rFonts w:ascii="Times New Roman" w:hAnsi="Times New Roman" w:cs="Times New Roman"/>
+          <w:b/>
+          <w:bCs/>
+          <w:sz w:val="24"/>
+          <w:szCs w:val="24"/>
+          <w:lang w:val="en-US"/>
+        </w:rPr>
+        <w:t>3.3 K-Mode Clustering</w:t>
+      </w:r>
+    </w:p>
+    <w:p>
+      <w:pPr>
+        <w:spacing w:line="360" w:lineRule="auto"/>
+        <w:jc w:val="both"/>
+        <w:rPr>
+          <w:rFonts w:ascii="Times New Roman" w:hAnsi="Times New Roman" w:cs="Times New Roman"/>
+          <w:sz w:val="24"/>
+          <w:szCs w:val="24"/>
+          <w:lang w:val="en-US"/>
+        </w:rPr>
+      </w:pPr>
+      <w:r>
+        <w:rPr>
+          <w:rFonts w:ascii="Times New Roman" w:hAnsi="Times New Roman" w:cs="Times New Roman"/>
+          <w:sz w:val="24"/>
+          <w:szCs w:val="24"/>
+          <w:lang w:val="en-US"/>
+        </w:rPr>
+        <w:t>To statistically segment movies based on their intrinsic genre characteristics, the K-Mode algorithm was used strategically. K-Mode is a robust variant of the classic K-Means algorithm, specifically geared toward effective partitioning of nominal data, a key distinction from K-Means that is optimized for continuous numeric features. Its natural suitability for this project is its employment of a dissimilarity measure, typically Hamming distance or simple matching coefficient, for measuring differences in the sense of counting mismatches between categorical attributes rather than in calculating Euclidean distances. K-Mode is thus well suited to handling the multi-label and nominal nature of movie genre data.</w:t>
+      </w:r>
+    </w:p>
+    <w:p>
+      <w:pPr>
+        <w:spacing w:line="360" w:lineRule="auto"/>
+        <w:jc w:val="both"/>
+        <w:rPr>
+          <w:rFonts w:ascii="Times New Roman" w:hAnsi="Times New Roman" w:cs="Times New Roman"/>
+          <w:sz w:val="24"/>
+          <w:szCs w:val="24"/>
+          <w:lang w:val="en-US"/>
+        </w:rPr>
+      </w:pPr>
+    </w:p>
+    <w:p>
+      <w:pPr>
+        <w:spacing w:line="360" w:lineRule="auto"/>
+        <w:jc w:val="both"/>
+        <w:rPr>
+          <w:rFonts w:ascii="Times New Roman" w:hAnsi="Times New Roman" w:cs="Times New Roman"/>
+          <w:sz w:val="24"/>
+          <w:szCs w:val="24"/>
+          <w:lang w:val="en-US"/>
+        </w:rPr>
+      </w:pPr>
+      <w:r>
+        <w:rPr>
+          <w:rFonts w:ascii="Times New Roman" w:hAnsi="Times New Roman" w:cs="Times New Roman"/>
+          <w:sz w:val="24"/>
+          <w:szCs w:val="24"/>
+          <w:lang w:val="en-US"/>
+        </w:rPr>
+        <w:t>The theoretical justification of K-Mode clustering, as opposed to K-Means, is that it can work directly with non-numeric data. Where K-Means computes the mean of numeric attributes to arrive at cluster centroids, K-Mode computes the "mode" (most frequent category) for each categorical attribute of a cluster. The distance from a data object to a cluster centroid is computed by finding the number of mismatches across all categorical attributes. The algorithm continuously puts points into the closest mode and then refines modes from the newly formed clusters until convergence.</w:t>
+      </w:r>
+    </w:p>
+    <w:p>
+      <w:pPr>
+        <w:spacing w:line="360" w:lineRule="auto"/>
+        <w:jc w:val="both"/>
+        <w:rPr>
+          <w:rFonts w:ascii="Times New Roman" w:hAnsi="Times New Roman" w:cs="Times New Roman"/>
+          <w:sz w:val="24"/>
+          <w:szCs w:val="24"/>
+          <w:lang w:val="en-US"/>
+        </w:rPr>
+      </w:pPr>
+      <w:r>
+        <w:rPr>
+          <w:rFonts w:ascii="Times New Roman" w:hAnsi="Times New Roman" w:cs="Times New Roman"/>
+          <w:sz w:val="24"/>
+          <w:szCs w:val="24"/>
+          <w:lang w:val="en-US"/>
+        </w:rPr>
+        <w:t>The meticulous process of K-Mode clustering involved the following steps:</w:t>
+      </w:r>
+    </w:p>
+    <w:p>
+      <w:pPr>
+        <w:spacing w:line="360" w:lineRule="auto"/>
+        <w:jc w:val="both"/>
+        <w:rPr>
+          <w:rFonts w:ascii="Times New Roman" w:hAnsi="Times New Roman" w:cs="Times New Roman"/>
+          <w:sz w:val="24"/>
+          <w:szCs w:val="24"/>
+          <w:lang w:val="en-US"/>
+        </w:rPr>
+      </w:pPr>
+    </w:p>
+    <w:p>
+      <w:pPr>
+        <w:spacing w:line="360" w:lineRule="auto"/>
+        <w:jc w:val="both"/>
+        <w:rPr>
+          <w:rFonts w:ascii="Times New Roman" w:hAnsi="Times New Roman" w:cs="Times New Roman"/>
+          <w:sz w:val="24"/>
+          <w:szCs w:val="24"/>
+          <w:lang w:val="en-US"/>
+        </w:rPr>
+      </w:pPr>
+    </w:p>
+    <w:p>
+      <w:pPr>
+        <w:spacing w:line="360" w:lineRule="auto"/>
+        <w:jc w:val="both"/>
+        <w:rPr>
+          <w:rFonts w:ascii="Times New Roman" w:hAnsi="Times New Roman" w:cs="Times New Roman"/>
+          <w:sz w:val="24"/>
+          <w:szCs w:val="24"/>
+          <w:lang w:val="en-US"/>
+        </w:rPr>
+      </w:pPr>
+      <w:r>
+        <w:rPr>
+          <w:rFonts w:ascii="Times New Roman" w:hAnsi="Times New Roman" w:cs="Times New Roman"/>
+          <w:sz w:val="24"/>
+          <w:szCs w:val="24"/>
+          <w:lang w:val="en-US"/>
+        </w:rPr>
+        <w:t xml:space="preserve">• </w:t>
+      </w:r>
+      <w:r>
+        <w:rPr>
+          <w:rFonts w:ascii="Times New Roman" w:hAnsi="Times New Roman" w:cs="Times New Roman"/>
+          <w:b/>
+          <w:bCs/>
+          <w:sz w:val="24"/>
+          <w:szCs w:val="24"/>
+          <w:lang w:val="en-US"/>
+        </w:rPr>
+        <w:t>Data Preparation for K-Mode:</w:t>
+      </w:r>
+      <w:r>
+        <w:rPr>
+          <w:rFonts w:ascii="Times New Roman" w:hAnsi="Times New Roman" w:cs="Times New Roman"/>
+          <w:sz w:val="24"/>
+          <w:szCs w:val="24"/>
+          <w:lang w:val="en-US"/>
+        </w:rPr>
+        <w:t xml:space="preserve"> The preprocessed one-hot encoded genre data, which was meticulously prepared in the preprocessing process, was the clean, high-dimensional input to the K-Mode algorithm. In this matrix, there were rows for particular movies, and columns for particular genres (i.e., Action, Adventure, Comedy, Drama), with binary entries (0 or 1) for whether that genre wasn't (0) or was (1) included in a given movie. This transformation from the raw genre strings to the formatted binary matrix, as X in computer code representation, defined the feature space across which the clustering would be done.</w:t>
+      </w:r>
+    </w:p>
+    <w:p>
+      <w:pPr>
+        <w:spacing w:line="360" w:lineRule="auto"/>
+        <w:jc w:val="both"/>
+        <w:rPr>
+          <w:rFonts w:ascii="Times New Roman" w:hAnsi="Times New Roman" w:cs="Times New Roman"/>
+          <w:sz w:val="24"/>
+          <w:szCs w:val="24"/>
+          <w:lang w:val="en-US"/>
+        </w:rPr>
+      </w:pPr>
+    </w:p>
+    <w:p>
+      <w:pPr>
+        <w:spacing w:line="360" w:lineRule="auto"/>
+        <w:jc w:val="both"/>
+        <w:rPr>
+          <w:rFonts w:ascii="Times New Roman" w:hAnsi="Times New Roman" w:cs="Times New Roman"/>
+          <w:sz w:val="24"/>
+          <w:szCs w:val="24"/>
+          <w:lang w:val="en-US"/>
+        </w:rPr>
+      </w:pPr>
+      <w:r>
+        <w:rPr>
+          <w:rFonts w:ascii="Times New Roman" w:hAnsi="Times New Roman" w:cs="Times New Roman"/>
+          <w:sz w:val="24"/>
+          <w:szCs w:val="24"/>
+          <w:lang w:val="en-US"/>
+        </w:rPr>
+        <w:t xml:space="preserve">• </w:t>
+      </w:r>
+      <w:r>
+        <w:rPr>
+          <w:rFonts w:ascii="Times New Roman" w:hAnsi="Times New Roman" w:cs="Times New Roman"/>
+          <w:b/>
+          <w:bCs/>
+          <w:sz w:val="24"/>
+          <w:szCs w:val="24"/>
+          <w:lang w:val="en-US"/>
+        </w:rPr>
+        <w:t>Finding the Optimal Cluster:</w:t>
+      </w:r>
+      <w:r>
+        <w:rPr>
+          <w:rFonts w:ascii="Times New Roman" w:hAnsi="Times New Roman" w:cs="Times New Roman"/>
+          <w:sz w:val="24"/>
+          <w:szCs w:val="24"/>
+          <w:lang w:val="en-US"/>
+        </w:rPr>
+        <w:t xml:space="preserve"> One of the essential requirements in applying any partitioning type of clustering algorithm like K-Mode is finding the optimal number of clusters, classically denoted as k. While the original provided interim report and following code examples provided a pre-decided assumption of n_clusters=5, an adequate academic endeavor would typically involve the use of systematic approaches like the Elbow Method. This is accomplished by iteratively running the clustering algorithm with different values of k and plotting resulting within-cluster cost (sum of dissimilarities to centroids) as a function of k. The "elbow point" where slope of decrease in cost visibly ceases is visually determined to be optimum k. The selection of k=5 from this analysis constitutes conceptual separation of the movie mega-universe into five understandable and recognizable genre-based clusters, which are chosen to represent major consumer preference clusters.</w:t>
+      </w:r>
+    </w:p>
+    <w:p>
+      <w:pPr>
+        <w:spacing w:line="360" w:lineRule="auto"/>
+        <w:jc w:val="both"/>
+        <w:rPr>
+          <w:rFonts w:ascii="Times New Roman" w:hAnsi="Times New Roman" w:cs="Times New Roman"/>
+          <w:sz w:val="24"/>
+          <w:szCs w:val="24"/>
+          <w:lang w:val="en-US"/>
+        </w:rPr>
+      </w:pPr>
+    </w:p>
+    <w:p>
+      <w:pPr>
+        <w:spacing w:line="360" w:lineRule="auto"/>
+        <w:jc w:val="both"/>
+        <w:rPr>
+          <w:rFonts w:ascii="Times New Roman" w:hAnsi="Times New Roman" w:cs="Times New Roman"/>
+          <w:sz w:val="24"/>
+          <w:szCs w:val="24"/>
+          <w:lang w:val="en-US"/>
+        </w:rPr>
+      </w:pPr>
+      <w:r>
+        <w:rPr>
+          <w:rFonts w:ascii="Times New Roman" w:hAnsi="Times New Roman" w:cs="Times New Roman"/>
+          <w:sz w:val="24"/>
+          <w:szCs w:val="24"/>
+          <w:lang w:val="en-US"/>
+        </w:rPr>
+        <w:t xml:space="preserve">• </w:t>
+      </w:r>
+      <w:r>
+        <w:rPr>
+          <w:rFonts w:ascii="Times New Roman" w:hAnsi="Times New Roman" w:cs="Times New Roman"/>
+          <w:b/>
+          <w:bCs/>
+          <w:sz w:val="24"/>
+          <w:szCs w:val="24"/>
+          <w:lang w:val="en-US"/>
+        </w:rPr>
+        <w:t>Model Initialization and Training:</w:t>
+      </w:r>
+      <w:r>
+        <w:rPr>
+          <w:rFonts w:ascii="Times New Roman" w:hAnsi="Times New Roman" w:cs="Times New Roman"/>
+          <w:sz w:val="24"/>
+          <w:szCs w:val="24"/>
+          <w:lang w:val="en-US"/>
+        </w:rPr>
+        <w:t xml:space="preserve"> Initialization of the KModes algorithm utilized parameters: n_clusters=5 (number of received clusters), init='Huang' (effective for specifying the mode of initialization), and n_init=5 (number of independent initializations). init='Huang' is a case that refers to Huang's initialization technique, a technique that has been billed as being robust at discovering robust initial cluster centroids on categorical data, which frequently results in more stable, theoretically optimal clustering results than random initialization alone. The algorithm attempts to identify sensibly separated initial modes to elevate the likelihood of convergence to a globally optimal or near-optimal clustering solution. The parameter n_init=5 forces the clustering algorithm to perform five independent runs, each of which starts with a different randomly chosen </w:t>
+      </w:r>
+      <w:r>
+        <w:rPr>
+          <w:rFonts w:ascii="Times New Roman" w:hAnsi="Times New Roman" w:cs="Times New Roman"/>
+          <w:sz w:val="24"/>
+          <w:szCs w:val="24"/>
+          <w:lang w:val="en-US"/>
+        </w:rPr>
+        <w:lastRenderedPageBreak/>
+        <w:t>initial set of starting centroids. The outcome of the five runs is that the iteration having the minimum total cost (i.e., minimum total sum of dissimilarities of data points from their respective assigned cluster centroids) is chosen as the final optimum clustering solution. This multi-run approach substantially enhances the stability and robustness of the resulting clustering by avoiding the potential to converge to an inferior local minimum, a common problem with iteratively updating cluster algorithms. The clustering itself was then carried out by the km.fit_predict(X) function, iteratively refining cluster membership and centroid modes to convergence, and finally assigning a single cluster label to each film on the basis of its overall genre profile.</w:t>
+      </w:r>
+    </w:p>
+    <w:p>
+      <w:pPr>
+        <w:spacing w:line="360" w:lineRule="auto"/>
+        <w:jc w:val="both"/>
+        <w:rPr>
+          <w:rFonts w:ascii="Times New Roman" w:hAnsi="Times New Roman" w:cs="Times New Roman"/>
+          <w:sz w:val="24"/>
+          <w:szCs w:val="24"/>
+          <w:lang w:val="en-US"/>
+        </w:rPr>
+      </w:pPr>
+    </w:p>
+    <w:p>
+      <w:pPr>
+        <w:spacing w:line="360" w:lineRule="auto"/>
+        <w:jc w:val="both"/>
+        <w:rPr>
+          <w:rFonts w:ascii="Times New Roman" w:hAnsi="Times New Roman" w:cs="Times New Roman"/>
+          <w:sz w:val="24"/>
+          <w:szCs w:val="24"/>
+          <w:lang w:val="en-US"/>
+        </w:rPr>
+      </w:pPr>
+      <w:r>
+        <w:rPr>
+          <w:rFonts w:ascii="Times New Roman" w:hAnsi="Times New Roman" w:cs="Times New Roman"/>
+          <w:sz w:val="24"/>
+          <w:szCs w:val="24"/>
+          <w:lang w:val="en-US"/>
+        </w:rPr>
+        <w:t xml:space="preserve">• </w:t>
+      </w:r>
+      <w:r>
+        <w:rPr>
+          <w:rFonts w:ascii="Times New Roman" w:hAnsi="Times New Roman" w:cs="Times New Roman"/>
+          <w:b/>
+          <w:bCs/>
+          <w:sz w:val="24"/>
+          <w:szCs w:val="24"/>
+          <w:lang w:val="en-US"/>
+        </w:rPr>
+        <w:t>Cluster Assignment, Characterization, and Interpretation:</w:t>
+      </w:r>
+      <w:r>
+        <w:rPr>
+          <w:rFonts w:ascii="Times New Roman" w:hAnsi="Times New Roman" w:cs="Times New Roman"/>
+          <w:sz w:val="24"/>
+          <w:szCs w:val="24"/>
+          <w:lang w:val="en-US"/>
+        </w:rPr>
+        <w:t xml:space="preserve"> Once the model was trained, each film in the data was automatically assigned a specific cluster label, and the label was inserted as a new column, Cluster, in the movies_with_titles DataFrame. This allowed easy analysis and mapping of films to their respective segments without requiring any further steps. The initial quantitative glimpse was seeing the distribution of movies across these clusters with movies_with_titles['Cluster'].value_counts().sort_index(), to get an approximate sense of the size and proportion of each segment overall. This was employed in forming a first impression of whether the clusters were relatively more or less equal in size, and whether certain segments were notably larger or smaller than others. The actual sense from these clusters was derived by further qualitative investigation of the most common genres of each. This was accomplished by examining the mode of a genre in a cluster or by tabulating the frequency of occurrence of each genre. For instance, a cluster that is dominated by "Action," "Adventure," and "Sci-Fi" movies would necessarily be a representation of a segment of individuals that prefer high-energy, mythological, and futuristic content. Another cluster might be characterized by rich "Comedy" and "Romance" genres, which would indicate a segment of viewers that enjoy light and relationship content. Identification of such dominant genre combinations per cluster is central to determining the underlying preferences of the represented audience segments and thereby informing actionable intelligence for targeted campaigns.</w:t>
+      </w:r>
+    </w:p>
+    <w:p>
+      <w:pPr>
+        <w:spacing w:line="360" w:lineRule="auto"/>
+        <w:jc w:val="both"/>
+        <w:rPr>
+          <w:rFonts w:ascii="Times New Roman" w:hAnsi="Times New Roman" w:cs="Times New Roman"/>
+          <w:sz w:val="24"/>
+          <w:szCs w:val="24"/>
+          <w:lang w:val="en-US"/>
+        </w:rPr>
+      </w:pPr>
+    </w:p>
+    <w:p>
+      <w:pPr>
+        <w:spacing w:line="360" w:lineRule="auto"/>
+        <w:jc w:val="both"/>
+        <w:rPr>
+          <w:rFonts w:ascii="Times New Roman" w:hAnsi="Times New Roman" w:cs="Times New Roman"/>
+          <w:sz w:val="24"/>
+          <w:szCs w:val="24"/>
+          <w:lang w:val="en-US"/>
+        </w:rPr>
+      </w:pPr>
+      <w:r>
+        <w:rPr>
+          <w:rFonts w:ascii="Times New Roman" w:hAnsi="Times New Roman" w:cs="Times New Roman"/>
+          <w:sz w:val="24"/>
+          <w:szCs w:val="24"/>
+          <w:lang w:val="en-US"/>
+        </w:rPr>
+        <w:t xml:space="preserve">• </w:t>
+      </w:r>
+      <w:r>
+        <w:rPr>
+          <w:rFonts w:ascii="Times New Roman" w:hAnsi="Times New Roman" w:cs="Times New Roman"/>
+          <w:b/>
+          <w:bCs/>
+          <w:sz w:val="24"/>
+          <w:szCs w:val="24"/>
+          <w:lang w:val="en-US"/>
+        </w:rPr>
+        <w:t>Multiple Correspondence Analysis (MCA) Cluster Visualization:</w:t>
+      </w:r>
+      <w:r>
+        <w:rPr>
+          <w:rFonts w:ascii="Times New Roman" w:hAnsi="Times New Roman" w:cs="Times New Roman"/>
+          <w:sz w:val="24"/>
+          <w:szCs w:val="24"/>
+          <w:lang w:val="en-US"/>
+        </w:rPr>
+        <w:t xml:space="preserve"> To present a more interactive and interpretable picture and describe the high-dimensional categorical clusters in low dimension, Multiple Correspondence Analysis (MCA) was applied. MCA is a sophisticated </w:t>
+      </w:r>
+      <w:r>
+        <w:rPr>
+          <w:rFonts w:ascii="Times New Roman" w:hAnsi="Times New Roman" w:cs="Times New Roman"/>
+          <w:sz w:val="24"/>
+          <w:szCs w:val="24"/>
+          <w:lang w:val="en-US"/>
+        </w:rPr>
+        <w:lastRenderedPageBreak/>
+        <w:t>statistical technique perfect to explore and visualize the relations between numerous categorical variables. The output of the five runs is that the iteration with the minimum overall cost (i.e., smallest total sum of dissimilarities between data points and their respective assigned cluster centroids) is adopted as the final optimized clustering solution. This multi-run approach significantly enhances the stability and reliability of the resulting clustering by precluding the potential for converging to an inferior local minimum, a common problem with iteratively operating cluster algorithms. The km.fit_predict(X) function then conducted the actual clustering procedure, iteratively adjusting cluster membership and centroid modes to convergence, and finally inferring a single cluster classification for each movie from its comprehensive genre profile.</w:t>
+      </w:r>
+    </w:p>
+    <w:p>
+      <w:pPr>
+        <w:spacing w:line="360" w:lineRule="auto"/>
+        <w:jc w:val="both"/>
+        <w:rPr>
+          <w:rFonts w:ascii="Times New Roman" w:hAnsi="Times New Roman" w:cs="Times New Roman"/>
+          <w:sz w:val="24"/>
+          <w:szCs w:val="24"/>
+          <w:lang w:val="en-US"/>
+        </w:rPr>
+      </w:pPr>
+    </w:p>
+    <w:p>
+      <w:pPr>
+        <w:spacing w:line="360" w:lineRule="auto"/>
+        <w:jc w:val="both"/>
+        <w:rPr>
+          <w:rFonts w:ascii="Times New Roman" w:hAnsi="Times New Roman" w:cs="Times New Roman"/>
+          <w:sz w:val="24"/>
+          <w:szCs w:val="24"/>
+          <w:lang w:val="en-US"/>
+        </w:rPr>
+      </w:pPr>
+      <w:r>
+        <w:rPr>
+          <w:rFonts w:ascii="Times New Roman" w:hAnsi="Times New Roman" w:cs="Times New Roman"/>
+          <w:sz w:val="24"/>
+          <w:szCs w:val="24"/>
+          <w:lang w:val="en-US"/>
+        </w:rPr>
+        <w:t xml:space="preserve">• </w:t>
+      </w:r>
+      <w:r>
+        <w:rPr>
+          <w:rFonts w:ascii="Times New Roman" w:hAnsi="Times New Roman" w:cs="Times New Roman"/>
+          <w:b/>
+          <w:bCs/>
+          <w:sz w:val="24"/>
+          <w:szCs w:val="24"/>
+          <w:lang w:val="en-US"/>
+        </w:rPr>
+        <w:t>Cluster Assignment, Characterization, and Interpretation:</w:t>
+      </w:r>
+      <w:r>
+        <w:rPr>
+          <w:rFonts w:ascii="Times New Roman" w:hAnsi="Times New Roman" w:cs="Times New Roman"/>
+          <w:sz w:val="24"/>
+          <w:szCs w:val="24"/>
+          <w:lang w:val="en-US"/>
+        </w:rPr>
+        <w:t xml:space="preserve"> Once the model was trained, each film in the dataset was automatically labeled with a specific cluster label, and this label was included as a new column, Cluster, in the movies_with_titles DataFrame. This facilitated easy analysis and mapping of films to their respective segments without any further steps. The initial quantitative overview was recognizing the distribution of movies between these clusters using movies_with_titles['Cluster'].value_counts().sort_index(), which provided a general sense of the overall size and ratio of each segment. This was utilized to take a first impression on whether or not the clusters were approximately the same size, and if some segments were notably larger or smaller than others. The actual significance behind these clusters, however, was gained by further qualitative investigation of the most common genres of each. This was achieved through examining the mode of a genre within a cluster or by tabulating the number of occurrence of every genre. For instance, a cluster predominantly having "Action," "Adventure," and "Sci-Fi" movies would naturally show a segment popular among individuals with a penchant for high-energy, mythological, and futuristic plots. On the contrary, a different cluster might identify itself by being dominant in "Comedy" and "Romance" genres, indicating a segment of viewers who enjoy light and relationship content. Identification of these over-riding combinations of genres for each cluster is central to determining the underlying preferences of the represented audience segments and thus providing actionable intelligence for targeted interventions.</w:t>
+      </w:r>
+    </w:p>
+    <w:p>
+      <w:pPr>
+        <w:spacing w:line="360" w:lineRule="auto"/>
+        <w:jc w:val="both"/>
+        <w:rPr>
+          <w:rFonts w:ascii="Times New Roman" w:hAnsi="Times New Roman" w:cs="Times New Roman"/>
+          <w:sz w:val="24"/>
+          <w:szCs w:val="24"/>
+          <w:lang w:val="en-US"/>
+        </w:rPr>
+      </w:pPr>
+    </w:p>
+    <w:p>
+      <w:pPr>
+        <w:spacing w:line="360" w:lineRule="auto"/>
+        <w:jc w:val="both"/>
+        <w:rPr>
+          <w:rFonts w:ascii="Times New Roman" w:hAnsi="Times New Roman" w:cs="Times New Roman"/>
+          <w:sz w:val="24"/>
+          <w:szCs w:val="24"/>
+          <w:lang w:val="en-US"/>
+        </w:rPr>
+      </w:pPr>
+      <w:r>
+        <w:rPr>
+          <w:rFonts w:ascii="Times New Roman" w:hAnsi="Times New Roman" w:cs="Times New Roman"/>
+          <w:sz w:val="24"/>
+          <w:szCs w:val="24"/>
+          <w:lang w:val="en-US"/>
+        </w:rPr>
+        <w:t xml:space="preserve">• </w:t>
+      </w:r>
+      <w:r>
+        <w:rPr>
+          <w:rFonts w:ascii="Times New Roman" w:hAnsi="Times New Roman" w:cs="Times New Roman"/>
+          <w:b/>
+          <w:bCs/>
+          <w:sz w:val="24"/>
+          <w:szCs w:val="24"/>
+          <w:lang w:val="en-US"/>
+        </w:rPr>
+        <w:t>Multiple Correspondence Analysis (MCA) Cluster Visualization:</w:t>
+      </w:r>
+      <w:r>
+        <w:rPr>
+          <w:rFonts w:ascii="Times New Roman" w:hAnsi="Times New Roman" w:cs="Times New Roman"/>
+          <w:sz w:val="24"/>
+          <w:szCs w:val="24"/>
+          <w:lang w:val="en-US"/>
+        </w:rPr>
+        <w:t xml:space="preserve"> To represent a more interactive and clear picture and describe the high-dimensional categorical clusters in low-</w:t>
+      </w:r>
+      <w:r>
+        <w:rPr>
+          <w:rFonts w:ascii="Times New Roman" w:hAnsi="Times New Roman" w:cs="Times New Roman"/>
+          <w:sz w:val="24"/>
+          <w:szCs w:val="24"/>
+          <w:lang w:val="en-US"/>
+        </w:rPr>
+        <w:lastRenderedPageBreak/>
+        <w:t>dimensional space, Multiple Correspondence Analysis (MCA) was employed. MCA is a sophisticated statistical technique well suited to explore and visualize the relations among numerous categorical variables. It does so by transforming categorical variables into numeric scores, allowing them to be visualized within a low-dimensional Euclidean space. This method successfully transfers the categorical data points (the movies based on their genres) into a lower-dimensional space, generally two or three dimensions, without aiming to keep as much of the variance as possible or the structural relationships among the variables. With n_components=2, the top two principal components from the MCA were captured. These features were the axes of a 2D scatter plot on which every film (data point) was plotted based on its MCA coordinates and colored based on its K-Mode assigned cluster. A good MCA visualization would show graphically well-separated, distinct clusters of data points, where same-cluster movies are near each other in space and the various clusters have visually evident separation. This visual confirmation is used to confirm the success of the K-Mode algorithm in generating informative and separable genre-based clusters, with intuitive interpretability of their constituent features, and illustrating the cohesion of the clustering.</w:t>
+      </w:r>
+    </w:p>
+    <w:p>
+      <w:pPr>
+        <w:spacing w:line="360" w:lineRule="auto"/>
+        <w:jc w:val="both"/>
+        <w:rPr>
+          <w:rFonts w:ascii="Times New Roman" w:hAnsi="Times New Roman" w:cs="Times New Roman"/>
+          <w:sz w:val="24"/>
+          <w:szCs w:val="24"/>
+          <w:lang w:val="en-US"/>
+        </w:rPr>
+      </w:pPr>
     </w:p>
     <w:p/>
     <w:sectPr>

</xml_diff>

<commit_message>
Addition of section 3.4 of the Methodology ( The explaination of how Associate Rule Mining was used , the necessary steps that was involved )
</commit_message>
<xml_diff>
--- a/project write up/(FPR)A STUDY ON CUSTOMER BEHAVIOUR ANALYSIS FOR RETAIL OPTIMIZATION USING K.docx
+++ b/project write up/(FPR)A STUDY ON CUSTOMER BEHAVIOUR ANALYSIS FOR RETAIL OPTIMIZATION USING K.docx
@@ -4161,6 +4161,354 @@
         </w:rPr>
         <w:lastRenderedPageBreak/>
         <w:t>dimensional space, Multiple Correspondence Analysis (MCA) was employed. MCA is a sophisticated statistical technique well suited to explore and visualize the relations among numerous categorical variables. It does so by transforming categorical variables into numeric scores, allowing them to be visualized within a low-dimensional Euclidean space. This method successfully transfers the categorical data points (the movies based on their genres) into a lower-dimensional space, generally two or three dimensions, without aiming to keep as much of the variance as possible or the structural relationships among the variables. With n_components=2, the top two principal components from the MCA were captured. These features were the axes of a 2D scatter plot on which every film (data point) was plotted based on its MCA coordinates and colored based on its K-Mode assigned cluster. A good MCA visualization would show graphically well-separated, distinct clusters of data points, where same-cluster movies are near each other in space and the various clusters have visually evident separation. This visual confirmation is used to confirm the success of the K-Mode algorithm in generating informative and separable genre-based clusters, with intuitive interpretability of their constituent features, and illustrating the cohesion of the clustering.</w:t>
+      </w:r>
+    </w:p>
+    <w:p>
+      <w:pPr>
+        <w:spacing w:line="360" w:lineRule="auto"/>
+        <w:jc w:val="both"/>
+        <w:rPr>
+          <w:rFonts w:ascii="Times New Roman" w:hAnsi="Times New Roman" w:cs="Times New Roman"/>
+          <w:sz w:val="24"/>
+          <w:szCs w:val="24"/>
+          <w:lang w:val="en-US"/>
+        </w:rPr>
+      </w:pPr>
+    </w:p>
+    <w:p>
+      <w:pPr>
+        <w:spacing w:line="360" w:lineRule="auto"/>
+        <w:jc w:val="both"/>
+        <w:rPr>
+          <w:rFonts w:ascii="Times New Roman" w:hAnsi="Times New Roman" w:cs="Times New Roman"/>
+          <w:sz w:val="24"/>
+          <w:szCs w:val="24"/>
+          <w:lang w:val="en-US"/>
+        </w:rPr>
+      </w:pPr>
+    </w:p>
+    <w:p>
+      <w:pPr>
+        <w:spacing w:line="360" w:lineRule="auto"/>
+        <w:jc w:val="both"/>
+        <w:rPr>
+          <w:rFonts w:ascii="Times New Roman" w:hAnsi="Times New Roman" w:cs="Times New Roman"/>
+          <w:b/>
+          <w:bCs/>
+          <w:sz w:val="24"/>
+          <w:szCs w:val="24"/>
+          <w:lang w:val="en-US"/>
+        </w:rPr>
+      </w:pPr>
+      <w:r>
+        <w:rPr>
+          <w:rFonts w:ascii="Times New Roman" w:hAnsi="Times New Roman" w:cs="Times New Roman"/>
+          <w:b/>
+          <w:bCs/>
+          <w:sz w:val="24"/>
+          <w:szCs w:val="24"/>
+          <w:lang w:val="en-US"/>
+        </w:rPr>
+        <w:t>3.4 Association Rule Mining</w:t>
+      </w:r>
+    </w:p>
+    <w:p>
+      <w:pPr>
+        <w:spacing w:line="360" w:lineRule="auto"/>
+        <w:jc w:val="both"/>
+        <w:rPr>
+          <w:rFonts w:ascii="Times New Roman" w:hAnsi="Times New Roman" w:cs="Times New Roman"/>
+          <w:sz w:val="24"/>
+          <w:szCs w:val="24"/>
+          <w:lang w:val="en-US"/>
+        </w:rPr>
+      </w:pPr>
+      <w:r>
+        <w:rPr>
+          <w:rFonts w:ascii="Times New Roman" w:hAnsi="Times New Roman" w:cs="Times New Roman"/>
+          <w:sz w:val="24"/>
+          <w:szCs w:val="24"/>
+          <w:lang w:val="en-US"/>
+        </w:rPr>
+        <w:t>Subsequent to effective clustering of movies into distinct, genre-similar groups by means of K-Mode, Association Rule Mining (ARM) was strictly implemented on each group. The technique is fundamentally critical for the revelation of implicit but significant correlational patterns among movie genres and, therefore, a more detailed and highly contextualized understanding of co-occurrence trends relative to specific customer groups (Hashad et al., 2024). The Apriori algorithm, a proven algorithm well known to data mining researchers as one that identifies frequent itemsets and derives meaningful association rules, was particularly chosen because it is efficient in handling transactional data sets (Lu et al., 2015). The Apriori algorithm proceeds iteratively to identify larger and larger frequent itemsets (such as one genre, combinations of two genres, collections of three genres) up to a minimum support, prior to identifying association rules from these frequent itemsets with at least minimum confidence and minimum lift requirements.</w:t>
+      </w:r>
+    </w:p>
+    <w:p>
+      <w:pPr>
+        <w:spacing w:line="360" w:lineRule="auto"/>
+        <w:jc w:val="both"/>
+        <w:rPr>
+          <w:rFonts w:ascii="Times New Roman" w:hAnsi="Times New Roman" w:cs="Times New Roman"/>
+          <w:sz w:val="24"/>
+          <w:szCs w:val="24"/>
+          <w:lang w:val="en-US"/>
+        </w:rPr>
+      </w:pPr>
+      <w:r>
+        <w:rPr>
+          <w:rFonts w:ascii="Times New Roman" w:hAnsi="Times New Roman" w:cs="Times New Roman"/>
+          <w:sz w:val="24"/>
+          <w:szCs w:val="24"/>
+          <w:lang w:val="en-US"/>
+        </w:rPr>
+        <w:t>The algorithmic application of Association Rule Mining involved the following successive steps:</w:t>
+      </w:r>
+    </w:p>
+    <w:p>
+      <w:pPr>
+        <w:spacing w:line="360" w:lineRule="auto"/>
+        <w:jc w:val="both"/>
+        <w:rPr>
+          <w:rFonts w:ascii="Times New Roman" w:hAnsi="Times New Roman" w:cs="Times New Roman"/>
+          <w:sz w:val="24"/>
+          <w:szCs w:val="24"/>
+          <w:lang w:val="en-US"/>
+        </w:rPr>
+      </w:pPr>
+    </w:p>
+    <w:p>
+      <w:pPr>
+        <w:spacing w:line="360" w:lineRule="auto"/>
+        <w:jc w:val="both"/>
+        <w:rPr>
+          <w:rFonts w:ascii="Times New Roman" w:hAnsi="Times New Roman" w:cs="Times New Roman"/>
+          <w:sz w:val="24"/>
+          <w:szCs w:val="24"/>
+          <w:lang w:val="en-US"/>
+        </w:rPr>
+      </w:pPr>
+      <w:r>
+        <w:rPr>
+          <w:rFonts w:ascii="Times New Roman" w:hAnsi="Times New Roman" w:cs="Times New Roman"/>
+          <w:sz w:val="24"/>
+          <w:szCs w:val="24"/>
+          <w:lang w:val="en-US"/>
+        </w:rPr>
+        <w:lastRenderedPageBreak/>
+        <w:t xml:space="preserve">• </w:t>
+      </w:r>
+      <w:r>
+        <w:rPr>
+          <w:rFonts w:ascii="Times New Roman" w:hAnsi="Times New Roman" w:cs="Times New Roman"/>
+          <w:b/>
+          <w:bCs/>
+          <w:sz w:val="24"/>
+          <w:szCs w:val="24"/>
+          <w:lang w:val="en-US"/>
+        </w:rPr>
+        <w:t>Preparation of Transaction Data:</w:t>
+      </w:r>
+      <w:r>
+        <w:rPr>
+          <w:rFonts w:ascii="Times New Roman" w:hAnsi="Times New Roman" w:cs="Times New Roman"/>
+          <w:sz w:val="24"/>
+          <w:szCs w:val="24"/>
+          <w:lang w:val="en-US"/>
+        </w:rPr>
+        <w:t xml:space="preserve"> For optimal functioning of the Apriori algorithm, preprocessed genre data from each K-Mode cluster needed proper conversion to a transactional form. In this case, each movie from a given individual cluster was considered a "transaction," and the genres for such a particular movie (such as "Action", "Adventure", "Sci-Fi") were the "items" in such a particular transaction. This reversal from the one-hot encoded genre matrix to list-of-items-per-transaction form (e.g., ['Action', 'Adventure', 'Sci-Fi']) was a critical preparatory step, getting the data into a form that suited the Apriori algorithm's input requirements. This allowed the algorithm to handle well the co-occurrence of genres within each film's profile.</w:t>
+      </w:r>
+    </w:p>
+    <w:p>
+      <w:pPr>
+        <w:spacing w:line="360" w:lineRule="auto"/>
+        <w:jc w:val="both"/>
+        <w:rPr>
+          <w:rFonts w:ascii="Times New Roman" w:hAnsi="Times New Roman" w:cs="Times New Roman"/>
+          <w:sz w:val="24"/>
+          <w:szCs w:val="24"/>
+          <w:lang w:val="en-US"/>
+        </w:rPr>
+      </w:pPr>
+    </w:p>
+    <w:p>
+      <w:pPr>
+        <w:spacing w:line="360" w:lineRule="auto"/>
+        <w:jc w:val="both"/>
+        <w:rPr>
+          <w:rFonts w:ascii="Times New Roman" w:hAnsi="Times New Roman" w:cs="Times New Roman"/>
+          <w:sz w:val="24"/>
+          <w:szCs w:val="24"/>
+          <w:lang w:val="en-US"/>
+        </w:rPr>
+      </w:pPr>
+      <w:r>
+        <w:rPr>
+          <w:rFonts w:ascii="Times New Roman" w:hAnsi="Times New Roman" w:cs="Times New Roman"/>
+          <w:sz w:val="24"/>
+          <w:szCs w:val="24"/>
+          <w:lang w:val="en-US"/>
+        </w:rPr>
+        <w:t xml:space="preserve">• </w:t>
+      </w:r>
+      <w:r>
+        <w:rPr>
+          <w:rFonts w:ascii="Times New Roman" w:hAnsi="Times New Roman" w:cs="Times New Roman"/>
+          <w:b/>
+          <w:bCs/>
+          <w:sz w:val="24"/>
+          <w:szCs w:val="24"/>
+          <w:lang w:val="en-US"/>
+        </w:rPr>
+        <w:t>Apriori Algorithm Run and Parameter Tunning:</w:t>
+      </w:r>
+      <w:r>
+        <w:rPr>
+          <w:rFonts w:ascii="Times New Roman" w:hAnsi="Times New Roman" w:cs="Times New Roman"/>
+          <w:sz w:val="24"/>
+          <w:szCs w:val="24"/>
+          <w:lang w:val="en-US"/>
+        </w:rPr>
+        <w:t xml:space="preserve"> The mlxtend.frequent_patterns.apriori library function was executed separately over each newly generated transactional data for each cluster. Strict parameter tuning was necessary for reaching the derivation of statistically significant and operationally valuable rules:</w:t>
+      </w:r>
+    </w:p>
+    <w:p>
+      <w:pPr>
+        <w:spacing w:line="360" w:lineRule="auto"/>
+        <w:jc w:val="both"/>
+        <w:rPr>
+          <w:rFonts w:ascii="Times New Roman" w:hAnsi="Times New Roman" w:cs="Times New Roman"/>
+          <w:sz w:val="24"/>
+          <w:szCs w:val="24"/>
+          <w:lang w:val="en-US"/>
+        </w:rPr>
+      </w:pPr>
+      <w:r>
+        <w:rPr>
+          <w:rFonts w:ascii="Times New Roman" w:hAnsi="Times New Roman" w:cs="Times New Roman"/>
+          <w:b/>
+          <w:bCs/>
+          <w:sz w:val="24"/>
+          <w:szCs w:val="24"/>
+          <w:lang w:val="en-US"/>
+        </w:rPr>
+        <w:t>Minimum Support (min_support):</w:t>
+      </w:r>
+      <w:r>
+        <w:rPr>
+          <w:rFonts w:ascii="Times New Roman" w:hAnsi="Times New Roman" w:cs="Times New Roman"/>
+          <w:sz w:val="24"/>
+          <w:szCs w:val="24"/>
+          <w:lang w:val="en-US"/>
+        </w:rPr>
+        <w:t xml:space="preserve"> This was fixed at 0.01 (1%). Support is a critical measure that reflects how often an itemset (a collection of genres) appears in the database. It is the proportion of those transactions that contain the itemset. Placing this cutoff told the algorithm to consider only those itemsets that appeared in over 1% of the movies within a specific cluster. This successfully screens out rare or anecdotal genre pairs, concentrating the study on patterns that prove to show a regular and reasonably significant incidence, thus elevating the applicability of the derived rules. That is, in a cluster containing 1000 films, an itemset must appear in at least 10 films to be said to be frequent.</w:t>
+      </w:r>
+    </w:p>
+    <w:p>
+      <w:pPr>
+        <w:spacing w:line="360" w:lineRule="auto"/>
+        <w:jc w:val="both"/>
+        <w:rPr>
+          <w:rFonts w:ascii="Times New Roman" w:hAnsi="Times New Roman" w:cs="Times New Roman"/>
+          <w:sz w:val="24"/>
+          <w:szCs w:val="24"/>
+          <w:lang w:val="en-US"/>
+        </w:rPr>
+      </w:pPr>
+      <w:r>
+        <w:rPr>
+          <w:rFonts w:ascii="Times New Roman" w:hAnsi="Times New Roman" w:cs="Times New Roman"/>
+          <w:b/>
+          <w:bCs/>
+          <w:sz w:val="24"/>
+          <w:szCs w:val="24"/>
+          <w:lang w:val="en-US"/>
+        </w:rPr>
+        <w:t>Minimum Confidence (min_confidence):</w:t>
+      </w:r>
+      <w:r>
+        <w:rPr>
+          <w:rFonts w:ascii="Times New Roman" w:hAnsi="Times New Roman" w:cs="Times New Roman"/>
+          <w:sz w:val="24"/>
+          <w:szCs w:val="24"/>
+          <w:lang w:val="en-US"/>
+        </w:rPr>
+        <w:t xml:space="preserve"> After generating frequent itemsets, association_rules was called with min_confidence parameter value 0.2 (20%). Confidence is the conditional probability of consequent item(s) in transactions that contain the antecedent item(s). It is determined as Support(A U B) / Support(A).</w:t>
+      </w:r>
+    </w:p>
+    <w:p>
+      <w:pPr>
+        <w:spacing w:line="360" w:lineRule="auto"/>
+        <w:jc w:val="both"/>
+        <w:rPr>
+          <w:rFonts w:ascii="Times New Roman" w:hAnsi="Times New Roman" w:cs="Times New Roman"/>
+          <w:sz w:val="24"/>
+          <w:szCs w:val="24"/>
+          <w:lang w:val="en-US"/>
+        </w:rPr>
+      </w:pPr>
+      <w:r>
+        <w:rPr>
+          <w:rFonts w:ascii="Times New Roman" w:hAnsi="Times New Roman" w:cs="Times New Roman"/>
+          <w:sz w:val="24"/>
+          <w:szCs w:val="24"/>
+          <w:lang w:val="en-US"/>
+        </w:rPr>
+        <w:t xml:space="preserve"> For example, in a rule "If a movie is Genre A, then also Genre B," having a 20% confidence means that among all movies with Genre A (the antecedent), at least 20% of them have Genre B (the consequent) as well. This threshold ensures only rules with sufficient prediction power or association strength are shortlisted, hence serving a more useful purpose for the sake of recommendation. High confidence is equivalent to high predictive association.</w:t>
+      </w:r>
+    </w:p>
+    <w:p>
+      <w:pPr>
+        <w:spacing w:line="360" w:lineRule="auto"/>
+        <w:jc w:val="both"/>
+        <w:rPr>
+          <w:rFonts w:ascii="Times New Roman" w:hAnsi="Times New Roman" w:cs="Times New Roman"/>
+          <w:sz w:val="24"/>
+          <w:szCs w:val="24"/>
+          <w:lang w:val="en-US"/>
+        </w:rPr>
+      </w:pPr>
+      <w:r>
+        <w:rPr>
+          <w:rFonts w:ascii="Times New Roman" w:hAnsi="Times New Roman" w:cs="Times New Roman"/>
+          <w:b/>
+          <w:bCs/>
+          <w:sz w:val="24"/>
+          <w:szCs w:val="24"/>
+          <w:lang w:val="en-US"/>
+        </w:rPr>
+        <w:lastRenderedPageBreak/>
+        <w:t>No Lift Metric Evaluation:</w:t>
+      </w:r>
+      <w:r>
+        <w:rPr>
+          <w:rFonts w:ascii="Times New Roman" w:hAnsi="Times New Roman" w:cs="Times New Roman"/>
+          <w:sz w:val="24"/>
+          <w:szCs w:val="24"/>
+          <w:lang w:val="en-US"/>
+        </w:rPr>
+        <w:t xml:space="preserve"> Far from a glaring parameter to exclude from rule formation in this sample code, the lift measure is essentially indispensable in the assessment of the overall "interest" and actual power of an association rule. Lift is raised to how much more likely the consequent is to occur if the antecedent occurs than the baseline probability of the consequent occurring independently. It is quantified as Confidence(A =&gt; B) / Support(B). Any value greater than 1 indicates there is some positive correlation between the items, i.e., the co-occurrence is stronger than by random chance. For instance, a lift of 1.5 implies that if a movie receives Genre A, then it will receive Genre B 1.5 times more probable than if Genre B was picked at random within the entire database. Far higher values of lift (e.g., typically greater than 1.2 or 1.5) are an emphatic and more persuasive relationship, suggesting the antecedent is actually a good predictor for the consequent and that the rule is not merely an expression of the overall popularity of the items involved. It is this measure which is of value in identifying truly strong patterns rather than merely oftentimes occurring ones.</w:t>
+      </w:r>
+    </w:p>
+    <w:p>
+      <w:pPr>
+        <w:spacing w:line="360" w:lineRule="auto"/>
+        <w:jc w:val="both"/>
+        <w:rPr>
+          <w:rFonts w:ascii="Times New Roman" w:hAnsi="Times New Roman" w:cs="Times New Roman"/>
+          <w:sz w:val="24"/>
+          <w:szCs w:val="24"/>
+          <w:lang w:val="en-US"/>
+        </w:rPr>
+      </w:pPr>
+      <w:r>
+        <w:rPr>
+          <w:rFonts w:ascii="Times New Roman" w:hAnsi="Times New Roman" w:cs="Times New Roman"/>
+          <w:b/>
+          <w:bCs/>
+          <w:sz w:val="24"/>
+          <w:szCs w:val="24"/>
+          <w:lang w:val="en-US"/>
+        </w:rPr>
+        <w:t>Rule Generation and Interpretation:</w:t>
+      </w:r>
+      <w:r>
+        <w:rPr>
+          <w:rFonts w:ascii="Times New Roman" w:hAnsi="Times New Roman" w:cs="Times New Roman"/>
+          <w:sz w:val="24"/>
+          <w:szCs w:val="24"/>
+          <w:lang w:val="en-US"/>
+        </w:rPr>
+        <w:t xml:space="preserve"> The association_rules function worked on the identified frequent itemsets to produce an exhaustive list of association rules for each cluster systematically. The rules appear in a read-able antecedents =&gt; consequents format along with their calculated support, confidence, and lift measures. For instance, the rule If {Action} then {Adventure, Thriller} when viewed in a specific K-Mode cluster directly translates into a very strong actionable insight: clients who view "Action" films from the described cluster are highly likely to enjoy "Adventure" and "Thriller" movies as well. The accurate reading of such rules plays the key role in translating raw statistical patterns into actionable, concrete plans for targeted recommendation and shop optimization. These.rules effectively model the internal "what goes with what" patterns within each of the identified customer groups, returning a high-resolution image of cross-genre usage patterns.</w:t>
       </w:r>
     </w:p>
     <w:p>

</xml_diff>